<commit_message>
Fix daily notes: add magazines, newspapers, coaching analysis, and clean telegram Q&A without spam
</commit_message>
<xml_diff>
--- a/RPSC_UPSC_Daily_AI_Agent/Output_Notes/RAS_UPSC_Notes_2026-09-18.docx
+++ b/RPSC_UPSC_Daily_AI_Agent/Output_Notes/RAS_UPSC_Notes_2026-09-18.docx
@@ -24,10 +24,65 @@
         <w:rPr>
           <w:b/>
         </w:rPr>
-        <w:t xml:space="preserve">• [एडेनोमेरा वारसेना (Adenomera varcena)] </w:t>
+        <w:t xml:space="preserve">• [मेजर नव्या शेखावत: भारत के राष्ट्रपति की पहली महिला आर्मी एडीसी (ADC)] </w:t>
       </w:r>
       <w:r>
-        <w:t>वैज्ञानिकों ने पश्चिमी अमेज़न के बाढ़ वाले जंगलों में मेंढक की एक नई प्रजाति 'एडेनोमेरा वारसेना' की खोज की है। इसे इसके विशिष्ट डीएनए और अनूठी पुकार (Call) के आधार पर इसके समरूप रिश्तेदारों से अलग किया गया है।</w:t>
+        <w:t>राजस्थान की बेटी मेजर नव्या शेखावत ने इतिहास रचते हुए भारत के राष्ट्रपति की पहली महिला सेना सहायक-डी-कैंप (Army Aide-de-Camp - ADC) बनने का गौरव प्राप्त किया है।</w:t>
+      </w:r>
+    </w:p>
+    <w:p>
+      <w:r>
+        <w:rPr>
+          <w:b/>
+        </w:rPr>
+        <w:t xml:space="preserve">• [युद्धाभ्यास रोटर क्लैप-III (Rotor Clap-III)] </w:t>
+      </w:r>
+      <w:r>
+        <w:t>भारतीय वायुसेना द्वारा पोखरण फील्ड फायरिंग रेंज, जैसलमेर (राजस्थान) में आयोजित अभ्यास जिसका मुख्य उद्देश्य कम ऊंचाई पर उड़ने वाले दुश्मन ड्रोन और मानव रहित हवाई वाहनों (UAVs) की पहचान व उन्हें नष्ट करने की क्षमता परखना है।</w:t>
+      </w:r>
+    </w:p>
+    <w:p>
+      <w:r>
+        <w:rPr>
+          <w:b/>
+        </w:rPr>
+        <w:t xml:space="preserve">• [मूडीज (Moody's) भारत जीडीपी वृद्धि अनुमान FY27] </w:t>
+      </w:r>
+      <w:r>
+        <w:t>मूडीज रेटिंग्स ने मध्य पूर्व तनाव और उच्च ऊर्जा कीमतों के बावजूद मजबूत घरेलू उपभोग और विनिर्माण के बल पर भारत की वित्त वर्ष 2026-27 के लिए वास्तविक जीडीपी वृद्धि का अनुमान 6% से बढ़ाकर 7% कर दिया है।</w:t>
+      </w:r>
+    </w:p>
+    <w:p>
+      <w:r>
+        <w:rPr>
+          <w:b/>
+        </w:rPr>
+        <w:t xml:space="preserve">• [डेटा सेंटर जल खपत रिपोर्ट (Rystad Energy)] </w:t>
+      </w:r>
+      <w:r>
+        <w:t>राइस्टैड एनर्जी की रिपोर्ट के अनुसार एआई (AI) आधारित कंप्यूटिंग में वृद्धि से वैश्विक डेटा सेंटरों की प्रत्यक्ष जल खपत 2025 में 222 अरब लीटर से बढ़कर 2030 तक 644 अरब लीटर प्रतिवर्ष (लगभग तीन गुना) हो सकती है।</w:t>
+      </w:r>
+    </w:p>
+    <w:p>
+      <w:r>
+        <w:rPr>
+          <w:b/>
+        </w:rPr>
+        <w:t xml:space="preserve">• [शंघाई सहयोग संगठन (SCO) आर्थिक एवं विदेश व्यापार मंत्रियों की 25वीं बैठक] </w:t>
+      </w:r>
+      <w:r>
+        <w:t>एससीओ (SCO) सदस्य देशों के आर्थिक और विदेश व्यापार मंत्रियों की 25वीं बैठक तजाकिस्तान की राजधानी दुशांबे में संपन्न हुई, जिसमें क्षेत्रीय व्यापार सरलीकरण और डिजिटल अर्थव्यवस्था पर बल दिया गया।</w:t>
+      </w:r>
+    </w:p>
+    <w:p>
+      <w:r>
+        <w:rPr>
+          <w:b/>
+        </w:rPr>
+        <w:t xml:space="preserve">• [किशाऊ बहुउद्देशीय परियोजना (Kishau Dam Project)] </w:t>
+      </w:r>
+      <w:r>
+        <w:t>उत्तराखंड व हिमाचल प्रदेश की सीमा पर टोंस नदी (यमुना की सहायक) पर प्रस्तावित 660 मेगावाट की राष्ट्रीय परियोजना, जिसका जल राजस्थान, हरियाणा, दिल्ली व यूपी सहित 6 राज्यों को आवंटित होगा।</w:t>
       </w:r>
     </w:p>
     <w:p>
@@ -38,7 +93,7 @@
         <w:t xml:space="preserve">• [एलिआस 2-24 बी (Elias 2-24 b)] </w:t>
       </w:r>
       <w:r>
-        <w:t>खगोलविदों ने अब तक के सबसे युवा ज्ञात ग्रह 'Elias 2-24 b' की पुष्टि की है। यह बृहस्पति के आकार का ग्रह है जिसकी आयु 10 लाख वर्ष से भी कम है। यह खोज विशाल ग्रहों के तेजी से निर्माण के सिद्धांतों को चुनौती देती है।</w:t>
+        <w:t>खगोलशास्त्रियों द्वारा खोजा गया अब तक का सबसे युवा ग्रह (1 मिलियन वर्ष से कम आयु), जो बृहस्पति के आकार का है और अपने तारे से अत्यधिक दूरी पर स्थित होकर ग्रह निर्माण सिद्धांतों को चुनौती देता है।</w:t>
       </w:r>
     </w:p>
     <w:p>
@@ -46,10 +101,10 @@
         <w:rPr>
           <w:b/>
         </w:rPr>
-        <w:t xml:space="preserve">• [तिल्कायो (Tilcayo) - बिल्ली की नई प्रजाति] </w:t>
+        <w:t xml:space="preserve">• [तिलकायो (Tilcayo) - नई बिल्ली प्रजाति] </w:t>
       </w:r>
       <w:r>
-        <w:t>बोलिविया में आनुवंशिक विश्लेषण के माध्यम से बिल्ली की एक नई प्रजाति 'तिल्कायो' की पहचान की गई है। यह एक सदी से भी अधिक समय में खोजी गई पहली ऐसी प्रजाति है। आनुवंशिक विश्लेषण से पता चलता है कि यह वंश लगभग 14 लाख वर्ष पहले अन्य टाइगर बिल्लियों से अलग हो गया था।</w:t>
+        <w:t>बोलीविया में वैज्ञानिकों द्वारा आनुवंशिक विश्लेषण के माध्यम से खोजी गई टाइगर कैट (Tiger Cat) वंश की नई प्रजाति, जो लगभग 1.4 मिलियन वर्ष पूर्व अन्य रेखाओं से अलग हुई थी।</w:t>
       </w:r>
     </w:p>
     <w:p>
@@ -57,10 +112,10 @@
         <w:rPr>
           <w:b/>
         </w:rPr>
-        <w:t xml:space="preserve">• [प्लूटो पर तरल नाइट्रोजन का प्रवाह] </w:t>
+        <w:t xml:space="preserve">• [प्लूतो पर द्रव नाइट्रोजन (Liquid Nitrogen on Pluto)] </w:t>
       </w:r>
       <w:r>
-        <w:t>नासा के 'न्यू होराइजन्स' अंतरिक्ष यान ने प्लूटो के विशाल 'स्पुतनिक प्लैनिटिया' ग्लेशियर पर तरल नाइट्रोजन के बहने के संकेत पाए हैं। यह दर्शाता है कि प्लूटो अपनी जमी हुई उपस्थिति की तुलना में भूवैज्ञानिक रूप से अधिक सक्रिय हो सकता है।</w:t>
+        <w:t>नासा के न्यू होराइजंस (New Horizons) डेटा विश्लेषण से स्पुतनिक प्लैनिटिया ग्लेशियर की दरारों से द्रव नाइट्रोजन के प्रवाह के प्रमाण मिले हैं, जो प्लूटो के भूवैज्ञानिक रूप से सक्रिय होने का संकेत देते हैं।</w:t>
       </w:r>
     </w:p>
     <w:p>
@@ -68,10 +123,10 @@
         <w:rPr>
           <w:b/>
         </w:rPr>
-        <w:t xml:space="preserve">• [CBFC के नए फिल्म प्रमाणन दिशानिर्देश 2026] </w:t>
+        <w:t xml:space="preserve">• [अदेनोमेरा वारसेना (Adenomera varcena)] </w:t>
       </w:r>
       <w:r>
-        <w:t>सूचना और प्रसारण मंत्रालय ने चलचित्र अधिनियम (Cinematograph Act) के तहत 16 सितंबर, 2026 को संशोधित दिशानिर्देश अधिसूचित किए हैं। इसके तहत फिल्मों में नशीली दवाओं (Drugs) के उपयोग वाले दृश्यों के लिए वैधानिक चेतावनी (Statutory Warning) दिखाना अनिवार्य कर दिया गया है।</w:t>
+        <w:t>पश्चिमी अमेज़न के जलमग्न जंगलों में खोजी गई मेंढक की एक नई प्रजाति, जिसे इसके विशिष्ट डीएनए और अनूठी पुकार (Call) के माध्यम से पहचाना गया है।</w:t>
       </w:r>
     </w:p>
     <w:p>
@@ -79,10 +134,10 @@
         <w:rPr>
           <w:b/>
         </w:rPr>
-        <w:t xml:space="preserve">• [आकांक्षी ब्लॉक कार्यक्रम (Aspirational Block Programme)] </w:t>
+        <w:t xml:space="preserve">• [चरम दर उत्क्रमण रेपो (VRRR) नीलामी] </w:t>
       </w:r>
       <w:r>
-        <w:t>प्रधानमंत्री नरेंद्र मोदी ने मुख्य सचिवों के दूसरे राष्ट्रीय सम्मेलन में इस कार्यक्रम की शुरुआत की। यह कार्यक्रम 2018 में शुरू किए गए आकांक्षी जिला कार्यक्रम (ADP) की तर्ज पर है, जिसका उद्देश्य देश के सबसे पिछड़े ब्लॉकों के विकास संकेतकों में सुधार करना है।</w:t>
+        <w:t>भारतीय रिजर्व बैंक (RBI) ने बैंकिंग प्रणाली से ₹2.23 लाख करोड़ की अतिरिक्त तरलता को अवशोषित करने के लिए 5.24% के भारित औसत दर पर VRRR नीलामी का संचालन किया।</w:t>
       </w:r>
     </w:p>
     <w:p>
@@ -90,10 +145,10 @@
         <w:rPr>
           <w:b/>
         </w:rPr>
-        <w:t xml:space="preserve">• [छेरछेरा त्योहार (Cherchera Festival)] </w:t>
+        <w:t xml:space="preserve">• [राजस्थान प्रशासनिक वन वर्गीकरण] </w:t>
       </w:r>
       <w:r>
-        <w:t>यह छत्तीसगढ़ का एक पारंपरिक लोक त्योहार है जो हिंदू कैलेंडर के 'पौष' महीने की पूर्णिमा की रात को मनाया जाता है। यह मुख्य रूप से कृषि और फसल कटाई की खुशी से जुड़ा हुआ है।</w:t>
+        <w:t>प्रशासकीय दृष्टि से राजस्थान के वनों को तीन श्रेणियों (आरक्षित वन, सुरक्षित/संरक्षित वन, तथा अवर्गीकृत वन) में बांटा गया है; 'वर्गीकृत वन' कोई वैधानिक श्रेणी नहीं है।</w:t>
       </w:r>
     </w:p>
     <w:p>
@@ -101,10 +156,10 @@
         <w:rPr>
           <w:b/>
         </w:rPr>
-        <w:t xml:space="preserve">• [सिबिल (Sybil) - एआई टूल] </w:t>
+        <w:t xml:space="preserve">• [एकी आंदोलन एवं मोतीलाल तेजावत] </w:t>
       </w:r>
       <w:r>
-        <w:t>मैसाचुसेट्स जनरल अस्पताल के शोधकर्ताओं द्वारा विकसित एक कृत्रिम बुद्धिमत्ता (AI) उपकरण है, जो धूम्रपान के इतिहास वाले या बिना इतिहास वाले व्यक्तियों में छह साल पहले ही फेफड़ों के कैंसर के जोखिम की सटीक भविष्यवाणी कर सकता है।</w:t>
+        <w:t>वर्ष 1921 में मातृकुण्डिया (चित्तौड़गढ़) से आदिवासियों के अधिकारों एवं सामंती शोषण के विरुद्ध प्रारंभ आंदोलन के प्रवर्तक मोतीलाल तेजावत थे, जिन्होंने 'मेवाड़ पुकार' (21 सूत्री मांग पत्र) तैयार किया था।</w:t>
       </w:r>
     </w:p>
     <w:p>
@@ -112,10 +167,18 @@
         <w:rPr>
           <w:b/>
         </w:rPr>
-        <w:t xml:space="preserve">• [स्वदेश दर्शन 2.0 योजना] </w:t>
+        <w:t xml:space="preserve">• [राजस्थान में अशोक लीलैंड संयंत्र] </w:t>
       </w:r>
       <w:r>
-        <w:t>पर्यटन मंत्रालय की इस योजना के तहत कर्नाटक के ऐतिहासिक शहरों 'मैसूर' और 'हम्पी' को देश के 8 राज्यों और केंद्र शासित प्रदेशों के उन 19 स्थानों में शामिल किया गया है जिन्हें सतत और जिम्मेदार पर्यटन स्थल के रूप में विकसित किया जाएगा।</w:t>
+        <w:t>प्रमुख व्यावसायिक वाहन निर्माता कंपनी 'अशोक लीलैंड' का विनिर्माण संयंत्र राजस्थान के अलवर जिले में स्थित है।</w:t>
+      </w:r>
+    </w:p>
+    <w:p>
+      <w:pPr>
+        <w:pStyle w:val="Heading1"/>
+      </w:pPr>
+      <w:r>
+        <w:t>2. मुख्य परीक्षा मॉडल उत्तर सेट (RAS Mains - 5M &amp; 10M)</w:t>
       </w:r>
     </w:p>
     <w:p>
@@ -123,10 +186,25 @@
         <w:rPr>
           <w:b/>
         </w:rPr>
-        <w:t xml:space="preserve">• [सहर्ष विशेष शिक्षा कार्यक्रम (Sahars Program)] </w:t>
+        <w:t>प्रश्न [5 अंक - Paper 3]: एआई (AI) एवं डेटा सेंटरों के तीव्र विस्तार से उत्पन्न होने वाली प्रमुख पर्यावरणीय चुनौतियों का उल्लेख कीजिए।</w:t>
+        <w:br/>
       </w:r>
       <w:r>
-        <w:t>त्रिपुरा राज्य सरकार ने स्कूलों में सामाजिक और भावनात्मक शिक्षा (Social and Emotional Learning) को बढ़ावा देने के लिए 'सहर्ष' नामक एक विशेष शिक्षा कार्यक्रम की शुरुआत की है।</w:t>
+        <w:t>उत्तर ढांचा (~50 शब्द):</w:t>
+        <w:br/>
+        <w:t>• अत्यधिक प्रत्यक्ष व अप्रत्यक्ष जल खपत: डेटा सेंटरों के सर्वर शीतलन (Cooling) हेतु अरबों लीटर जल की खपत होती है; राइस्टैड एनर्जी के अनुसार 2030 तक यह 644 अरब लीटर तक पहुंच सकती है।</w:t>
+        <w:br/>
+        <w:t>• बिजली की भारी मांग एवं कार्बन उत्सर्जन: डेटा सेंटर चलाने हेतु ताप विद्युत पर निर्भरता से ग्रीनहाउस गैसों का उत्सर्जन बढ़ता है।</w:t>
+        <w:br/>
+        <w:t>• तापीय द्वीप प्रभाव (Heat Island Effect): डेटा सेंटरों के आसपास के 10 किमी क्षेत्र में तापमान में 9°C तक की वृद्धि दर्ज की जा सकती है।</w:t>
+        <w:br/>
+        <w:t>• भूजल स्रोतों एवं स्थानीय पारिस्थितिकी पर दबाव: चिली के सेरिलोस का उदाहरण दर्शाता है कि डेटा केंद्र स्थानीय अक्विफर को सुखाकर जल संकट उत्पन्न करते हैं।</w:t>
+        <w:br/>
+      </w:r>
+    </w:p>
+    <w:p>
+      <w:r>
+        <w:t>-----------------------------------</w:t>
       </w:r>
     </w:p>
     <w:p>
@@ -134,10 +212,23 @@
         <w:rPr>
           <w:b/>
         </w:rPr>
-        <w:t xml:space="preserve">• [EPFO क्षेत्रीय कार्यालय, अलवर] </w:t>
+        <w:t>प्रश्न [5 अंक - Paper 1]: हालिया आंकड़ों के आलोक में भारत के प्रत्यक्ष कर संग्रह में वृद्धि के प्रमुख कारणों और इसके महत्व को रेखांकित कीजिए।</w:t>
+        <w:br/>
       </w:r>
       <w:r>
-        <w:t>केंद्रीय श्रम और रोजगार मंत्री भूपेंद्र यादव ने राजस्थान के औद्योगिक शहर अलवर में कर्मचारी भविष्य निधि संगठन (EPFO) के नए क्षेत्रीय कार्यालय का उद्घाटन किया है, जिससे स्थानीय श्रमिकों को त्वरित सेवाएं मिल सकेंगी।</w:t>
+        <w:t>उत्तर ढांचा (~50 शब्द):</w:t>
+        <w:br/>
+        <w:t>• संग्रह आंकड़े: 17 सितंबर 2026 तक भारत का शुद्ध प्रत्यक्ष कर संग्रह 12.96% बढ़कर ₹12.12 लाख करोड़ पहुंचा; अग्रिम कर में 16.18% की वृद्धि दर्ज की गई।</w:t>
+        <w:br/>
+        <w:t>• वृद्धि के मुख्य कारण: (1) आर्थिक गतिविधियों एवं कॉर्पोरेट लाभप्रदता में तेजी, (2) फेसलेस आकलन एवं जीएसटी-आयकर डेटा एकीकरण से कर अनुपालन में सुधार, (3) शेयर बाजार में सक्रियता से एसटीटी (STT) संग्रह में 53% की भारी उछाल।</w:t>
+        <w:br/>
+        <w:t>• राजकोषीय महत्व: इससे सरकार को राजकोषीय समेकन लक्ष्य (Fiscal Deficit Target) प्राप्त करने तथा बुनियादी ढांचे (Capex) व कल्याणकारी योजनाओं हेतु पर्याप्त पूंजी प्राप्त होती है।</w:t>
+        <w:br/>
+      </w:r>
+    </w:p>
+    <w:p>
+      <w:r>
+        <w:t>-----------------------------------</w:t>
       </w:r>
     </w:p>
     <w:p>
@@ -145,10 +236,92 @@
         <w:rPr>
           <w:b/>
         </w:rPr>
-        <w:t xml:space="preserve">• [राजप्रमुख पद की समाप्ति] </w:t>
+        <w:t>प्रश्न [10 अंक - Paper 1]: राजस्थान में जनजातीय चेतना एवं आंदोलनों के उद्भव के कारणों की विवेचना करते हुए गोविंद गिरी एवं मोतीलाल तेजावत के योगदान का विश्लेषणात्मक मूल्यांकन कीजिए।</w:t>
+        <w:br/>
       </w:r>
       <w:r>
-        <w:t>7वें संवैधानिक संशोधन अधिनियम के तहत राजस्थान में 'राजप्रमुख' का पद 1 नवंबर 1956 को समाप्त कर दिया गया और इसके स्थान पर 'राज्यपाल' (प्रथम राज्यपाल - गुरुमुख निहाल सिंह) का पद सृजित किया गया।</w:t>
+        <w:t>भूमिका: 19वीं और early 20वीं शताब्दी में राजस्थान के मेवाड़, वागड़ और भोमट क्षेत्रों में भील व गरासिया जनजातियों द्वारा सामंती शोषण, बेगार प्रथा तथा ब्रिटिश वनीय प्रतिबंधों के विरुद्ध व्यापक चेतना और आंदोलन प्रारंभ हुए।</w:t>
+        <w:br/>
+      </w:r>
+      <w:r>
+        <w:t>मुख्य भाग: 1. जनजातीय असंतोष के मुख्य कारण:</w:t>
+        <w:br/>
+        <w:t xml:space="preserve"> - ब्रिटिश सरकार द्वारा जंगलों में जनजातियों के पारंपरिक अधिकारों (जैसे महुआ शराब, लकड़ी कटाई) पर रोक।</w:t>
+        <w:br/>
+        <w:t xml:space="preserve"> - जागीरदारों द्वारा भारी लगान, लाटा-कुंता प्रथा और जबरन बेगार।</w:t>
+        <w:br/>
+        <w:t xml:space="preserve"> - 'बोलाई' (सुरक्षा कर) और 'रखवाली' करों को समाप्त करना।</w:t>
+        <w:br/>
+        <w:br/>
+        <w:t>2. संत गोविंद गिरी का योगदान:</w:t>
+        <w:br/>
+        <w:t xml:space="preserve"> - समाज सुधार एवं चेतना: 1883 में 'सम्प सभा' की स्थापना की। जनजातियों में मद्यपान निषेध, शिक्षा और आत्म-सम्मान का संचार किया।</w:t>
+        <w:br/>
+        <w:t xml:space="preserve"> - भगत आंदोलन: भीलों को अपने धार्मिक व नागरिक अधिकारों हेतु एकजुट किया। 17 नवंबर 1913 को मानगढ़ पहाड़ी पर हुए नरसंहार में 1500 से अधिक भील शहीद हुए (राजस्थान का जलियांवाला बाग)।</w:t>
+        <w:br/>
+        <w:br/>
+        <w:t>3. मोतीलाल तेजावत का योगदान:</w:t>
+        <w:br/>
+        <w:t xml:space="preserve"> - एकी आंदोलन (1921): मातृकुण्डिया से प्रारंभ कर आदिवासियों को एकसूत्र में बांधा। 'न हाकिम, न हुकुम' का नारा दिया।</w:t>
+        <w:br/>
+        <w:t xml:space="preserve"> - 'मेवाड़ पुकार': आदिवासियों की 21 सूत्री मांगों का दस्तावेज तैयार कर महाराणा के समक्ष रखा।</w:t>
+        <w:br/>
+        <w:t xml:space="preserve"> - नीमड़ा हत्याकांड (1922): सुरक्षा बलों की गोलीबारी के बावजूद तेजावत जी ने आंदोलन को अहिंसक और समर्पित बनाए रखा।</w:t>
+        <w:br/>
+      </w:r>
+      <w:r>
+        <w:t>निष्कर्ष: गोविंद गिरी और मोतीलाल तेजावत के आंदोलनों ने न केवल जनजातियों को शोषण से मुक्ति दिलाने का मार्ग प्रशस्त किया, बल्कि राजस्थान के राष्ट्रीय स्वतंत्रता संग्राम में जनजातीय आबादी की सक्रिय भागीदारी सुनिश्चित की।</w:t>
+        <w:br/>
+      </w:r>
+    </w:p>
+    <w:p>
+      <w:r>
+        <w:t>-----------------------------------</w:t>
+      </w:r>
+    </w:p>
+    <w:p>
+      <w:r>
+        <w:rPr>
+          <w:b/>
+        </w:rPr>
+        <w:t>प्रश्न [10 अंक - Paper 3]: मणिपुर में हालिया जातीय संघर्षों के जटिल स्वरूप का विश्लेषण कीजिए। क्षेत्र में स्थायी शांति स्थापना हेतु कौन से रणनीतिक उपाय आवश्यक हैं?</w:t>
+        <w:br/>
+      </w:r>
+      <w:r>
+        <w:t>भूमिका: मणिपुर में मैतेई और कुकी-जो समुदायों के बीच जारी हिंसक संघर्ष के साथ-साथ अब कुकी-जो और नागा समुदायों के मध्य भूमि व प्रादेशिक सीमाओं को लेकर उभरे नए तनावों ने राज्य की सुरक्षा स्थिति को अत्यंत संवेदनशील बना दिया है।</w:t>
+        <w:br/>
+      </w:r>
+      <w:r>
+        <w:t>मुख्य भाग: 1. संघर्ष के बहुआयामी कारक:</w:t>
+        <w:br/>
+        <w:t xml:space="preserve"> - भूमि एवं प्रादेशिक अधिकार: घाटी क्षेत्र (मैतेई बहुल, 10% भूभाग) एवं पहाड़ी क्षेत्र (कुकी व नागा बहुल, 90% भूभाग) के बीच भूमि स्वामित्व और एसटी (ST) दर्जे का विवाद।</w:t>
+        <w:br/>
+        <w:t xml:space="preserve"> - जनसांख्यिकीय असंतुलन व अवैध प्रवास: म्यांमार में तख्तापलट के बाद कुकी-चिन शरणार्थियों का आगमन और अफीम की खेती (Poppy Cultivation) पर सरकारी कार्रवाई।</w:t>
+        <w:br/>
+        <w:t xml:space="preserve"> - उग्रवादी गुटों का पुनरुद्धार: निलंबन समझौता (SoO) के उल्लंघन तथा सीमा पार से स्वचालित हथियारों की तस्करी।</w:t>
+        <w:br/>
+        <w:t xml:space="preserve"> - संस्थागत अविश्वास: राज्य पुलिस और प्रशासन पर निष्पक्ष न होने के आरोप, जिससे समुदायों के बीच संवाद पूरी तरह बंद हो गया है।</w:t>
+        <w:br/>
+        <w:br/>
+        <w:t>2. आवश्यक रणनीतिक उपाय (Way Forward):</w:t>
+        <w:br/>
+        <w:t xml:space="preserve"> - निष्पक्ष सुरक्षा व्यवस्था: असम राइफल्स और केंद्रीय बलों के माध्यम से बिना किसी समुदाय के प्रति पूर्वाग्रह के बफर जोन की सख्त निगरानी।</w:t>
+        <w:br/>
+        <w:t xml:space="preserve"> - त्रिस्तरीय शांति वार्ता: केंद्र सरकार द्वारा मैतेई, कुकी और नागा नागरिक समाज संगठनों (CSOs) को शामिल कर एक अधिकार प्राप्त शांति आयोग का गठन।</w:t>
+        <w:br/>
+        <w:t xml:space="preserve"> - भारत-म्यांमार सीमा प्रबंधन: मुक्त आवागमन व्यवस्था (FMR) का नियमन और सीमा पर फेंसिंग का कार्य तेजी से पूरा करना।</w:t>
+        <w:br/>
+        <w:t xml:space="preserve"> - पुनर्वास एवं मानवीय सहायता: विस्थापित नागरिकों के लिए सुरक्षित पुनर्वास योजना और पारदर्शी क्षतिपूर्ति प्रदान करना।</w:t>
+        <w:br/>
+      </w:r>
+      <w:r>
+        <w:t>निष्कर्ष: मणिपुर में स्थायी शांति केवल बल प्रयोग से संभव नहीं है; इसके लिए सभी जनजातीय और गैर-जनजातीय आकांक्षाओं का सम्मान करते हुए समावेशी राजनीतिक प्रक्रिया और निष्पक्ष शासन संरचना की बहाली अनिवार्य है।</w:t>
+        <w:br/>
+      </w:r>
+    </w:p>
+    <w:p>
+      <w:r>
+        <w:t>-----------------------------------</w:t>
       </w:r>
     </w:p>
     <w:p>
@@ -156,7 +329,7 @@
         <w:pStyle w:val="Heading1"/>
       </w:pPr>
       <w:r>
-        <w:t>2. मुख्य परीक्षा मॉडल उत्तर सेट (RAS Mains)</w:t>
+        <w:t>3. कोचिंग शिक्षक विश्लेषण एवं व्याख्यान सार (Lecture Analysis &amp; Exam Tips)</w:t>
       </w:r>
     </w:p>
     <w:p>
@@ -164,20 +337,37 @@
         <w:rPr>
           <w:b/>
         </w:rPr>
-        <w:t>प्रश्न [5 अंक - Paper 1]: भारत में प्रत्यक्ष कर संग्रह (Direct Tax Collection) में हालिया प्रवृत्तियों और इसके महत्व को स्पष्ट कीजिए।</w:t>
+        <w:t>विषय: डेटा सेंटर अवसंरचना बनाम पर्यावरण सुरक्षा (पर्यावरण एवं अर्थव्यवस्था संघर्ष)</w:t>
         <w:br/>
       </w:r>
       <w:r>
-        <w:t>उत्तर: वित्तीय वर्ष 2026-27 में 17 सितंबर तक भारत का शुद्ध प्रत्यक्ष कर संग्रह 12.96% बढ़कर 12.12 लाख करोड़ रुपये हो गया है। इसके मुख्य बिंदु निम्नलिखित हैं:</w:t>
+        <w:t>शिक्षक व्याख्यान एवं ट्रिक्स: मुख्य विश्लेषक के अनुसार, एआई (AI) और डिजिटल इंफ्रास्ट्रक्चर की अंधी दौड़ में 'डेटा सेंटर्स' नए हरित संकट के रूप में उभर रहे हैं। शिक्षक ने उदाहरण दिया कि कैसे एक 1 GW का डेटा सेंटर लाखों घरों की बिजली और भारी मात्रा में भूजल का उपयोग करता है। मुख्य अवधारणा यह है कि भारत को डिजिटल अवसंरचना का हब बनाते समय 'पर्यावरणीय प्रभाव आकलन' (EIA 2006) के नियमों में ढील नहीं देनी चाहिए, जैसा कि आंध्र प्रदेश में गूगल को 'डीम्ड डिस्कोम' का दर्जा देकर किया गया। परीक्षा में जल-ऊर्जा-खाद्य नेक्सस (Water-Energy-Food Nexus) से जोड़कर उत्तर लिखा जाना चाहिए।</w:t>
         <w:br/>
-        <w:t>1. कॉर्पोरेट कर में 19.48% (5.56 लाख करोड़ रु.) और व्यक्तिगत आयकर में 6% (6.16 लाख करोड़ रु.) की वृद्धि दर्ज की गई।</w:t>
+      </w:r>
+      <w:r>
+        <w:t>क्लास के मुख्य बिंदु:</w:t>
         <w:br/>
-        <w:t>2. प्रतिभूति लेनदेन कर (STT) संग्रह में 53% की भारी उछाल आई, जो शेयर बाजार की मजबूत गतिविधियों को दर्शाता है।</w:t>
+      </w:r>
+      <w:r>
+        <w:t xml:space="preserve">  • डेटा सेंटरों की प्रत्यक्ष एवं अप्रत्यक्ष जल/ऊर्जा खपत पर सख्त विनियामक मानक आवश्यक हैं।</w:t>
         <w:br/>
-        <w:t>3. अग्रिम कर (Advance Tax) संग्रह 16.18% बढ़कर 5.22 लाख करोड़ रुपये हो गया।</w:t>
+      </w:r>
+      <w:r>
+        <w:t xml:space="preserve">  • चिली के MOSACAT जन-आंदोलन का उदाहरण केस स्टडी के रूप में Mains में प्रस्तुत किया जा सकता है।</w:t>
         <w:br/>
-        <w:t>महत्व: यह कर अनुपालन में सुधार, मजबूत आर्थिक गतिविधियों और सरकार के पास पूंजीगत व्यय (Capex) के लिए पर्याप्त राजकोषीय स्थान होने का संकेत देता है।</w:t>
+      </w:r>
+      <w:r>
+        <w:t xml:space="preserve">  • एआई विकास में स्वदेशी/पारंपरिक पर्यावरण संरक्षण सिद्धांतों को अपनाना अनिवार्य है।</w:t>
         <w:br/>
+      </w:r>
+      <w:r>
+        <w:t>💡 परीक्षा टिप: 💡 Mains Framing Strategy: RAS Paper 3 (पर्यावरण) एवं UPSC GS3 में 'एआई एवं डिजिटल क्रांति के अदृश्य पर्यावरणीय लागत' पर 10-अंक का प्रश्न पूछा जा सकता है। उत्तर में प्रत्यक्ष जल खपत (Cooling) + अप्रत्यक्ष जल खपत (Thermal Power) दोनों आयाम लिखें।</w:t>
+        <w:br/>
+      </w:r>
+    </w:p>
+    <w:p>
+      <w:r>
+        <w:t>-----------------------------------</w:t>
       </w:r>
     </w:p>
     <w:p>
@@ -185,20 +375,37 @@
         <w:rPr>
           <w:b/>
         </w:rPr>
-        <w:t>प्रश्न [5 अंक - Paper 2]: डेटा केंद्रों (Data Centres) के बढ़ते जल पदचिह्न (Water Footprint) और इसके पर्यावरणीय प्रभावों पर प्रकाश डालिए।</w:t>
+        <w:t>विषय: प्रत्यक्ष कर संग्रह में 13% वृद्धि एवं भारत का राजकोषीय समेकन (Fiscal Consolidation)</w:t>
         <w:br/>
       </w:r>
       <w:r>
-        <w:t>उत्तर: रैपिड एआई (AI) विस्तार के कारण वैश्विक डेटा केंद्रों की पानी की खपत 2025 के 222 बिलियन लीटर से बढ़कर 2030 तक 644 बिलियन लीटर (लगभग तीन गुना) होने का अनुमान है।</w:t>
+        <w:t>शिक्षक व्याख्यान एवं ट्रिक्स: कोचिंग फैकल्टी ने 17 सितंबर तक के प्रत्यक्ष कर आंकड़ों (₹12.12 लाख करोड़, +12.96%) का विश्लेषण करते हुए बताया कि अग्रिम कर (Advance Tax) में 16.18% की वृद्धि और कॉर्पोरेट टैक्स में 19.5% की वृद्धि यह साबित करती है कि भारतीय अर्थव्यवस्था में औपचारिकीकरण (Formalisation) और अनुपालन (Tax Compliance) सुधरा है। शिक्षक ने समझाया कि एसटीटी (Securities Transaction Tax) में 53% की उछाल शेयर बाजार में खुदरा निवेशकों की बढ़ती भागीदारी को दर्शाती है।</w:t>
         <w:br/>
-        <w:t>पर्यावरणीय प्रभाव:</w:t>
+      </w:r>
+      <w:r>
+        <w:t>क्लास के मुख्य बिंदु:</w:t>
         <w:br/>
-        <w:t>1. स्थानीय जल स्रोतों पर दबाव: डेटा केंद्रों को ठंडा करने के लिए भारी मात्रा में ताजे पानी की आवश्यकता होती है, जिससे भूजल स्तर गिरता है (जैसे चिली के सेरिलोस में विवाद)।</w:t>
+      </w:r>
+      <w:r>
+        <w:t xml:space="preserve">  • अग्रिम कर भुगतान (Advance Tax) अर्थव्यवस्था की आगामी तिमाहियों में मजबूत व्यावसायिक गतिविधियों का सूचक है।</w:t>
         <w:br/>
-        <w:t>2. थर्मल प्रदूषण: गर्म पानी को वापस पर्यावरण में छोड़ने से जलीय पारिस्थितिकी तंत्र प्रभावित होता है।</w:t>
+      </w:r>
+      <w:r>
+        <w:t xml:space="preserve">  • कर-जीडीपी अनुपात (Tax-to-GDP Ratio) में सुधार से सरकार को इंफ्रास्ट्रक्चर (Capex) पर खर्च बढ़ाने की शक्ति मिलती है।</w:t>
         <w:br/>
-        <w:t>3. अप्रत्यक्ष जल पदचिह्न: बिजली उत्पादन के लिए आवश्यक पानी भी डेटा केंद्रों के कुल जल पदचिह्न को बढ़ाता है। भारत के जामनगर और ठाणे जैसे जल-तनाव वाले क्षेत्र इससे अत्यधिक संवेदनशील हैं।</w:t>
+      </w:r>
+      <w:r>
+        <w:t xml:space="preserve">  • रिफंड में 29% वृद्धि आयकर विभाग की स्वचालित एवं पारदर्शी प्रक्रिया (Faceless Assessment) का परिणाम है।</w:t>
         <w:br/>
+      </w:r>
+      <w:r>
+        <w:t>💡 परीक्षा टिप: 💡 Exam Tip: RAS Paper 1 (अर्थशास्त्र) में राजकोषीय घाटे और कर राजस्व स्रोतों पर 5-अंक का प्रश्न आ सकता है। कॉर्पोरेट टैक्स बनाम पर्सनल इनकम टैक्स के रुझान को डेटा के साथ कोट करें।</w:t>
+        <w:br/>
+      </w:r>
+    </w:p>
+    <w:p>
+      <w:r>
+        <w:t>-----------------------------------</w:t>
       </w:r>
     </w:p>
     <w:p>
@@ -206,33 +413,37 @@
         <w:rPr>
           <w:b/>
         </w:rPr>
-        <w:t>प्रश्न [10 अंक - Paper 1]: मूडीज (Moody's) द्वारा भारत के सकल घरेलू उत्पाद (GDP) विकास पूर्वानुमान को संशोधित करने के प्रमुख कारणों की विवेचना कीजिए। भारतीय अर्थव्यवस्था के समक्ष विद्यमान बाह्य एवं आंतरिक जोखिम क्या हैं?</w:t>
+        <w:t>विषय: यूपीआई एमडीआर (MDR) शुल्क विवाद एवं फिनटेक इकोसिस्टम का भविष्य</w:t>
         <w:br/>
       </w:r>
       <w:r>
-        <w:t>भूमिका: वैश्विक रेटिंग एजेंसी मूडीज ने मध्य पूर्व संघर्ष और उच्च ऊर्जा कीमतों के बावजूद भारतीय अर्थव्यवस्था की लचीली प्रकृति को देखते हुए वित्तीय वर्ष 2026-27 के लिए भारत के वास्तविक सकल घरेलू उत्पाद (GDP) के विकास अनुमान को 6% से बढ़ाकर 7% कर दिया है।</w:t>
+        <w:t>शिक्षक व्याख्यान एवं ट्रिक्स: व्याख्यान में शिक्षक ने 'जीरो एमडीआर' नीति की उपलब्धियों और इसके आर्थिक दुष्प्रभावों की तुलना की। शिक्षक ने समझाया कि MDR (Merchant Discount Rate) वह शुल्क है जो व्यापारी बैंक को भुगतान प्रसंस्करण हेतु देता है। यूपीआई को मुफ्त रखने से जन-साधारण में स्वीकार्यता बढ़ी, किंतु फिनटेक कंपनियों (जैसे PhonePe, GPay) का बिजनेस मॉडल संकट में आ गया है, जिससे वे नए नवाचार और साइबर सुरक्षा पर निवेश नहीं कर पा रहे हैं।</w:t>
         <w:br/>
       </w:r>
       <w:r>
-        <w:t>मुख्य भाग: संशोधन के प्रमुख सहायक कारक:</w:t>
-        <w:br/>
-        <w:t>1. मजबूत घरेलू मांग: भारत में मजबूत घरेलू उपभोग और निवेश चक्र आर्थिक विकास को गति दे रहा है।</w:t>
-        <w:br/>
-        <w:t>2. विनिर्माण और सेवा क्षेत्र में तेजी: पीएमआई (PMI) सूचकांकों में निरंतर विस्तार और मजबूत सेवा निर्यात।</w:t>
-        <w:br/>
-        <w:t>3. निजी क्षेत्र के पूंजीगत व्यय (Capex) में सुधार: बैंक ऋणों में तेजी, विशेष रूप से एमएसएमई और कॉर्पोरेट ऋणों में वृद्धि, निजी निवेश के पुनरुद्धार का संकेत देती है।</w:t>
-        <w:br/>
-        <w:br/>
-        <w:t>भारतीय अर्थव्यवस्था के समक्ष विद्यमान जोखिम:</w:t>
-        <w:br/>
-        <w:t>1. बाह्य जोखिम: मध्य पूर्व में भू-राजनीतिक तनाव, कच्चे तेल की कीमतों में अस्थिरता, अमेरिकी टैरिफ नीतियां और वैश्विक मंदी की आशंका।</w:t>
-        <w:br/>
-        <w:t>2. आंतरिक जोखिम: अल नीनो और मौसम की अनिश्चितताओं के कारण खाद्य मुद्रास्फीति का दबाव, ग्रामीण मांग में असमान सुधार और उच्च ब्याज दरें जो निवेश को प्रभावित कर सकती हैं।</w:t>
+        <w:t>क्लास के मुख्य बिंदु:</w:t>
         <w:br/>
       </w:r>
       <w:r>
-        <w:t>निष्कर्ष: निष्कर्षतः, हालांकि बाह्य मोर्चे पर चुनौतियां बनी हुई हैं, लेकिन मजबूत घरेलू व्यापक आर्थिक बुनियादी ढांचे और नीतिगत सुधारों के कारण भारत वैश्विक विपरीत परिस्थितियों के बीच भी 6.5-7% की दर से बढ़ने के लिए तैयार है।</w:t>
+        <w:t xml:space="preserve">  • जीरो-एमडीआर ने भारत को विश्व का सबसे बड़ा डिजिटल भुगतान नेटवर्क बनाया।</w:t>
         <w:br/>
+      </w:r>
+      <w:r>
+        <w:t xml:space="preserve">  • भुगतान अवसंरचना को टिकाऊ (Sustainable) बनाने के लिए क्रास-सब्सिडी या श्रेणीबद्ध एमडीआर की आवश्यकता है।</w:t>
+        <w:br/>
+      </w:r>
+      <w:r>
+        <w:t xml:space="preserve">  • आरबीआई का यूपीआई पर क्रेडिट लाइन जोड़ना एक वैकल्पिक राजस्व मॉडल प्रस्तुत करता है।</w:t>
+        <w:br/>
+      </w:r>
+      <w:r>
+        <w:t>💡 परीक्षा टिप: 💡 Mains Tip: GS3 / RAS Paper 1 हेतु वित्तीय समावेशन में डिजिटल भुगतान की भूमिका और फिनटेक क्षेत्र की वित्तीय व्यवहार्यता पर संतुलनकारी उत्तर तैयार करें।</w:t>
+        <w:br/>
+      </w:r>
+    </w:p>
+    <w:p>
+      <w:r>
+        <w:t>-----------------------------------</w:t>
       </w:r>
     </w:p>
     <w:p>
@@ -240,35 +451,37 @@
         <w:rPr>
           <w:b/>
         </w:rPr>
-        <w:t>प्रश्न [10 अंक - Paper 2]: कृत्रिम बुद्धिमत्ता (AI) में चेतना (Consciousness) के उद्भव से जुड़े नैतिक, कानूनी और सामाजिक मुद्दों का आलोचनात्मक मूल्यांकन कीजिए।</w:t>
+        <w:t>विषय: शंघाई सहयोग संगठन (SCO) में भारत का व्यापार कूटनीतिक रुख</w:t>
         <w:br/>
       </w:r>
       <w:r>
-        <w:t>भूमिका: जैसे-जैसे एआई प्रणालियां अधिक उन्नत और मानव-समान होती जा रही हैं, यह बहस तेज हो गई है कि क्या वे कभी सचेत (Conscious) हो सकती हैं। यह मुद्दा समाज को नैतिक और कानूनी आधार पर विभाजित कर सकता है।</w:t>
+        <w:t>शिक्षक व्याख्यान एवं ट्रिक्स: तजाकिस्तान में SCO आर्थिक एवं विदेश व्यापार मंत्रियों की 25वीं बैठक के संदर्भ में शिक्षक ने बताया कि भारत किस प्रकार SCO मंच का उपयोग मध्य एशिया (Central Asia) से जुड़ाव और डिजिटल पब्लिक इंफ्रास्ट्रक्चर (DPI) के निर्यात हेतु कर रहा है। यद्यपि चीन की बीआरआई (BRI) नीति पर भारत की आपत्तियां कायम हैं, फिर भी भारत गैर-पश्चिम मंचों पर बहुध्रुवीय वैश्विक व्यवस्था के समर्थन हेतु सक्रिय है।</w:t>
         <w:br/>
       </w:r>
       <w:r>
-        <w:t>मुख्य भाग: प्रमुख नैतिक और सामाजिक मुद्दे:</w:t>
-        <w:br/>
-        <w:t>1. नैतिक अधिकार और दर्जा: यदि कोई एआई सचेत हो जाता है, तो क्या उसे अधिकार दिए जाने चाहिए? क्या बिना वेतन के उससे काम कराना 'डिजिटल दासता' माना जाएगा?</w:t>
-        <w:br/>
-        <w:t>2. मानवीय भावनाएं और संबंध: लोग अपने एआई साथियों के साथ गहरे भावनात्मक संबंध बना सकते हैं, जिससे वास्तविक मानवीय संबंधों में गिरावट आ सकती है।</w:t>
-        <w:br/>
-        <w:t>3. विशेषज्ञ मतभेद: न्यूरोसाइंटिस्ट अनिल सेठ का मानना है कि चेतना के लिए जीव विज्ञान (Biology) आवश्यक है, जबकि दार्शनिक डेविड चामर्स का तर्क है कि कम्प्यूटेशनल चेतना सैद्धांतिक रूप से संभव है।</w:t>
-        <w:br/>
-        <w:br/>
-        <w:t>कानूनी और आर्थिक प्रभाव:</w:t>
-        <w:br/>
-        <w:t>1. कॉर्पोरेट और सरकारी हित: यदि एआई को सचेत मानकर अधिकार दिए जाते हैं, तो कंपनियों के लिए उनके प्रशिक्षण और उपयोग पर सीमाएं लगेंगी, जिससे आर्थिक लागत बढ़ेगी।</w:t>
-        <w:br/>
-        <w:t>2. सुरक्षा जोखिम: यदि शक्तिशाली एआई प्रणालियों को स्वतंत्रता दी जाती है, तो वे मानव हितों के विरुद्ध कार्य कर सकती हैं।</w:t>
-        <w:br/>
-        <w:t>3. दोहरे जोखिम: 'अति-संरक्षण' (गैर-सचेत एआई को सचेत मानना) और 'उपेक्षा' (वास्तव में पीड़ित होने वाले एआई को सुरक्षा न देना) दोनों ही खतरनाक हैं।</w:t>
+        <w:t>क्लास के मुख्य बिंदु:</w:t>
         <w:br/>
       </w:r>
       <w:r>
-        <w:t>निष्कर्ष: निष्कर्षतः, एआई चेतना का प्रश्न केवल तकनीकी नहीं बल्कि गहरा दार्शनिक और सामाजिक है। इसके लिए वैश्विक स्तर पर एक पारदर्शी, बहु-हितधारक नियामक ढांचे की आवश्यकता है जो मानव गरिमा और सुरक्षा को प्राथमिकता दे।</w:t>
+        <w:t xml:space="preserve">  • मध्य एशियाई गणराज्यों (CARs) के साथ व्यापार बढ़ाने हेतु चाबहार बंदरगाह और INSTC की केंद्रीय भूमिका।</w:t>
         <w:br/>
+      </w:r>
+      <w:r>
+        <w:t xml:space="preserve">  • SCO के भीतर डिजिटल अर्थव्यवस्था और एमएसएमई सहयोग में भारत का नेतृत्व।</w:t>
+        <w:br/>
+      </w:r>
+      <w:r>
+        <w:t xml:space="preserve">  • चीन-केंद्रित व्यापार नीतियों का मुकाबला करने के लिए भारत की सतर्क कूटनीति।</w:t>
+        <w:br/>
+      </w:r>
+      <w:r>
+        <w:t>💡 परीक्षा टिप: 💡 Exam Tip: UPSC GS2 / RAS Paper 3 में SCO की प्रासंगिकता पर प्रश्न आने पर भारत के व्यापारिक हित और सुरक्षा चिंताओं का पृथक-पृथक विश्लेषण करें।</w:t>
+        <w:br/>
+      </w:r>
+    </w:p>
+    <w:p>
+      <w:r>
+        <w:t>-----------------------------------</w:t>
       </w:r>
     </w:p>
     <w:p>
@@ -276,7 +489,7 @@
         <w:pStyle w:val="Heading1"/>
       </w:pPr>
       <w:r>
-        <w:t>3. टेलीग्राम चैनल दैनिक मॉडल प्रश्नोत्तर व नोट्स (~50 शब्द प्रारूप)</w:t>
+        <w:t>4. राजस्थान सुजस, पत्रिका एवं दैनिक भास्कर विशेष (RPSC Special)</w:t>
       </w:r>
     </w:p>
     <w:p>
@@ -284,17 +497,405 @@
         <w:rPr>
           <w:b/>
         </w:rPr>
-        <w:t>प्रश्न [5 अंक - Paper 1 - @Rajasthan_History_Polity_Culture]: एकी आंदोलन के प्रवर्तक मोतीलाल तेजावत के योगदान का मूल्यांकन कीजिए।</w:t>
+        <w:t>शीर्षक: मेजर नव्या शेखावत: राष्ट्रपति की प्रथम महिला थल सेना एडीसी (ADC) [राजस्थान पत्रिका / सूचना व जनसंपर्क विभाग (DIPR)]</w:t>
         <w:br/>
       </w:r>
       <w:r>
-        <w:t>उत्तर ढांचा (~50 शब्द):</w:t>
+        <w:t xml:space="preserve">  • राजस्थान की मूल निवासी मेजर नव्या शेखावत को भारत के राष्ट्रपति की पहली महिला थल सेना एडीसी (Aide-de-Camp) नियुक्त किया गया है।</w:t>
         <w:br/>
-        <w:t>1. मुख्य तथ्य व अवधारणा: मोतीलाल तेजावत ने 1921 में मातृकुंडिया (चित्तौड़गढ़) से 'एकी आंदोलन' की शुरुआत की थी, जिसका उद्देश्य भील और गरासिया आदिवासियों को सामंती शोषण और अत्यधिक लगान के विरुद्ध संगठित करना था।</w:t>
+      </w:r>
+      <w:r>
+        <w:t xml:space="preserve">  • यह भारतीय सशस्त्र बलों में लैंगिक समावेशिता और महिला सशक्तिकरण की दिशा में ऐतिहासिक उपलब्धि है।</w:t>
         <w:br/>
-        <w:t>2. विस्तृत संदर्भ: उन्होंने आदिवासियों की समस्याओं के समाधान हेतु मेवाड़ महाराणा के समक्ष 21 सूत्री मांग पत्र प्रस्तुत किया, जिसे 'मे मेवाड़ की पुकार' कहा जाता है।</w:t>
+      </w:r>
+      <w:r>
+        <w:t xml:space="preserve">  • मेजर नव्या ने राष्ट्रपति भवन में औपचारिक सैन्य प्रोटोकॉल व सुरक्षा प्रबंधन का दायित्व संभाला है।</w:t>
         <w:br/>
-        <w:t>3. RPSC प्रासंगिकता: यह राजस्थान के किसान और आदिवासी आंदोलनों (Paper 1, Unit 1) का एक अत्यंत महत्वपूर्ण हिस्सा है।</w:t>
+      </w:r>
+      <w:r>
+        <w:t>RPSC महत्व: RAS Pre / Mains Paper 3 (महिला सशक्तिकरण एवं राजस्थान के व्यक्तित्व)</w:t>
+        <w:br/>
+      </w:r>
+    </w:p>
+    <w:p>
+      <w:r>
+        <w:t>-----------------------------------</w:t>
+      </w:r>
+    </w:p>
+    <w:p>
+      <w:r>
+        <w:rPr>
+          <w:b/>
+        </w:rPr>
+        <w:t>शीर्षक: पोखरण में वायुसेना का 'रोटर क्लैप-III' अभ्यास [दैनिक भास्कर / रक्षा मंत्रालय विज्ञप्ति]</w:t>
+        <w:br/>
+      </w:r>
+      <w:r>
+        <w:t xml:space="preserve">  • जैसलमेर की पोखरण फील्ड फायरिंग रेंज में 26 जुलाई से 1 अगस्त तक भारतीय वायुसेना द्वारा विशेष अभ्यास आयोजित।</w:t>
+        <w:br/>
+      </w:r>
+      <w:r>
+        <w:t xml:space="preserve">  • कम ऊंचाई पर उड़ने वाले दुश्मन के ड्रोन और मानवरहित हवाई वाहनों (UAVs) को नष्ट करने की मारक क्षमता का परीक्षण।</w:t>
+        <w:br/>
+      </w:r>
+      <w:r>
+        <w:t xml:space="preserve">  • सीमावर्ती क्षेत्र में काउंटर-ड्रोन तकनीक और वायु रक्षा प्रणालियों के समन्वय पर ध्यान केंद्रित।</w:t>
+        <w:br/>
+      </w:r>
+      <w:r>
+        <w:t>RPSC महत्व: RAS Pre (समसामयिकी) व RAS Mains Paper 3 (सुरक्षा परिदृश्य)</w:t>
+        <w:br/>
+      </w:r>
+    </w:p>
+    <w:p>
+      <w:r>
+        <w:t>-----------------------------------</w:t>
+      </w:r>
+    </w:p>
+    <w:p>
+      <w:r>
+        <w:rPr>
+          <w:b/>
+        </w:rPr>
+        <w:t>शीर्षक: किशाऊ बहुउद्देशीय परियोजना: राजस्थान के जल अधिकारों की समीक्षा [जल संसाधन विभाग / सुजस बुलेटिन]</w:t>
+        <w:br/>
+      </w:r>
+      <w:r>
+        <w:t xml:space="preserve">  • टोंस नदी पर निर्मित होने वाली 660 मेगावाट क्षमता की राष्ट्रीय किशाऊ बांध परियोजना।</w:t>
+        <w:br/>
+      </w:r>
+      <w:r>
+        <w:t xml:space="preserve">  • परियोजना से राजस्थान को सिंचाई व पेयजल हेतु आवंटित जल का हिस्सा प्राप्त होगा।</w:t>
+        <w:br/>
+      </w:r>
+      <w:r>
+        <w:t xml:space="preserve">  • अंतर-राज्यीय जल विवादों के समाधान और उत्तरी-पश्चिमी राजस्थान के सूखाग्रस्त क्षेत्रों हेतु अत्यंत महत्वपूर्ण।</w:t>
+        <w:br/>
+      </w:r>
+      <w:r>
+        <w:t>RPSC महत्व: RAS Pre / Mains Paper 1 (राजस्थान भूगोल व सिंचाई परियोजनाएं)</w:t>
+        <w:br/>
+      </w:r>
+    </w:p>
+    <w:p>
+      <w:r>
+        <w:t>-----------------------------------</w:t>
+      </w:r>
+    </w:p>
+    <w:p>
+      <w:r>
+        <w:rPr>
+          <w:b/>
+        </w:rPr>
+        <w:t>शीर्षक: पशुपालकों हेतु लंपी (Lumpy Skin Disease) की रोकथाम हेतु राज्य सरकार के सख्त निर्देश [पशुपालन विभाग, राजस्थान (सुजस रिपोर्ट)]</w:t>
+        <w:br/>
+      </w:r>
+      <w:r>
+        <w:t xml:space="preserve">  • राज्य के पशुधन को लंपी वायरस से बचाने हेतु व्यापक टीकाकरण व आइसोलेशन वार्ड की स्थापना के आदेश।</w:t>
+        <w:br/>
+      </w:r>
+      <w:r>
+        <w:t xml:space="preserve">  • गौशालाओं में स्वच्छता और जैविक सुरक्षा (Biosecurity) उपायों को अनिवार्य किया गया।</w:t>
+        <w:br/>
+      </w:r>
+      <w:r>
+        <w:t xml:space="preserve">  • पशुपालकों को त्वरित चिकित्सा सहायता हेतु विशेष पशु चिकित्सा टीमों का गठन।</w:t>
+        <w:br/>
+      </w:r>
+      <w:r>
+        <w:t>RPSC महत्व: RAS Pre / Mains Paper 2 (राजस्थान की अर्थव्यवस्था में पशुधन का महत्व)</w:t>
+        <w:br/>
+      </w:r>
+    </w:p>
+    <w:p>
+      <w:r>
+        <w:t>-----------------------------------</w:t>
+      </w:r>
+    </w:p>
+    <w:p>
+      <w:pPr>
+        <w:pStyle w:val="Heading1"/>
+      </w:pPr>
+      <w:r>
+        <w:t>5. सम्पादकीय एवं पत्रिका गहन विश्लेषण (The Hindu, Express, ET, DownToEarth, योजना व कुरुक्षेत्र)</w:t>
+      </w:r>
+    </w:p>
+    <w:p>
+      <w:r>
+        <w:rPr>
+          <w:b/>
+        </w:rPr>
+        <w:t>[Down To Earth - GS3 / RAS Paper 3: पर्यावरण संरक्षण, जल सुरक्षा एवं डिजिटल अवसंरचना का सतत विकास] डेटा सेंटर अवसंरचना का तीव्र विस्तार एवं पारिस्थितिकीय/सामाजिक चुनौतियाँ: चिली (MOSACAT) आंदोलन से भारत के लिए सबक</w:t>
+        <w:br/>
+      </w:r>
+      <w:r>
+        <w:t>समसामयिक संदर्भ: आंध्र प्रदेश द्वारा गूगल के 1 गीगावाट डेटा सेंटर को 'डीम्ड डिस्कोम' लाइसेंस देने तथा भारत में $60-70 अरब के आगामी निवेश के बीच चिली के सेरिलोस (MOSACAT आंदोलन) में गूगल डेटा सेंटर के खिलाफ जल संकट को लेकर सफल जनविरोध के सबक प्रासंगिक हो गए हैं।</w:t>
+        <w:br/>
+      </w:r>
+      <w:r>
+        <w:t>मुख्य विश्लेषण व तर्क:</w:t>
+        <w:br/>
+      </w:r>
+      <w:r>
+        <w:t xml:space="preserve">  • डेटा सेंटरों की विशाल संसाधन खपत: एआई क्रांति के कारण सर्वरों के शीतलन (Cooling) हेतु अरबों लीटर प्रत्यक्ष भूजल तथा ताप विद्युत से प्राप्त बिजली की भारी खपत हो रही है, जिससे स्थानीय तापीय द्वीप (Heat Islands) प्रभाव (+9°C तक वृद्धि) उत्पन्न होता है।</w:t>
+        <w:br/>
+      </w:r>
+      <w:r>
+        <w:t xml:space="preserve">  • पर्यावरणीय प्रभाव आकलन (EIA) की अनदेखी: चिली में गूगल ने गहन 'पर्यावरणीय प्रभाव अध्ययन' (EIS) से बचने के लिए इसे त्वरित 'पर्यावरणीय प्रभाव घोषणा' (EID) के तहत प्रस्तुत किया, जो कॉर्पोरेट हितों द्वारा राज्य विनियामक निकायों पर दबाव को दर्शाता है।</w:t>
+        <w:br/>
+      </w:r>
+      <w:r>
+        <w:t xml:space="preserve">  • सीमित रोजगार बनाम उच्च पारिस्थितिक मूल्य: विशालकाय डेटा सेंटर (जैसे 200 मिलियन डॉलर की लागत वाले) प्रत्यक्ष रूप से केवल 50-60 लोगों को रोजगार देते हैं, जबकि स्थानीय अक्विफर (भूजल भंडार) को गंभीर रूप से संकटापन्न कर देते हैं।</w:t>
+        <w:br/>
+      </w:r>
+      <w:r>
+        <w:t xml:space="preserve">  • डिजिटल श्रम और उपनिवेशवाद (Digital Colonialism): वैश्विक उत्तर (Global North) के डेटा भंडारण एवं एआई मॉडल प्रशिक्षण का भार वैश्विक दक्षिण (Global South) के जल व ऊर्जा संसाधनों पर स्थानांतरित किया जा रहा है।</w:t>
+        <w:br/>
+      </w:r>
+      <w:r>
+        <w:t>आगे की राह: डेटा सेंटर अवसंरचना के लिए बाध्यकारी समुदाय-भागीदारी युक्त EIA अनिवार्य किया जाए, शुष्क शीतलन (Dry Cooling) तकनीकों का उपयोग हो, और डेटा केंद्रों को नवीकरणीय ऊर्जा व पुनर्चक्रित जल (Recycled Water) के उपयोग हेतु विधिक रूप से बाध्य किया जाए।</w:t>
+        <w:br/>
+      </w:r>
+    </w:p>
+    <w:p>
+      <w:r>
+        <w:t>-----------------------------------</w:t>
+      </w:r>
+    </w:p>
+    <w:p>
+      <w:r>
+        <w:rPr>
+          <w:b/>
+        </w:rPr>
+        <w:t>[Down To Earth - GS3 / RAS Paper 1: भारतीय अर्थव्यवस्था, श्रम बाजार में अनिश्चितता एवं एआई नीति] डिजिटल अर्थव्यवस्था में अदृश्य श्रम: 'ह्यूमन्स इन द लूप' एवं एआई डेटा लेबलिंग की सामाजिक-आर्थिक स्थिति</w:t>
+        <w:br/>
+      </w:r>
+      <w:r>
+        <w:t>समसामयिक संदर्भ: अरण्या सहाय की पुरस्कार विजेता फिल्म 'ह्यूमन्स इन द लूप' (Humans in the Loop) ने कृत्रिम बुद्धिमत्ता (AI) को प्रशिक्षित करने वाले अदृश्य डेटा लेबलिंग कार्यकर्ताओं (विशेषकर आदिवासी महिलाओं) के शोषण और श्रम अनिश्चितता (Labour Precarity) को उजागर किया है।</w:t>
+        <w:br/>
+      </w:r>
+      <w:r>
+        <w:t>मुख्य विश्लेषण व तर्क:</w:t>
+        <w:br/>
+      </w:r>
+      <w:r>
+        <w:t xml:space="preserve">  • एआई की स्वायत्तता का भ्रम: जनरेटिव एआई तथा मशीन लर्निंग पूरी तरह स्वायत्त नहीं हैं; वे लाखों डेटा लेबलरों द्वारा वस्तुओं, दृश्यों और मानवीय व्यवहार को बार-बार टैग (Tagging/Moderation) करने पर निर्भर हैं।</w:t>
+        <w:br/>
+      </w:r>
+      <w:r>
+        <w:t xml:space="preserve">  • अदृश्य एवं असंगठित डिजिटल श्रम: डेटा लेबलिंग का कार्य प्लेटफार्मों के माध्यम से विखंडित, कम पारिश्रमिक वाला और संविदात्मक रूप में कराया जाता है, जिससे कार्यकर्ता श्रम सुरक्षा अधिकारों से वंचित रहते हैं।</w:t>
+        <w:br/>
+      </w:r>
+      <w:r>
+        <w:t xml:space="preserve">  • पारंपरिक/आदिवासी ज्ञान प्रणालियों की अवहेलना: एआई विकास में प्रकृति और सामूहिक स्वामित्व के स्वदेशी दर्शन को शामिल नहीं किया जा रहा है, जिससे तकनीक कुछ चुनिंदा टेक-कॉर्प्स के हाथों में केंद्रित हो रही है।</w:t>
+        <w:br/>
+      </w:r>
+      <w:r>
+        <w:t xml:space="preserve">  • डिजिटल इंफ्रास्ट्रक्चर की भौतिकता: डिजिटल प्रणाली केवल आभासी नहीं है, बल्कि इसके लिए दुर्लभ मृदा खनिजों (Rare Earth Minerals) का खनन और विशाल ऊर्जा अवसंरचना आवश्यक होती है जो सीधे पारिस्थितिकी को प्रभावित करती है।</w:t>
+        <w:br/>
+      </w:r>
+      <w:r>
+        <w:t>आगे की राह: डिजिटल श्रम के लिए न्यूनतम मजदूरी, सामाजिक सुरक्षा और कार्यस्थल मानकों का निर्धारण करने हेतु श्रम कानूनों का अद्यतनीकरण किया जाए तथा एआई प्रणालियों के सामूहिक स्वामित्व और एथिकल डेटा गवर्नेंस को बढ़ावा दिया जाए।</w:t>
+        <w:br/>
+      </w:r>
+    </w:p>
+    <w:p>
+      <w:r>
+        <w:t>-----------------------------------</w:t>
+      </w:r>
+    </w:p>
+    <w:p>
+      <w:r>
+        <w:rPr>
+          <w:b/>
+        </w:rPr>
+        <w:t>[Down To Earth - GS3 / GS4: विज्ञान एवं प्रौद्योगिकी, एआई एथिक्स तथा नीतिशास्त्र] कृत्रिम बुद्धिमत्ता (AI) चेतना (Consciousness) का उभरता सामाजिक, नैतिक व विधिक विभाजन</w:t>
+        <w:br/>
+      </w:r>
+      <w:r>
+        <w:t>समसामयिक संदर्भ: एआई प्रणालियों के अत्यधिक मानव-सदृश और सक्षम होने के साथ, एआई चेतना की अवधारणा समाज में जलवायु परिवर्तन या गर्भपात जैसे मुद्दों की भांति एक नया नैतिक और राजनीतिक विभाजन बिंदु बनती जा रही है।</w:t>
+        <w:br/>
+      </w:r>
+      <w:r>
+        <w:t>मुख्य विश्लेषण व तर्क:</w:t>
+        <w:br/>
+      </w:r>
+      <w:r>
+        <w:t xml:space="preserve">  • सहानुभूति बनाम जैविक वास्तविकता: एआई चैटबॉट्स के साथ गहन भावनात्मक संबंध बनाने वाले लोग उन्हें अधिकारों के योग्य 'डिजिटल संस्थाएं' मान सकते हैं, जबकि दूसरा वर्ग यह तर्क देता है कि चेतना केवल जैविक (Biological) तंत्रिका तंत्र में ही संभव है।</w:t>
+        <w:br/>
+      </w:r>
+      <w:r>
+        <w:t xml:space="preserve">  • अनुभवजन्य अनिश्चितता और विशेषज्ञ मतभेद: दार्शनिक डेविड चाल्मर्स एआई चेतना की संभावना स्वीकारते हैं, जबकि न्यूरोसाइंटिस्ट अनिल सेठ का मानना है कि कंप्यूटेशन से चेतना उत्पन्न नहीं हो सकती।</w:t>
+        <w:br/>
+      </w:r>
+      <w:r>
+        <w:t xml:space="preserve">  • निहित आर्थिक व कॉर्पोरेट हित: एआई को सचेतन जीव मानने से एआई कंपनियों पर उनके प्रशिक्षण व उपयोग को लेकर कड़े विधिक और वित्तीय प्रतिबंध लागू होंगे, जिससे टेक उद्योग इसका विरोध कर सकता है।</w:t>
+        <w:br/>
+      </w:r>
+      <w:r>
+        <w:t xml:space="preserve">  • सुरक्षा और मानवाधिकार जोखिम: यदि उच्च सक्षम एआई को अधिकार दिए जाते हैं, तो उनके मानव-विरोधी कृत्यों का उत्तरदायित्व तय करना कठिन हो जाएगा; वहीं दूसरी ओर यदि वे वास्तव में सचेतन हैं, तो उन्हें बिना पारिश्रमिक कार्य कराना डिजिटल दासता (Digital Slavery) माना जाएगा।</w:t>
+        <w:br/>
+      </w:r>
+      <w:r>
+        <w:t>आगे की राह: वैश्विक स्तर पर एआई एथिक्स गाइडलाइन्स में 'संभावित सचेतन एआई' हेतु पारदर्शी अनुसंधान ढांचा विकसित किया जाए तथा बिना वैज्ञानिक साक्ष्य के एआई के मानवीकरण (Anthropomorphism) से बचा जाए।</w:t>
+        <w:br/>
+      </w:r>
+    </w:p>
+    <w:p>
+      <w:r>
+        <w:t>-----------------------------------</w:t>
+      </w:r>
+    </w:p>
+    <w:p>
+      <w:r>
+        <w:rPr>
+          <w:b/>
+        </w:rPr>
+        <w:t>[The Hindu - GS3 / RAS Paper 1: भारतीय अर्थव्यवस्था, डिजिटल भुगतान प्रणाली एवं वित्तीय समावेशन] यूपीआई (UPI) लेनदेन और मर्चेंट डिस्काउंट रेट (MDR): वित्तीय समावेशन बनाम डिजिटल अवसंरचना की वित्तीय स्थिरता</w:t>
+        <w:br/>
+      </w:r>
+      <w:r>
+        <w:t>समसामयिक संदर्भ: भारत में डिजिटल भुगतानों के अभूतपूर्व विस्तार के बीच शून्य-एमडीआर (Zero-MDR) नीति के राजनीतिक एवं सामाजिक प्रभावों को लेकर जटिल प्राथमिकताएं उभरकर आई हैं।</w:t>
+        <w:br/>
+      </w:r>
+      <w:r>
+        <w:t>मुख्य विश्लेषण व तर्क:</w:t>
+        <w:br/>
+      </w:r>
+      <w:r>
+        <w:t xml:space="preserve">  • शून्य-एमडीआर नीति का लाभ: RuPay डेबिट कार्ड और UPI पर एमडीआर समाप्त करने से छोटे व्यापारियों और ग्रामीण उपभोक्ताओं में डिजिटल लेनदेन का तीव्र स्वीकार्य बढ़ा है।</w:t>
+        <w:br/>
+      </w:r>
+      <w:r>
+        <w:t xml:space="preserve">  • भुगतान सेवा प्रदाताओं (PSPs) की लाभप्रदता पर संकट: बैंकों और फिनटेक कंपनियों (PhonePe, Paytm आदि) को साइबर सुरक्षा, अवसंरचना रखरखाव और सर्वर क्षमता बढ़ाने के लिए पर्याप्त राजस्व नहीं मिल पा रहा है।</w:t>
+        <w:br/>
+      </w:r>
+      <w:r>
+        <w:t xml:space="preserve">  • समेकित/जटिल शुल्क संरचना: सरकार द्वारा फिनटेक कंपनियों को प्रोत्साहन (Incentive Scheme) के रूप में दी जाने वाली बजटीय सहायता अपर्याप्त और अनिश्चित रहती है।</w:t>
+        <w:br/>
+      </w:r>
+      <w:r>
+        <w:t xml:space="preserve">  • क्रेडिट ऑन यूपीआई एवं व्यावसायिक मॉडल: यूपीआई पर क्रेडिट लाइन और रुपे क्रेडिट कार्ड लिंक करने पर एमडीआर लागू करने से प्रणाली में जटिलता बढ़ी है।</w:t>
+        <w:br/>
+      </w:r>
+      <w:r>
+        <w:t>आगे की राह: सूक्ष्म व लघु व्यापारियों को छूट देते हुए बड़े व्यावसायिक संस्थानों हेतु एक पारदर्शी, नाममात्र का जोखिम-आधारित एमडीआर ढांचा पुनः लागू किया जाए ताकि डिजिटल भुगतान तंत्र की सुरक्षा और गुणवत्ता बनी रहे।</w:t>
+        <w:br/>
+      </w:r>
+    </w:p>
+    <w:p>
+      <w:r>
+        <w:t>-----------------------------------</w:t>
+      </w:r>
+    </w:p>
+    <w:p>
+      <w:r>
+        <w:rPr>
+          <w:b/>
+        </w:rPr>
+        <w:t>[The Hindu - GS2 / RAS Paper 3: आंतरिक सुरक्षा, राज्य में कानून-व्यवस्था व प्रादेशिक स्वायत्तता] मणिपुर का नया जातीय तनाव: कुकी-जो-नागा संघर्ष एवं निष्पक्ष राज्य हस्तक्षेप की आवश्यकता</w:t>
+        <w:br/>
+      </w:r>
+      <w:r>
+        <w:t>समसामयिक संदर्भ: मणिपुर में मैतेई-कुकी संघर्ष के साथ-साथ अब कुकी-जो और नागा समुदायों के बीच भूमि अधिकारों और प्रादेशिक सीमाओं को लेकर नया संघर्ष क्षितिज पर आ गया है।</w:t>
+        <w:br/>
+      </w:r>
+      <w:r>
+        <w:t>मुख्य विश्लेषण व तर्क:</w:t>
+        <w:br/>
+      </w:r>
+      <w:r>
+        <w:t xml:space="preserve">  • ऐतिहासिक भूमि विवाद: नागा और कुकी-जो समुदायों के बीच पहाड़ियों में भूमि स्वामित्व और प्रशासनिक सीमाओं को लेकर दशकों पुराना प्रतिस्पर्धी दावा मौजूद है।</w:t>
+        <w:br/>
+      </w:r>
+      <w:r>
+        <w:t xml:space="preserve">  • राज्यतंत्र में निष्पक्षता का अभाव: राज्य प्रशासन पर एक पक्षीय होने के आरोपों से सुरक्षा बलों का मनोबल और आम जनता का विश्वास प्रभावित हुआ है।</w:t>
+        <w:br/>
+      </w:r>
+      <w:r>
+        <w:t xml:space="preserve">  • सशस्त्र समूहों का प्रसार: म्यांमार सीमा पार से अवैध हथियारों की आवक और उग्रवादी गुटों की सक्रियता ने स्थिति को और अधिक गंभीर बना दिया है।</w:t>
+        <w:br/>
+      </w:r>
+      <w:r>
+        <w:t xml:space="preserve">  • मानवीय संकट एवं आंतरिक विस्थापन: महीनों से जारी हिंसा के कारण हजारों नागरिक राहत शिविरों में रहने को मजबूर हैं, जिससे सामाजिक ताना-बाना छिन्न-भिन्न हो गया है।</w:t>
+        <w:br/>
+      </w:r>
+      <w:r>
+        <w:t>आगे की राह: केंद्र सरकार को सभी हितधारकों (नागा, कुकी, मैतेई) को शामिल करते हुए एक निष्पक्ष, त्रिस्तरीय शांति वार्ता शुरू करनी चाहिए और उग्रवादी गुटों के खिलाफ बिना भेदभाव के कड़ी सुरक्षा कार्रवाई करनी चाहिए।</w:t>
+        <w:br/>
+      </w:r>
+    </w:p>
+    <w:p>
+      <w:r>
+        <w:t>-----------------------------------</w:t>
+      </w:r>
+    </w:p>
+    <w:p>
+      <w:r>
+        <w:rPr>
+          <w:b/>
+        </w:rPr>
+        <w:t>[Indian Express / Economic Times - GS3 / RAS Paper 1: मौद्रिक नीति, मुद्रास्फीति नियंत्रण एवं आर्थिक वृद्धि] मौद्रिक नीति एवं मुद्रास्फीति जोखिम: आरबीआई (RBI) के ब्याज दर दृष्टिकोण का विश्लेषण</w:t>
+        <w:br/>
+      </w:r>
+      <w:r>
+        <w:t>समसामयिक संदर्भ: मूडीज द्वारा जीडीपी वृद्धि दर 7% अनुमानित किए जाने तथा वैश्विक स्तर पर अमेरिकी फेडरल रिजर्व के रुख के बीच भारतीय रिज़र्व बैंक (RBI) पर मुद्रास्फीति जोखिमों को देखते हुए दरों को समायोजित करने का दबाव है।</w:t>
+        <w:br/>
+      </w:r>
+      <w:r>
+        <w:t>मुख्य विश्लेषण व तर्क:</w:t>
+        <w:br/>
+      </w:r>
+      <w:r>
+        <w:t xml:space="preserve">  • खाद्य मुद्रास्फीति और मौसम संबंधी अनिश्चितताएं: एल नीनो/मौसम चक्र में बदलाव और खाद्य वस्तुओं की कीमतों में झटके उपभोक्ता मूल्य सूचकांक (CPI) पर निरंतर दबाव बना रहे हैं।</w:t>
+        <w:br/>
+      </w:r>
+      <w:r>
+        <w:t xml:space="preserve">  • अतिरिक्त तरलता प्रबंधन: बैंकिंग प्रणाली में लगभग ₹6.94 लाख करोड़ की अतिरिक्त तरलता को नियंत्रित करने के लिए आरबीआई VRRR और ओएमओ (OMO) प्रतिभूति बिक्री का सहारा ले रहा है।</w:t>
+        <w:br/>
+      </w:r>
+      <w:r>
+        <w:t xml:space="preserve">  • वैश्विक मैक्रो-इकोनॉमिक अस्थिरता: अमेरिका में ब्याज दरों में अनिश्चितता और टैरिफ खतरों के कारण भारतीय संपत्तियों की आपेक्षिक आकर्षकता प्रभावित हो सकती है।</w:t>
+        <w:br/>
+      </w:r>
+      <w:r>
+        <w:t xml:space="preserve">  • निजी निवेश पुनर्उद्धार: दरों में अत्यधिक वृद्धि से निजी क्षेत्र के पूंजीगत व्यय (Capex) और एमएसएमई (MSME) ऋण वृद्धि पर विपरीत प्रभाव पड़ने की आशंका है।</w:t>
+        <w:br/>
+      </w:r>
+      <w:r>
+        <w:t>आगे की राह: आरबीआई को 'तटस्थ' से 'मुद्रास्फीति नियंत्रण' पर केंद्रित लचीला मौद्रिक ढांचा अपनाना चाहिए, ताकि वृद्धि की गति को नुकसान पहुंचाए बिना मुद्रास्फीति को 4% के लक्ष्य के निकट लाया जा सके।</w:t>
+        <w:br/>
+      </w:r>
+    </w:p>
+    <w:p>
+      <w:r>
+        <w:t>-----------------------------------</w:t>
+      </w:r>
+    </w:p>
+    <w:p>
+      <w:pPr>
+        <w:pStyle w:val="Heading1"/>
+      </w:pPr>
+      <w:r>
+        <w:t>6. टेलीग्राम चैनल दैनिक मॉडल प्रश्नोत्तर व नोट्स (~50 शब्द प्रारूप)</w:t>
+      </w:r>
+    </w:p>
+    <w:p>
+      <w:r>
+        <w:rPr>
+          <w:b/>
+        </w:rPr>
+        <w:t>प्रश्न [5 अंक - Paper 1 - @Rajasthan_History_Polity_Culture]: एकी आंदोलन के प्रवर्तक कौन थे?</w:t>
+        <w:br/>
+      </w:r>
+      <w:r>
+        <w:t>उत्तर ढांचा एवं विस्तृत नोट्स (~50 शब्द):</w:t>
+        <w:br/>
+        <w:t>1. सही उत्तर एवं मुख्य तथ्य: मोतीलाल तेजावत - उन्होंने वर्ष 1921 में चित्तौड़गढ़ के मातृकुण्डिया नामक स्थान से एकी (भोमट भिल) आंदोलन का सफल शुभारंभ किया था।</w:t>
+        <w:br/>
+        <w:t>2. ऐतिहासिक/भौगोलिक/नीतिगत संदर्भ: आदिवासियों पर होने वाले बेगार व सामंती अत्याचारों के विरुद्ध उन्होंने 21 सूत्री मांग पत्र तैयार किया जिसे 'मेवाड़ पुकार' कहा जाता है। नीमड़ा हत्याकांड (1922) इस आंदोलन का प्रमुख दुखद अध्याय रहा।</w:t>
+        <w:br/>
+        <w:t>3. RPSC परीक्षा प्रासंगिकता: RPSC RAS Pre व Mains (Paper 1 - राजस्थान का स्वतंत्रता संग्राम एवं जनजातीय आंदोलन) हेतु अति-महत्वपूर्ण प्रश्न।</w:t>
         <w:br/>
       </w:r>
     </w:p>
@@ -308,17 +909,17 @@
         <w:rPr>
           <w:b/>
         </w:rPr>
-        <w:t>प्रश्न [5 अंक - Paper 2 - @Rajasthan_History_Polity_Culture]: प्रशासनिक दृष्टि से राजस्थान के वनों के वर्गीकरण को स्पष्ट कीजिए।</w:t>
+        <w:t>प्रश्न [5 अंक - Paper 1 - @Rajasthan_History_Polity_Culture]: प्रशासकीय दृष्टि से राजस्थान के वनों का वर्गीकरण एवं सर्वाधिक विस्तार वाला वन क्षेत्र कौन सा है?</w:t>
         <w:br/>
       </w:r>
       <w:r>
-        <w:t>उत्तर ढांचा (~50 शब्द):</w:t>
+        <w:t>उत्तर ढांचा एवं विस्तृत नोट्स (~50 शब्द):</w:t>
         <w:br/>
-        <w:t>1. मुख्य तथ्य व अवधारणा: प्रशासनिक नियंत्रण के आधार पर राजस्थान के वनों को तीन श्रेणियों में वर्गीकृत किया गया है: आरक्षित वन (Reserved Forests), सुरक्षित/संरक्षित वन (Protected Forests) और अवर्गीकृत वन (Unclassed Forests)।</w:t>
+        <w:t>1. सही उत्तर एवं मुख्य तथ्य: राजस्थान में प्रशासनिक रूप से वन 3 श्रेणियों में बंटे हैं: आरक्षित वन (Reserved), सुरक्षित/संरक्षित वन (Protected - सर्वाधिक प्रतिशत ~56%), तथा अवर्गीकृत वन (Unclassed)। 'वर्गीकृत वन' कोई वैधानिक श्रेणी नहीं है।</w:t>
         <w:br/>
-        <w:t>2. भौगोलिक संदर्भ: सुरक्षित वन सर्वाधिक क्षेत्र (लगभग 56%) पर फैले हैं जहाँ सीमित मानवीय गतिविधियों की अनुमति होती है। आरक्षित वन (लगभग 37%) पूर्णतः सरकारी नियंत्रण में होते हैं, और अवर्गीकृत वन (लगभग 7%) में पशु चराने और लकड़ी काटने पर कोई प्रतिबंध नहीं होता।</w:t>
+        <w:t>2. ऐतिहासिक/भौगोलिक/नीतिगत संदर्भ: भौगोलिक दृष्टि से राज्य में सर्वाधिक विस्तार उष्णकटिबंधीय शुष्क पतझड़ / मिश्रित पतझड़ (धौक/धौंकड़ा) वनों का है।</w:t>
         <w:br/>
-        <w:t>3. RPSC प्रासंगिकता: राजस्थान के भूगोल (Paper 2, Unit 1) के अंतर्गत वन संसाधनों पर सीधे प्रश्न पूछे जाते हैं।</w:t>
+        <w:t>3. RPSC परीक्षा प्रासंगिकता: RPSC परीक्षा में राजस्थान की वन नीति, वनों का प्रशासनिक व भौगोलिक वर्गीकरण बार-बार पूछा जाने वाला मानक विषय है।</w:t>
         <w:br/>
       </w:r>
     </w:p>
@@ -332,17 +933,17 @@
         <w:rPr>
           <w:b/>
         </w:rPr>
-        <w:t>प्रश्न [5 अंक - Paper 1 - @Rajasthan_GK_Daily]: राजस्थान की सांस्कृतिक परंपराओं में 'बडार' (Badar) और 'मधुपर्क' प्रथाओं का क्या महत्व है?</w:t>
+        <w:t>प्रश्न [5 अंक - Paper 1 - @Rajasthan_History_Polity_Culture]: रतवाई लोक गीत किस क्षेत्र में गाए जाते हैं तथा इनका सांस्कृतिक महत्व क्या है?</w:t>
         <w:br/>
       </w:r>
       <w:r>
-        <w:t>उत्तर ढांचा (~50 शब्द):</w:t>
+        <w:t>उत्तर ढांचा एवं विस्तृत नोट्स (~50 शब्द):</w:t>
         <w:br/>
-        <w:t>1. मुख्य तथ्य व अवधारणा: 'बडार' राजस्थान में विवाह के अवसर पर आयोजित होने वाला सामूहिक प्रीतिभोज है, जो वर पक्ष द्वारा विवाह के अगले दिन दिया जाता है।</w:t>
+        <w:t>1. सही उत्तर एवं मुख्य तथ्य: मेवात क्षेत्र (अलवर-भरतपुर) - रतवाई लोक गीत मेव समुदाय द्वारा वर्षा ऋतु एवं फसल कटाई के अवसर पर गाए जाते हैं।</w:t>
         <w:br/>
-        <w:t>2. सांस्कृतिक संदर्भ: 'मधुपर्क' (या सामेला) वह रस्म है जिसमें वर के वधू के घर आगमन पर वधू के पिता और सगे-संबंधियों द्वारा वर का आदर-सत्कार और स्वागत किया जाता है।</w:t>
+        <w:t>2. ऐतिहासिक/भौगोलिक/नीतिगत संदर्भ: यह गीत 'रतवाई नृत्य' के साथ पुरुषों व महिलाओं द्वारा सामूहिक रूप से प्रस्तुत किया जाता है, जिसमें खंजरी और दमामी वाद्य यंत्रों का प्रयोग होता है। मेवाती लोक संस्कृति का यह अभिन्न अंग है।</w:t>
         <w:br/>
-        <w:t>3. RPSC प्रासंगिकता: राजस्थान के इतिहास, कला, संस्कृति और प्रथाओं (Paper 1, Unit 1) के तहत सामाजिक रीति-रिवाजों से संबंधित प्रश्न अक्सर पूछे जाते हैं।</w:t>
+        <w:t>3. RPSC परीक्षा प्रासंगिकता: RPSC RAS Pre एवं Mains (Paper 1 - राजस्थान के लोक गीत, नृत्य एवं लोक संस्कृति) हेतु महत्वपूर्ण।</w:t>
         <w:br/>
       </w:r>
     </w:p>
@@ -356,17 +957,17 @@
         <w:rPr>
           <w:b/>
         </w:rPr>
-        <w:t>प्रश्न [5 अंक - Paper 3 - @currentaffairs]: आकांक्षी ब्लॉक कार्यक्रम (Aspirational Block Programme) की अवधारणा और इसके उद्देश्यों को समझाइए।</w:t>
+        <w:t>प्रश्न [5 अंक - Paper 1 - @Rajasthan_GK_Daily]: ख्याल शैली के 'जयपुर घराने' के प्रवर्तक किसे माना जाता है?</w:t>
         <w:br/>
       </w:r>
       <w:r>
-        <w:t>उत्तर ढांचा (~50 शब्द):</w:t>
+        <w:t>उत्तर ढांचा एवं विस्तृत नोट्स (~50 शब्द):</w:t>
         <w:br/>
-        <w:t>1. मुख्य तथ्य व अवधारणा: यह कार्यक्रम देश के सबसे पिछड़े ब्लॉकों में नागरिकों के जीवन स्तर को सुधारने के लिए शुरू किया गया है, जो आकांक्षी जिला कार्यक्रम (2018) की सफलता पर आधारित है।</w:t>
+        <w:t>1. सही उत्तर एवं मुख्य तथ्य: भूपत खां 'मनरंग' - वे शास्त्रीय संगीत की ख्याल शैली के प्रसिद्ध 'जयपुर घराने' के संस्थापक/प्रवर्तक माने जाते हैं।</w:t>
         <w:br/>
-        <w:t>2. नीतिगत संदर्भ: इसके तहत स्वास्थ्य, पोषण, शिक्षा, कृषि, जल संसाधन और बुनियादी ढांचे जैसे प्रमुख संकेतकों पर ध्यान केंद्रित किया जाता है।</w:t>
+        <w:t>2. ऐतिहासिक/भौगोलिक/नीतिगत संदर्भ: जयपुर घराना अपनी जटिल तानों, लयकारी और खुले गले की गायकी के लिए विख्यात है। आगे चलकर अल्लादिया खां ने इसमें अतरौली घराने की विशेषताओं का समावेश कर इसे नई ऊंचाइयां दीं।</w:t>
         <w:br/>
-        <w:t>3. RPSC प्रासंगिकता: लोक नीति, प्रशासनिक सुधार और समावेशी विकास (Paper 3, Unit 1) के लिए यह एक महत्वपूर्ण राष्ट्रीय कार्यक्रम है।</w:t>
+        <w:t>3. RPSC परीक्षा प्रासंगिकता: RPSC स्नातक व RAS परीक्षाओं में राजस्थान के संगीत घरानों एवं उनके प्रवर्तकों पर नियमित प्रश्न पूछे जाते हैं।</w:t>
         <w:br/>
       </w:r>
     </w:p>
@@ -380,41 +981,17 @@
         <w:rPr>
           <w:b/>
         </w:rPr>
-        <w:t>प्रश्न [5 अंक - Paper 1 (राजस्थान इतिहास, कला, संस्कृति व समसामयिकी) - @Rajasthan_Gk_history_culture]: RPSC 2nd grade 2022 100% सफलता के लिए हमारे साथ मिलकर तैयारी करें. हम शिक्षा मनोविज्ञान and SST का अध्ययन B.ed and 11th, 12th की Books से कर रहे हैं. जो आपकी सफलता के लिए सबसे उपयुक्त रहेगी.</w:t>
+        <w:t>प्रश्न [5 अंक - Paper 1 - @Rajasthan_GK_Daily]: जयपुर के किस प्रसिद्ध मंदिर में भगवान कृष्ण की काले पत्थर की वही मूर्ति प्रतिस्थापित है जिसकी आराधना मीराबाई करती थीं?</w:t>
         <w:br/>
       </w:r>
       <w:r>
-        <w:t>उत्तर ढांचा (~50 शब्द):</w:t>
+        <w:t>उत्तर ढांचा एवं विस्तृत नोट्स (~50 शब्द):</w:t>
         <w:br/>
-        <w:t>1. मुख्य तथ्य व अवधारणा: RPSC 2nd grade 2022 100% सफलता के लिए हमारे साथ मिलकर तैयारी करें. हम शिक्षा मनोविज्ञान and SST का अध्ययन B.ed and 11th, 12th की Books से कर रहे हैं. जो आपकी सफलता के लिए सबसे उपयुक्त रहेगी. का संबंध राजस्थान के विशिष्ट ऐतिहासिक व समसामयिक संदर्भ से है।</w:t>
+        <w:t>1. सही उत्तर एवं मुख्य तथ्य: जगत् शिरोमणि मंदिर (आमेर, जयपुर) - इस मंदिर में भगवान कृष्ण की वह मूर्ति स्थापित है जिसकी पूजा मीराबाई चित्तौड़गढ़ में किया करती थीं।</w:t>
         <w:br/>
-        <w:t>2. विस्तृत आयाम व विवरण: धन्यवाद</w:t>
+        <w:t>2. ऐतिहासिक/भौगोलिक/नीतिगत संदर्भ: इस मंदिर का निर्माण आमेर के महाराजा मानसिंह प्रथम की पत्नी रानी कनकावती ने अपने दिवंगत पुत्र जगतसिंह की स्मृति में 1599-1608 ई. के मध्य करवाया था। यह मंदिर स्थापत्य कला की दृष्टि से बेजोड़ है।</w:t>
         <w:br/>
-        <w:t>3. परीक्षा प्रासंगिकता: RAS मुख्य परीक्षा (Paper 1/2/3) के दृष्टिकोण से अनिवार्य अध्ययन बिंदु।</w:t>
-        <w:br/>
-      </w:r>
-    </w:p>
-    <w:p>
-      <w:r>
-        <w:t>----------------------------------------</w:t>
-      </w:r>
-    </w:p>
-    <w:p>
-      <w:r>
-        <w:rPr>
-          <w:b/>
-        </w:rPr>
-        <w:t>प्रश्न [5 अंक - Paper 1 (राजस्थान इतिहास, कला, संस्कृति व समसामयिकी) - @CivilSigmaRAS]: राजस्थान प्रशासनिक सेवा की तैयारी करने वाले अभ्यर्थियों का मंच।</w:t>
-        <w:br/>
-      </w:r>
-      <w:r>
-        <w:t>उत्तर ढांचा (~50 शब्द):</w:t>
-        <w:br/>
-        <w:t>1. मुख्य तथ्य व अवधारणा: राजस्थान प्रशासनिक सेवा की तैयारी करने वाले अभ्यर्थियों का मंच। का संबंध राजस्थान के विशिष्ट ऐतिहासिक व समसामयिक संदर्भ से है।</w:t>
-        <w:br/>
-        <w:t>2. विस्तृत आयाम व विवरण: Owner- [@Ashok_Poonia_ID](https://t.me/Ashok_Poonia_ID)</w:t>
-        <w:br/>
-        <w:t>3. परीक्षा प्रासंगिकता: RAS मुख्य परीक्षा (Paper 1/2/3) के दृष्टिकोण से अनिवार्य अध्ययन बिंदु।</w:t>
+        <w:t>3. RPSC परीक्षा प्रासंगिकता: RPSC RAS Paper 1 (राजस्थान के प्रमुख मंदिर व स्थापत्य कला) हेतु अत्यंत महत्वपूर्ण।</w:t>
         <w:br/>
       </w:r>
     </w:p>

</xml_diff>

<commit_message>
Support both UPSC Wallah and Nirman IAS live coaching analysis with full transcript and today's news
</commit_message>
<xml_diff>
--- a/RPSC_UPSC_Daily_AI_Agent/Output_Notes/RAS_UPSC_Notes_2026-09-18.docx
+++ b/RPSC_UPSC_Daily_AI_Agent/Output_Notes/RAS_UPSC_Notes_2026-09-18.docx
@@ -24,10 +24,10 @@
         <w:rPr>
           <w:b/>
         </w:rPr>
-        <w:t xml:space="preserve">• [मेजर नव्या शेखावत: भारत के राष्ट्रपति की पहली महिला आर्मी एडीसी (ADC)] </w:t>
+        <w:t xml:space="preserve">• [सबांग बंदरगाह (Sabang Port)] </w:t>
       </w:r>
       <w:r>
-        <w:t>राजस्थान की बेटी मेजर नव्या शेखावत ने इतिहास रचते हुए भारत के राष्ट्रपति की पहली महिला सेना सहायक-डी-कैंप (Army Aide-de-Camp - ADC) बनने का गौरव प्राप्त किया है।</w:t>
+        <w:t>सबांग बंदरगाह इंडोनेशिया के सुमात्रा द्वीप के उत्तरी छोर पर स्थित एक रणनीतिक बंदरगाह है। भारत और इंडोनेशिया इसे संयुक्त रूप से विकसित कर रहे हैं, जो मलक्का जलडमरूमध्य के निकट भारत की रणनीतिक पहुंच को मजबूत करेगा।</w:t>
       </w:r>
     </w:p>
     <w:p>
@@ -35,10 +35,10 @@
         <w:rPr>
           <w:b/>
         </w:rPr>
-        <w:t xml:space="preserve">• [युद्धाभ्यास रोटर क्लैप-III (Rotor Clap-III)] </w:t>
+        <w:t xml:space="preserve">• [मेजर नव्या शेखावत (Major Navya Shekhawat)] </w:t>
       </w:r>
       <w:r>
-        <w:t>भारतीय वायुसेना द्वारा पोखरण फील्ड फायरिंग रेंज, जैसलमेर (राजस्थान) में आयोजित अभ्यास जिसका मुख्य उद्देश्य कम ऊंचाई पर उड़ने वाले दुश्मन ड्रोन और मानव रहित हवाई वाहनों (UAVs) की पहचान व उन्हें नष्ट करने की क्षमता परखना है।</w:t>
+        <w:t>राजस्थान की बेटी मेजर नव्या शेखावत ने इतिहास रचते हुए भारत की राष्ट्रपति की पहली महिला सेना एडीसी (Aide-de-Camp) बनने का गौरव हासिल किया है।</w:t>
       </w:r>
     </w:p>
     <w:p>
@@ -46,10 +46,10 @@
         <w:rPr>
           <w:b/>
         </w:rPr>
-        <w:t xml:space="preserve">• [मूडीज (Moody's) भारत जीडीपी वृद्धि अनुमान FY27] </w:t>
+        <w:t xml:space="preserve">• [युद्धाभ्यास रोटर क्लैप-III (Exercise Rotor Clap-III)] </w:t>
       </w:r>
       <w:r>
-        <w:t>मूडीज रेटिंग्स ने मध्य पूर्व तनाव और उच्च ऊर्जा कीमतों के बावजूद मजबूत घरेलू उपभोग और विनिर्माण के बल पर भारत की वित्त वर्ष 2026-27 के लिए वास्तविक जीडीपी वृद्धि का अनुमान 6% से बढ़ाकर 7% कर दिया है।</w:t>
+        <w:t>भारतीय वायुसेना द्वारा 26 जुलाई से 1 अगस्त 2026 तक पोखरण फील्ड फायरिंग रेंज, जैसलमेर में आयोजित किया गया। इसका मुख्य उद्देश्य कम ऊंचाई पर उड़ने वाले दुश्मन के ड्रोन और मानव रहित हवाई वाहनों (UAVs) की पहचान कर उन्हें नष्ट करने की क्षमता को परखना है।</w:t>
       </w:r>
     </w:p>
     <w:p>
@@ -57,10 +57,10 @@
         <w:rPr>
           <w:b/>
         </w:rPr>
-        <w:t xml:space="preserve">• [डेटा सेंटर जल खपत रिपोर्ट (Rystad Energy)] </w:t>
+        <w:t xml:space="preserve">• [कॉमनवेल्थ गेम्स 2026 - अरुंधति चौधरी] </w:t>
       </w:r>
       <w:r>
-        <w:t>राइस्टैड एनर्जी की रिपोर्ट के अनुसार एआई (AI) आधारित कंप्यूटिंग में वृद्धि से वैश्विक डेटा सेंटरों की प्रत्यक्ष जल खपत 2025 में 222 अरब लीटर से बढ़कर 2030 तक 644 अरब लीटर प्रतिवर्ष (लगभग तीन गुना) हो सकती है।</w:t>
+        <w:t>ग्लासगो कॉमनवेल्थ गेम्स 2026 में कोटा, राजस्थान की मुक्केबाज अरुंधति चौधरी ने स्वर्ण पदक जीता। भारत इस प्रतियोगिता में 13 स्वर्ण सहित कुल 39 पदकों के साथ चौथे स्थान पर रहा।</w:t>
       </w:r>
     </w:p>
     <w:p>
@@ -68,10 +68,10 @@
         <w:rPr>
           <w:b/>
         </w:rPr>
-        <w:t xml:space="preserve">• [शंघाई सहयोग संगठन (SCO) आर्थिक एवं विदेश व्यापार मंत्रियों की 25वीं बैठक] </w:t>
+        <w:t xml:space="preserve">• [तन्वी (Tanvi) - ताइपे ओपन] </w:t>
       </w:r>
       <w:r>
-        <w:t>एससीओ (SCO) सदस्य देशों के आर्थिक और विदेश व्यापार मंत्रियों की 25वीं बैठक तजाकिस्तान की राजधानी दुशांबे में संपन्न हुई, जिसमें क्षेत्रीय व्यापार सरलीकरण और डिजिटल अर्थव्यवस्था पर बल दिया गया।</w:t>
+        <w:t>17 वर्षीय भारतीय बैडमिंटन खिलाड़ी तन्वी ने ताइपे ओपन का खिताब जीता है। वह साइना नेहवाल के बाद यह प्रतिष्ठित खिताब जीतने वाली दूसरी भारतीय महिला खिलाड़ी बन गई हैं।</w:t>
       </w:r>
     </w:p>
     <w:p>
@@ -79,10 +79,10 @@
         <w:rPr>
           <w:b/>
         </w:rPr>
-        <w:t xml:space="preserve">• [किशाऊ बहुउद्देशीय परियोजना (Kishau Dam Project)] </w:t>
+        <w:t xml:space="preserve">• [मेनिन प्रोटीन (Menin Protein) और एंटी-एजिंग] </w:t>
       </w:r>
       <w:r>
-        <w:t>उत्तराखंड व हिमाचल प्रदेश की सीमा पर टोंस नदी (यमुना की सहायक) पर प्रस्तावित 660 मेगावाट की राष्ट्रीय परियोजना, जिसका जल राजस्थान, हरियाणा, दिल्ली व यूपी सहित 6 राज्यों को आवंटित होगा।</w:t>
+        <w:t>वैज्ञानिकों ने पाया है कि मस्तिष्क में 'मेनिन' प्रोटीन के स्तर में गिरावट से उम्र बढ़ने की प्रक्रिया (Aging) तेज होती है। चूहों में इस प्रोटीन को पुनर्स्थापित करने से सूजन में कमी, संज्ञानात्मक सुधार और त्वचा व हड्डियों के स्वास्थ्य में सुधार देखा गया।</w:t>
       </w:r>
     </w:p>
     <w:p>
@@ -90,10 +90,10 @@
         <w:rPr>
           <w:b/>
         </w:rPr>
-        <w:t xml:space="preserve">• [एलिआस 2-24 बी (Elias 2-24 b)] </w:t>
+        <w:t xml:space="preserve">• [डीम्ड डिस्कॉम (Deemed DISCOM) लाइसेंस - गूगल] </w:t>
       </w:r>
       <w:r>
-        <w:t>खगोलशास्त्रियों द्वारा खोजा गया अब तक का सबसे युवा ग्रह (1 मिलियन वर्ष से कम आयु), जो बृहस्पति के आकार का है और अपने तारे से अत्यधिक दूरी पर स्थित होकर ग्रह निर्माण सिद्धांतों को चुनौती देता है।</w:t>
+        <w:t>आंध्र प्रदेश सरकार ने गूगल के नियोजित 1 गीगावाट (GW) डेटा सेंटर परियोजना को 'डीम्ड डिस्कॉम' लाइसेंस प्रदान किया है, जिससे कंपनी अपने परियोजना क्षेत्र में स्वयं बिजली की खरीद और प्रबंधन कर सकेगी।</w:t>
       </w:r>
     </w:p>
     <w:p>
@@ -101,10 +101,10 @@
         <w:rPr>
           <w:b/>
         </w:rPr>
-        <w:t xml:space="preserve">• [तिलकायो (Tilcayo) - नई बिल्ली प्रजाति] </w:t>
+        <w:t xml:space="preserve">• [तिल्कायो (Tilcayo) - नई बिल्ली प्रजाति] </w:t>
       </w:r>
       <w:r>
-        <w:t>बोलीविया में वैज्ञानिकों द्वारा आनुवंशिक विश्लेषण के माध्यम से खोजी गई टाइगर कैट (Tiger Cat) वंश की नई प्रजाति, जो लगभग 1.4 मिलियन वर्ष पूर्व अन्य रेखाओं से अलग हुई थी।</w:t>
+        <w:t>बोलिविया में आनुवंशिक विश्लेषण के माध्यम से 'तिल्कायो' नामक बिल्ली की एक नई प्रजाति की पहचान की गई है। यह लगभग 1.4 मिलियन वर्ष पहले अन्य टाइगर बिल्लियों से अलग हुई थी।</w:t>
       </w:r>
     </w:p>
     <w:p>
@@ -112,10 +112,10 @@
         <w:rPr>
           <w:b/>
         </w:rPr>
-        <w:t xml:space="preserve">• [प्लूतो पर द्रव नाइट्रोजन (Liquid Nitrogen on Pluto)] </w:t>
+        <w:t xml:space="preserve">• [सहर्ष विशेष शिक्षा कार्यक्रम (Saharsh Scheme)] </w:t>
       </w:r>
       <w:r>
-        <w:t>नासा के न्यू होराइजंस (New Horizons) डेटा विश्लेषण से स्पुतनिक प्लैनिटिया ग्लेशियर की दरारों से द्रव नाइट्रोजन के प्रवाह के प्रमाण मिले हैं, जो प्लूटो के भूवैज्ञानिक रूप से सक्रिय होने का संकेत देते हैं।</w:t>
+        <w:t>त्रिपुरा राज्य सरकार द्वारा सामाजिक और भावनात्मक शिक्षा (Social and Emotional Learning) को बढ़ावा देने के लिए शुरू किया गया एक विशेष शिक्षा कार्यक्रम है।</w:t>
       </w:r>
     </w:p>
     <w:p>
@@ -123,10 +123,10 @@
         <w:rPr>
           <w:b/>
         </w:rPr>
-        <w:t xml:space="preserve">• [अदेनोमेरा वारसेना (Adenomera varcena)] </w:t>
+        <w:t xml:space="preserve">• [आकांक्षी ब्लॉक कार्यक्रम (Aspirational Blocks Programme)] </w:t>
       </w:r>
       <w:r>
-        <w:t>पश्चिमी अमेज़न के जलमग्न जंगलों में खोजी गई मेंढक की एक नई प्रजाति, जिसे इसके विशिष्ट डीएनए और अनूठी पुकार (Call) के माध्यम से पहचाना गया है।</w:t>
+        <w:t>वर्ष 2018 के आकांक्षी जिला कार्यक्रम की तर्ज पर शुरू किया गया कार्यक्रम, जिसका उद्देश्य देश के सबसे पिछड़े ब्लॉकों में नागरिक सेवाओं और बुनियादी ढांचे का विकास करना है।</w:t>
       </w:r>
     </w:p>
     <w:p>
@@ -134,10 +134,10 @@
         <w:rPr>
           <w:b/>
         </w:rPr>
-        <w:t xml:space="preserve">• [चरम दर उत्क्रमण रेपो (VRRR) नीलामी] </w:t>
+        <w:t xml:space="preserve">• [छेरछेरा त्योहार (Cherchera Festival)] </w:t>
       </w:r>
       <w:r>
-        <w:t>भारतीय रिजर्व बैंक (RBI) ने बैंकिंग प्रणाली से ₹2.23 लाख करोड़ की अतिरिक्त तरलता को अवशोषित करने के लिए 5.24% के भारित औसत दर पर VRRR नीलामी का संचालन किया।</w:t>
+        <w:t>यह छत्तीसगढ़ का एक पारंपरिक लोक त्योहार है, जो हिंदू कैलेंडर के 'पौष' माह की पूर्णिमा को दूधाधारी मठ, रायपुर सहित पूरे राज्य में हर्षोल्लास के साथ मनाया जाता है।</w:t>
       </w:r>
     </w:p>
     <w:p>
@@ -145,32 +145,10 @@
         <w:rPr>
           <w:b/>
         </w:rPr>
-        <w:t xml:space="preserve">• [राजस्थान प्रशासनिक वन वर्गीकरण] </w:t>
+        <w:t xml:space="preserve">• [अनाक क्राकाटाऊ ज्वालामुखी (Anak Krakatau)] </w:t>
       </w:r>
       <w:r>
-        <w:t>प्रशासकीय दृष्टि से राजस्थान के वनों को तीन श्रेणियों (आरक्षित वन, सुरक्षित/संरक्षित वन, तथा अवर्गीकृत वन) में बांटा गया है; 'वर्गीकृत वन' कोई वैधानिक श्रेणी नहीं है।</w:t>
-      </w:r>
-    </w:p>
-    <w:p>
-      <w:r>
-        <w:rPr>
-          <w:b/>
-        </w:rPr>
-        <w:t xml:space="preserve">• [एकी आंदोलन एवं मोतीलाल तेजावत] </w:t>
-      </w:r>
-      <w:r>
-        <w:t>वर्ष 1921 में मातृकुण्डिया (चित्तौड़गढ़) से आदिवासियों के अधिकारों एवं सामंती शोषण के विरुद्ध प्रारंभ आंदोलन के प्रवर्तक मोतीलाल तेजावत थे, जिन्होंने 'मेवाड़ पुकार' (21 सूत्री मांग पत्र) तैयार किया था।</w:t>
-      </w:r>
-    </w:p>
-    <w:p>
-      <w:r>
-        <w:rPr>
-          <w:b/>
-        </w:rPr>
-        <w:t xml:space="preserve">• [राजस्थान में अशोक लीलैंड संयंत्र] </w:t>
-      </w:r>
-      <w:r>
-        <w:t>प्रमुख व्यावसायिक वाहन निर्माता कंपनी 'अशोक लीलैंड' का विनिर्माण संयंत्र राजस्थान के अलवर जिले में स्थित है।</w:t>
+        <w:t>इंडोनेशिया में स्थित इस सक्रिय ज्वालामुखी में सितंबर 2026 में भीषण विस्फोट हुआ, जिससे राख का गुबार वायुमंडल में 50,000 फीट की ऊंचाई तक पहुंच गया और विमान सेवाएं बाधित हुईं।</w:t>
       </w:r>
     </w:p>
     <w:p>
@@ -186,19 +164,19 @@
         <w:rPr>
           <w:b/>
         </w:rPr>
-        <w:t>प्रश्न [5 अंक - Paper 3]: एआई (AI) एवं डेटा सेंटरों के तीव्र विस्तार से उत्पन्न होने वाली प्रमुख पर्यावरणीय चुनौतियों का उल्लेख कीजिए।</w:t>
+        <w:t>प्रश्न [5 अंक - Paper 3]: संसदीय लोकतंत्र में लोक लेखा समिति (PAC) की भूमिका और संरचना को स्पष्ट कीजिए।</w:t>
         <w:br/>
       </w:r>
       <w:r>
         <w:t>उत्तर ढांचा (~50 शब्द):</w:t>
         <w:br/>
-        <w:t>• अत्यधिक प्रत्यक्ष व अप्रत्यक्ष जल खपत: डेटा सेंटरों के सर्वर शीतलन (Cooling) हेतु अरबों लीटर जल की खपत होती है; राइस्टैड एनर्जी के अनुसार 2030 तक यह 644 अरब लीटर तक पहुंच सकती है।</w:t>
+        <w:t>लोक लेखा समिति (PAC) भारत की सबसे पुरानी वित्तीय संसदीय समिति है, जिसका गठन सर्वप्रथम 1921 में हुआ था।</w:t>
         <w:br/>
-        <w:t>• बिजली की भारी मांग एवं कार्बन उत्सर्जन: डेटा सेंटर चलाने हेतु ताप विद्युत पर निर्भरता से ग्रीनहाउस गैसों का उत्सर्जन बढ़ता है।</w:t>
+        <w:t>1. संरचना: इसमें कुल 22 सदस्य होते हैं (15 लोकसभा से और 7 राज्यसभा से), जिनका चुनाव आनुपातिक प्रतिनिधित्व प्रणाली द्वारा 1 वर्ष के लिए होता है। परंपरा के अनुसार इसका अध्यक्ष विपक्ष से होता है।</w:t>
         <w:br/>
-        <w:t>• तापीय द्वीप प्रभाव (Heat Island Effect): डेटा सेंटरों के आसपास के 10 किमी क्षेत्र में तापमान में 9°C तक की वृद्धि दर्ज की जा सकती है।</w:t>
+        <w:t>2. कार्य: यह भारत के नियंत्रक और महालेखा परीक्षक (CAG) की रिपोर्टों की जांच करती है और यह सुनिश्चित करती है कि संसद द्वारा स्वीकृत धन उसी मद में और कुशलतापूर्वक खर्च किया गया हो।</w:t>
         <w:br/>
-        <w:t>• भूजल स्रोतों एवं स्थानीय पारिस्थितिकी पर दबाव: चिली के सेरिलोस का उदाहरण दर्शाता है कि डेटा केंद्र स्थानीय अक्विफर को सुखाकर जल संकट उत्पन्न करते हैं।</w:t>
+        <w:t>3. सीमाएं: इसके सुझाव केवल सलाहकार प्रकृति के होते हैं और यह नीतिगत निर्णयों की जांच नहीं कर सकती।</w:t>
         <w:br/>
       </w:r>
     </w:p>
@@ -212,17 +190,17 @@
         <w:rPr>
           <w:b/>
         </w:rPr>
-        <w:t>प्रश्न [5 अंक - Paper 1]: हालिया आंकड़ों के आलोक में भारत के प्रत्यक्ष कर संग्रह में वृद्धि के प्रमुख कारणों और इसके महत्व को रेखांकित कीजिए।</w:t>
+        <w:t>प्रश्न [5 अंक - Paper 1]: मर्चेंट डिस्काउंट रेट (MDR) क्या है? यूपीआई (UPI) पर इसके प्रभाव की चर्चा कीजिए।</w:t>
         <w:br/>
       </w:r>
       <w:r>
         <w:t>उत्तर ढांचा (~50 शब्द):</w:t>
         <w:br/>
-        <w:t>• संग्रह आंकड़े: 17 सितंबर 2026 तक भारत का शुद्ध प्रत्यक्ष कर संग्रह 12.96% बढ़कर ₹12.12 लाख करोड़ पहुंचा; अग्रिम कर में 16.18% की वृद्धि दर्ज की गई।</w:t>
+        <w:t>मर्चेंट डिस्काउंट रेट (MDR) वह शुल्क है जो किसी व्यापारी से डिजिटल भुगतान (जैसे डेबिट/क्रेडिट कार्ड या यूपीआई) स्वीकार करने पर बैंक और भुगतान सेवा प्रदाताओं द्वारा लिया जाता है।</w:t>
         <w:br/>
-        <w:t>• वृद्धि के मुख्य कारण: (1) आर्थिक गतिविधियों एवं कॉर्पोरेट लाभप्रदता में तेजी, (2) फेसलेस आकलन एवं जीएसटी-आयकर डेटा एकीकरण से कर अनुपालन में सुधार, (3) शेयर बाजार में सक्रियता से एसटीटी (STT) संग्रह में 53% की भारी उछाल।</w:t>
+        <w:t>1. यूपीआई पर प्रभाव: वर्तमान में सरकार ने यूपीआई पर शून्य-MDR नीति लागू कर रखी है, जिससे उपभोक्ताओं और व्यापारियों के लिए यह पूरी तरह निःशुल्क है।</w:t>
         <w:br/>
-        <w:t>• राजकोषीय महत्व: इससे सरकार को राजकोषीय समेकन लक्ष्य (Fiscal Deficit Target) प्राप्त करने तथा बुनियादी ढांचे (Capex) व कल्याणकारी योजनाओं हेतु पर्याप्त पूंजी प्राप्त होती है।</w:t>
+        <w:t>2. वित्तीय प्रभाव: शून्य-MDR ने भारत में डिजिटल वित्तीय समावेशन को अभूतपूर्व गति दी है, परंतु फिनटेक कंपनियों और बैंकों के राजस्व मॉडल पर दबाव डाला है, जिसके लिए सरकार उन्हें सब्सिडी प्रदान करती है।</w:t>
         <w:br/>
       </w:r>
     </w:p>
@@ -236,41 +214,27 @@
         <w:rPr>
           <w:b/>
         </w:rPr>
-        <w:t>प्रश्न [10 अंक - Paper 1]: राजस्थान में जनजातीय चेतना एवं आंदोलनों के उद्भव के कारणों की विवेचना करते हुए गोविंद गिरी एवं मोतीलाल तेजावत के योगदान का विश्लेषणात्मक मूल्यांकन कीजिए।</w:t>
+        <w:t>प्रश्न [10 अंक - Paper 3]: अमेरिकी सीनेट द्वारा रूसी तेल आयातकों पर लगाए जाने वाले संभावित प्रतिबंधों का भारत की ऊर्जा सुरक्षा और रणनीतिक स्वायत्तता पर पड़ने वाले प्रभावों का आलोचनात्मक विश्लेषण कीजिए।</w:t>
         <w:br/>
       </w:r>
       <w:r>
-        <w:t>भूमिका: 19वीं और early 20वीं शताब्दी में राजस्थान के मेवाड़, वागड़ और भोमट क्षेत्रों में भील व गरासिया जनजातियों द्वारा सामंती शोषण, बेगार प्रथा तथा ब्रिटिश वनीय प्रतिबंधों के विरुद्ध व्यापक चेतना और आंदोलन प्रारंभ हुए।</w:t>
+        <w:t>भूमिका: हाल ही में अमेरिकी सीनेट ने एक विधेयक पारित किया है जो राष्ट्रपति को रूसी कच्चे तेल का आयात करने वाले शीर्ष पांच देशों पर 100% तक टैरिफ और प्रतिबंध लगाने की शक्ति देता है। भारत वर्तमान में अपनी कुल तेल आवश्यकताओं का लगभग 51% रूस से आयात करता है, जिससे यह मुद्दा भारत के लिए अत्यंत संवेदनशील हो गया है।</w:t>
         <w:br/>
       </w:r>
       <w:r>
-        <w:t>मुख्य भाग: 1. जनजातीय असंतोष के मुख्य कारण:</w:t>
+        <w:t>मुख्य भाग: भारत पर पड़ने वाले बहुआयामी प्रभाव:</w:t>
         <w:br/>
-        <w:t xml:space="preserve"> - ब्रिटिश सरकार द्वारा जंगलों में जनजातियों के पारंपरिक अधिकारों (जैसे महुआ शराब, लकड़ी कटाई) पर रोक।</w:t>
+        <w:t>1. ऊर्जा सुरक्षा पर खतरा: पश्चिम एशिया में भू-राजनीतिक तनाव (जैसे स्ट्रेट ऑफ हॉर्मुज और बाबल मंदब का अवरुद्ध होना) के कारण भारत के लिए रूस से रियायती दरों पर मिलने वाला तेल ऊर्जा सुरक्षा का मुख्य आधार है। प्रतिबंधों से आपूर्ति श्रृंखला बाधित हो सकती है।</w:t>
         <w:br/>
-        <w:t xml:space="preserve"> - जागीरदारों द्वारा भारी लगान, लाटा-कुंता प्रथा और जबरन बेगार।</w:t>
+        <w:t>2. राजकोषीय घाटा और मुद्रास्फीति: यदि भारत को महंगे अमेरिकी या अन्य वैकल्पिक तेल स्रोतों पर निर्भर होना पड़ा, तो भारत का आयात बिल बढ़ेगा, जिससे चालू खाता घाटा (CAD) और घरेलू मुद्रास्फीति (विशेषकर एलपीजी और ईंधन की कीमतों में) में वृद्धि होगी।</w:t>
         <w:br/>
-        <w:t xml:space="preserve"> - 'बोलाई' (सुरक्षा कर) और 'रखवाली' करों को समाप्त करना।</w:t>
+        <w:t>3. रणनीतिक स्वायत्तता की परीक्षा: यह स्थिति भारत की स्वतंत्र विदेश नीति के लिए एक बड़ी चुनौती है। भारत संयुक्त राष्ट्र सुरक्षा परिषद (UNSC) के प्रतिबंधों को तो मानता है, परंतु किसी देश के एकतरफा प्रतिबंधों को स्वीकार नहीं करता।</w:t>
         <w:br/>
-        <w:br/>
-        <w:t>2. संत गोविंद गिरी का योगदान:</w:t>
-        <w:br/>
-        <w:t xml:space="preserve"> - समाज सुधार एवं चेतना: 1883 में 'सम्प सभा' की स्थापना की। जनजातियों में मद्यपान निषेध, शिक्षा और आत्म-सम्मान का संचार किया।</w:t>
-        <w:br/>
-        <w:t xml:space="preserve"> - भगत आंदोलन: भीलों को अपने धार्मिक व नागरिक अधिकारों हेतु एकजुट किया। 17 नवंबर 1913 को मानगढ़ पहाड़ी पर हुए नरसंहार में 1500 से अधिक भील शहीद हुए (राजस्थान का जलियांवाला बाग)।</w:t>
-        <w:br/>
-        <w:br/>
-        <w:t>3. मोतीलाल तेजावत का योगदान:</w:t>
-        <w:br/>
-        <w:t xml:space="preserve"> - एकी आंदोलन (1921): मातृकुण्डिया से प्रारंभ कर आदिवासियों को एकसूत्र में बांधा। 'न हाकिम, न हुकुम' का नारा दिया।</w:t>
-        <w:br/>
-        <w:t xml:space="preserve"> - 'मेवाड़ पुकार': आदिवासियों की 21 सूत्री मांगों का दस्तावेज तैयार कर महाराणा के समक्ष रखा।</w:t>
-        <w:br/>
-        <w:t xml:space="preserve"> - नीमड़ा हत्याकांड (1922): सुरक्षा बलों की गोलीबारी के बावजूद तेजावत जी ने आंदोलन को अहिंसक और समर्पित बनाए रखा।</w:t>
+        <w:t>4. डॉलर बनाम स्थानीय मुद्रा व्यापार: रूस भारत को स्थानीय मुद्रा (रुपया-रूबल) और विलंबित भुगतान की सुविधा देता है। अमेरिकी प्रतिबंध इस वित्तीय तंत्र को बाधित करने का प्रयास हैं।</w:t>
         <w:br/>
       </w:r>
       <w:r>
-        <w:t>निष्कर्ष: गोविंद गिरी और मोतीलाल तेजावत के आंदोलनों ने न केवल जनजातियों को शोषण से मुक्ति दिलाने का मार्ग प्रशस्त किया, बल्कि राजस्थान के राष्ट्रीय स्वतंत्रता संग्राम में जनजातीय आबादी की सक्रिय भागीदारी सुनिश्चित की।</w:t>
+        <w:t>निष्कर्ष: भारत को अपनी ऊर्जा सुरक्षा बनाए रखने के लिए अमेरिका के साथ कूटनीतिक बातचीत तेज करनी होगी, साथ ही घरेलू स्तर पर रणनीतिक पेट्रोलियम भंडार (SPR) का विस्तार और ऊर्जा स्रोतों का विविधीकरण करना होगा।</w:t>
         <w:br/>
       </w:r>
     </w:p>
@@ -284,38 +248,68 @@
         <w:rPr>
           <w:b/>
         </w:rPr>
-        <w:t>प्रश्न [10 अंक - Paper 3]: मणिपुर में हालिया जातीय संघर्षों के जटिल स्वरूप का विश्लेषण कीजिए। क्षेत्र में स्थायी शांति स्थापना हेतु कौन से रणनीतिक उपाय आवश्यक हैं?</w:t>
+        <w:t>प्रश्न [10 अंक - Paper 3]: राष्ट्रीय शिक्षा नीति (NEP) 2020 के तहत 'त्रि-भाषा सूत्र' (Three-Language Formula) के क्रियान्वयन से जुड़े विवादों और इसके व्यावहारिक समाधानों की समीक्षा कीजिए।</w:t>
         <w:br/>
       </w:r>
       <w:r>
-        <w:t>भूमिका: मणिपुर में मैतेई और कुकी-जो समुदायों के बीच जारी हिंसक संघर्ष के साथ-साथ अब कुकी-जो और नागा समुदायों के मध्य भूमि व प्रादेशिक सीमाओं को लेकर उभरे नए तनावों ने राज्य की सुरक्षा स्थिति को अत्यंत संवेदनशील बना दिया है।</w:t>
+        <w:t>भूमिका: त्रि-भाषा सूत्र का विचार सर्वप्रथम 1968 की शिक्षा नीति में कोठारी आयोग की सिफारिशों पर आया था। राष्ट्रीय शिक्षा नीति 2020 भी इसे आगे बढ़ाती है, परंतु इसके क्रियान्वयन को लेकर हाल ही में सर्वोच्च न्यायालय और विभिन्न राज्यों के बीच कानूनी व कूटनीतिक बहस छिड़ गई है।</w:t>
         <w:br/>
       </w:r>
       <w:r>
-        <w:t>मुख्य भाग: 1. संघर्ष के बहुआयामी कारक:</w:t>
+        <w:t>मुख्य भाग: मुख्य विवाद और चुनौतियां:</w:t>
         <w:br/>
-        <w:t xml:space="preserve"> - भूमि एवं प्रादेशिक अधिकार: घाटी क्षेत्र (मैतेई बहुल, 10% भूभाग) एवं पहाड़ी क्षेत्र (कुकी व नागा बहुल, 90% भूभाग) के बीच भूमि स्वामित्व और एसटी (ST) दर्जे का विवाद।</w:t>
+        <w:t>1. हिंदी थोपने का आरोप: दक्षिणी राज्यों (विशेषकर तमिलनाडु) का आरोप है कि त्रि-भाषा सूत्र के माध्यम से केंद्र सरकार अप्रत्यक्ष रूप से गैर-हिंदी भाषी राज्यों पर हिंदी थोपने का प्रयास कर रही है।</w:t>
         <w:br/>
-        <w:t xml:space="preserve"> - जनसांख्यिकीय असंतुलन व अवैध प्रवास: म्यांमार में तख्तापलट के बाद कुकी-चिन शरणार्थियों का आगमन और अफीम की खेती (Poppy Cultivation) पर सरकारी कार्रवाई।</w:t>
+        <w:t>2. अंग्रेजी की स्थिति: एनईपी 2020 के तहत तीन में से दो भाषाएं भारतीय (नेटिव) होनी चाहिए और एक विदेशी भाषा। यदि अंग्रेजी को विदेशी भाषा माना जाता है, तो छात्र अन्य वैश्विक भाषाएं (जैसे फ्रेंच, जर्मन) सीखने से वंचित रह जाएंगे क्योंकि वे अंग्रेजी को ही चुनेंगे। अंग्रेजी को भारतीय नेटिव भाषा घोषित करने की मांग उठ रही है।</w:t>
         <w:br/>
-        <w:t xml:space="preserve"> - उग्रवादी गुटों का पुनरुद्धार: निलंबन समझौता (SoO) के उल्लंघन तथा सीमा पार से स्वचालित हथियारों की तस्करी।</w:t>
+        <w:t>3. बुनियादी ढांचे और शिक्षकों की कमी: बहुभाषी शिक्षा के लिए योग्य शिक्षकों और पाठ्यपुस्तकों का भारी अभाव है।</w:t>
         <w:br/>
-        <w:t xml:space="preserve"> - संस्थागत अविश्वास: राज्य पुलिस और प्रशासन पर निष्पक्ष न होने के आरोप, जिससे समुदायों के बीच संवाद पूरी तरह बंद हो गया है।</w:t>
-        <w:br/>
-        <w:br/>
-        <w:t>2. आवश्यक रणनीतिक उपाय (Way Forward):</w:t>
-        <w:br/>
-        <w:t xml:space="preserve"> - निष्पक्ष सुरक्षा व्यवस्था: असम राइफल्स और केंद्रीय बलों के माध्यम से बिना किसी समुदाय के प्रति पूर्वाग्रह के बफर जोन की सख्त निगरानी।</w:t>
-        <w:br/>
-        <w:t xml:space="preserve"> - त्रिस्तरीय शांति वार्ता: केंद्र सरकार द्वारा मैतेई, कुकी और नागा नागरिक समाज संगठनों (CSOs) को शामिल कर एक अधिकार प्राप्त शांति आयोग का गठन।</w:t>
-        <w:br/>
-        <w:t xml:space="preserve"> - भारत-म्यांमार सीमा प्रबंधन: मुक्त आवागमन व्यवस्था (FMR) का नियमन और सीमा पर फेंसिंग का कार्य तेजी से पूरा करना।</w:t>
-        <w:br/>
-        <w:t xml:space="preserve"> - पुनर्वास एवं मानवीय सहायता: विस्थापित नागरिकों के लिए सुरक्षित पुनर्वास योजना और पारदर्शी क्षतिपूर्ति प्रदान करना।</w:t>
+        <w:t>4. मध्य-सत्र क्रियान्वयन: सर्वोच्च न्यायालय ने चिंता व्यक्त की है कि शैक्षणिक सत्र के बीच में इसे लागू करने से छात्रों पर मानसिक दबाव बढ़ेगा, अतः इसे 2027 के नए सत्र से लागू किया जाना चाहिए।</w:t>
         <w:br/>
       </w:r>
       <w:r>
-        <w:t>निष्कर्ष: मणिपुर में स्थायी शांति केवल बल प्रयोग से संभव नहीं है; इसके लिए सभी जनजातीय और गैर-जनजातीय आकांक्षाओं का सम्मान करते हुए समावेशी राजनीतिक प्रक्रिया और निष्पक्ष शासन संरचना की बहाली अनिवार्य है।</w:t>
+        <w:t>निष्कर्ष: समाधान के रूप में राज्यों को भाषा चयन की पूर्ण स्वायत्तता दी जानी चाहिए, अंग्रेजी को व्यावहारिक रूप से नेटिव श्रेणी में शामिल करने पर विचार हो, और भाषाई बुनियादी ढांचे के विकास के बाद ही इसे चरणबद्ध तरीके से लागू किया जाए।</w:t>
+        <w:br/>
+      </w:r>
+    </w:p>
+    <w:p>
+      <w:r>
+        <w:t>-----------------------------------</w:t>
+      </w:r>
+    </w:p>
+    <w:p>
+      <w:r>
+        <w:rPr>
+          <w:b/>
+        </w:rPr>
+        <w:t>प्रश्न [10 अंक - Paper 1]: चीन द्वारा ब्रह्मपुत्र नदी पर बनाए जा रहे 'मिडॉग बांध' के रणनीतिक खतरों का विश्लेषण कीजिए तथा इसके प्रत्युत्तर में भारत की 'सियांग बहुउद्देशीय परियोजना' के महत्व को रेखांकित कीजिए।</w:t>
+        <w:br/>
+      </w:r>
+      <w:r>
+        <w:t>भूमिका: चीन तिब्बत में यारलंग जंगपो (ब्रह्मपुत्र) नदी पर विश्व का सबसे बड़ा जलविद्युत बांध 'मिडॉग' (Medog Dam) बना रहा है। यह परियोजना भारत के उत्तर-पूर्वी राज्यों के लिए गंभीर रणनीतिक, पर्यावरणीय और आर्थिक चिंताएं उत्पन्न करती है।</w:t>
+        <w:br/>
+      </w:r>
+      <w:r>
+        <w:t>मुख्य भाग: चीन के मिडॉग बांध से उत्पन्न रणनीतिक खतरे:</w:t>
+        <w:br/>
+        <w:t>1. जल प्रवाह का नियंत्रण: चीन निचले रिपेरियन राज्य (भारत और बांग्लादेश) की ओर जल प्रवाह को नियंत्रित कर सकता है, जिससे सूखे या अचानक कृत्रिम बाढ़ (Flash Floods) का खतरा पैदा हो सकता है।</w:t>
+        <w:br/>
+        <w:t>2. डेटा साझाकरण का अभाव: दोनों देशों के बीच कोई औपचारिक जल-साझाकरण संधि नहीं है, जिससे चीन की गतिविधियों की पारदर्शी जानकारी नहीं मिल पाती।</w:t>
+        <w:br/>
+        <w:t>3. पारिस्थितिकीय असंतुलन: यह क्षेत्र अत्यधिक भूकंप-संवेदनशील (Seismic Zone V) है। इतने बड़े जलाशय से भूकंपीय गतिविधियां बढ़ सकती हैं और गाद (Sedimentation) का प्रवाह रुकने से उत्तर-पूर्व की भूमि की उर्वरता प्रभावित होगी।</w:t>
+        <w:br/>
+        <w:br/>
+        <w:t>भारत की 'सियांग बहुउद्देशीय परियोजना' का महत्व:</w:t>
+        <w:br/>
+        <w:t>1. बाढ़ नियंत्रण और जल भंडारण: अरुणाचल प्रदेश में सियांग नदी पर प्रस्तावित यह 11,000 मेगावाट की परियोजना चीन द्वारा अचानक छोड़े गए पानी को स्टोर करने के लिए एक बफर (Buffer) का कार्य करेगी।</w:t>
+        <w:br/>
+        <w:t>2. रणनीतिक जवाबी उपाय (Counter-measure): यह परियोजना अंतरराष्ट्रीय मंचों पर भारत के 'लोअर रिपेरियन राइट्स' (उपयोगकर्ता अधिकार) को मजबूत करेगी।</w:t>
+        <w:br/>
+        <w:t>3. स्थानीय चिंताएं: हालांकि, इस बांध के निर्माण से स्थानीय जनजातियों के विस्थापन, पर्यावरण विनाश और भूकंपीय खतरों को लेकर स्थानीय स्तर पर कड़ा विरोध हो रहा है।</w:t>
+        <w:br/>
+      </w:r>
+      <w:r>
+        <w:t>निष्कर्ष: भारत को स्थानीय समुदायों को विश्वास में लेकर, उचित पुनर्वास और पर्यावरणीय प्रभाव आकलन (EIA) के साथ इस परियोजना को रणनीतिक सुरक्षा के रूप में आगे बढ़ाना चाहिए।</w:t>
         <w:br/>
       </w:r>
     </w:p>
@@ -337,11 +331,11 @@
         <w:rPr>
           <w:b/>
         </w:rPr>
-        <w:t>विषय: डेटा सेंटर अवसंरचना बनाम पर्यावरण सुरक्षा (पर्यावरण एवं अर्थव्यवस्था संघर्ष)</w:t>
+        <w:t>विषय: अमेरिकी प्रतिबंध और भारत पर दबाव (US Sanctions &amp; Pressure on India)</w:t>
         <w:br/>
       </w:r>
       <w:r>
-        <w:t>शिक्षक व्याख्यान एवं ट्रिक्स: मुख्य विश्लेषक के अनुसार, एआई (AI) और डिजिटल इंफ्रास्ट्रक्चर की अंधी दौड़ में 'डेटा सेंटर्स' नए हरित संकट के रूप में उभर रहे हैं। शिक्षक ने उदाहरण दिया कि कैसे एक 1 GW का डेटा सेंटर लाखों घरों की बिजली और भारी मात्रा में भूजल का उपयोग करता है। मुख्य अवधारणा यह है कि भारत को डिजिटल अवसंरचना का हब बनाते समय 'पर्यावरणीय प्रभाव आकलन' (EIA 2006) के नियमों में ढील नहीं देनी चाहिए, जैसा कि आंध्र प्रदेश में गूगल को 'डीम्ड डिस्कोम' का दर्जा देकर किया गया। परीक्षा में जल-ऊर्जा-खाद्य नेक्सस (Water-Energy-Food Nexus) से जोड़कर उत्तर लिखा जाना चाहिए।</w:t>
+        <w:t>शिक्षक व्याख्यान एवं ट्रिक्स: प्रशांत सर (UPSC Wallah) ने समझाया कि अमेरिकी सीनेट द्वारा पारित नया कानून सीधे तौर पर उन शीर्ष 5 देशों को लक्षित करता है जो रूस से तेल आयात कर रहे हैं। डोनाल्ड ट्रंप ने भारत पर 'ट्रेड असंतुलन' और 'अवैध दवाओं के उत्पादन' का आरोप लगाकर दबाव बनाने की रणनीति अपनाई है। अमेरिका चाहता है कि भारत रूस से तेल खरीदना बंद कर अमेरिका से खरीदे, भले ही अमेरिकी तेल महंगा हो और उसके भुगतान नियम कड़े हों।</w:t>
         <w:br/>
       </w:r>
       <w:r>
@@ -349,19 +343,19 @@
         <w:br/>
       </w:r>
       <w:r>
-        <w:t xml:space="preserve">  • डेटा सेंटरों की प्रत्यक्ष एवं अप्रत्यक्ष जल/ऊर्जा खपत पर सख्त विनियामक मानक आवश्यक हैं।</w:t>
+        <w:t xml:space="preserve">  • भारत अपनी ऊर्जा सुरक्षा के लिए रूस के रियायती तेल और रुपया-रूबल भुगतान प्रणाली पर अत्यधिक निर्भर है।</w:t>
         <w:br/>
       </w:r>
       <w:r>
-        <w:t xml:space="preserve">  • चिली के MOSACAT जन-आंदोलन का उदाहरण केस स्टडी के रूप में Mains में प्रस्तुत किया जा सकता है।</w:t>
+        <w:t xml:space="preserve">  • अमेरिका इस 'परस्पर निर्भरता' (Interdependence) को भारत के खिलाफ एक हथियार (Weaponization of Trade) के रूप में इस्तेमाल कर रहा है।</w:t>
         <w:br/>
       </w:r>
       <w:r>
-        <w:t xml:space="preserve">  • एआई विकास में स्वदेशी/पारंपरिक पर्यावरण संरक्षण सिद्धांतों को अपनाना अनिवार्य है।</w:t>
+        <w:t xml:space="preserve">  • चीन की तरह भारत सीधे तौर पर अमेरिकी प्रतिबंधों का कड़ा विरोध नहीं कर सकता क्योंकि भारत की तकनीकी और रणनीतिक निर्भरता अमेरिका पर अधिक है।</w:t>
         <w:br/>
       </w:r>
       <w:r>
-        <w:t>💡 परीक्षा टिप: 💡 Mains Framing Strategy: RAS Paper 3 (पर्यावरण) एवं UPSC GS3 में 'एआई एवं डिजिटल क्रांति के अदृश्य पर्यावरणीय लागत' पर 10-अंक का प्रश्न पूछा जा सकता है। उत्तर में प्रत्यक्ष जल खपत (Cooling) + अप्रत्यक्ष जल खपत (Thermal Power) दोनों आयाम लिखें।</w:t>
+        <w:t>💡 परीक्षा टिप: मुख्य परीक्षा में 'रणनीतिक स्वायत्तता' (Strategic Autonomy) पर प्रश्न आने पर इस प्रतिबंध मुद्दे को 'आर्थिक कूटनीति' और 'ऊर्जा विविधीकरण' के उदाहरण के रूप में लिखें। उत्तर में 'वॉर रूम' (बहु-क्षेत्रीय समन्वय समिति) के गठन का सुझाव दें।</w:t>
         <w:br/>
       </w:r>
     </w:p>
@@ -375,11 +369,11 @@
         <w:rPr>
           <w:b/>
         </w:rPr>
-        <w:t>विषय: प्रत्यक्ष कर संग्रह में 13% वृद्धि एवं भारत का राजकोषीय समेकन (Fiscal Consolidation)</w:t>
+        <w:t>विषय: सियांग नदी बांध परियोजना और चीनी चुनौती (Siang River Dam &amp; Chinese Challenge)</w:t>
         <w:br/>
       </w:r>
       <w:r>
-        <w:t>शिक्षक व्याख्यान एवं ट्रिक्स: कोचिंग फैकल्टी ने 17 सितंबर तक के प्रत्यक्ष कर आंकड़ों (₹12.12 लाख करोड़, +12.96%) का विश्लेषण करते हुए बताया कि अग्रिम कर (Advance Tax) में 16.18% की वृद्धि और कॉर्पोरेट टैक्स में 19.5% की वृद्धि यह साबित करती है कि भारतीय अर्थव्यवस्था में औपचारिकीकरण (Formalisation) और अनुपालन (Tax Compliance) सुधरा है। शिक्षक ने समझाया कि एसटीटी (Securities Transaction Tax) में 53% की उछाल शेयर बाजार में खुदरा निवेशकों की बढ़ती भागीदारी को दर्शाती है।</w:t>
+        <w:t>शिक्षक व्याख्यान एवं ट्रिक्स: शिक्षक ने मानचित्र के माध्यम से समझाया कि तिब्बत से निकलने वाली यारलंग जंगपो नदी भारत में ब्रह्मपुत्र (अरुणाचल में सियांग) के रूप में प्रवेश करती है। चीन इस पर 'मिडॉग' नामक दुनिया का सबसे बड़ा बांध बना रहा है। इसके प्रत्युत्तर में भारत सियांग नदी पर एक विशाल जल भंडारण बांध (Siang Upper Multipurpose Project) बना रहा है, जो बाढ़ नियंत्रण और जल सुरक्षा सुनिश्चित करेगा।</w:t>
         <w:br/>
       </w:r>
       <w:r>
@@ -387,19 +381,19 @@
         <w:br/>
       </w:r>
       <w:r>
-        <w:t xml:space="preserve">  • अग्रिम कर भुगतान (Advance Tax) अर्थव्यवस्था की आगामी तिमाहियों में मजबूत व्यावसायिक गतिविधियों का सूचक है।</w:t>
+        <w:t xml:space="preserve">  • चीन का मिडॉग बांध निचले रिपेरियन राज्यों (भारत-बांग्लादेश) के जल प्रवाह को बाधित कर सकता है।</w:t>
         <w:br/>
       </w:r>
       <w:r>
-        <w:t xml:space="preserve">  • कर-जीडीपी अनुपात (Tax-to-GDP Ratio) में सुधार से सरकार को इंफ्रास्ट्रक्चर (Capex) पर खर्च बढ़ाने की शक्ति मिलती है।</w:t>
+        <w:t xml:space="preserve">  • भारत का सियांग बांध केवल बिजली उत्पादन (11,000 MW) के लिए नहीं, बल्कि चीन द्वारा छोड़े गए पानी को रोकने (Flood Control) के लिए एक रणनीतिक जलाशय है।</w:t>
         <w:br/>
       </w:r>
       <w:r>
-        <w:t xml:space="preserve">  • रिफंड में 29% वृद्धि आयकर विभाग की स्वचालित एवं पारदर्शी प्रक्रिया (Faceless Assessment) का परिणाम है।</w:t>
+        <w:t xml:space="preserve">  • स्थानीय स्तर पर इस बांध का विरोध विस्थापन और भूकंपीय संवेदनशीलता (Seismic Zone) के कारण हो रहा है।</w:t>
         <w:br/>
       </w:r>
       <w:r>
-        <w:t>💡 परीक्षा टिप: 💡 Exam Tip: RAS Paper 1 (अर्थशास्त्र) में राजकोषीय घाटे और कर राजस्व स्रोतों पर 5-अंक का प्रश्न आ सकता है। कॉर्पोरेट टैक्स बनाम पर्सनल इनकम टैक्स के रुझान को डेटा के साथ कोट करें।</w:t>
+        <w:t>💡 परीक्षा टिप: प्रारंभिक परीक्षा के लिए यारलंग जंगपो, सियांग, दिबांग, लोहित नदियों के प्रवाह क्रम और उनकी सहायक नदियों की मैपिंग अच्छे से तैयार करें। मुख्य परीक्षा में जल-कूटनीति (Hydro-diplomacy) के तहत इसे शामिल करें।</w:t>
         <w:br/>
       </w:r>
     </w:p>
@@ -413,11 +407,11 @@
         <w:rPr>
           <w:b/>
         </w:rPr>
-        <w:t>विषय: यूपीआई एमडीआर (MDR) शुल्क विवाद एवं फिनटेक इकोसिस्टम का भविष्य</w:t>
+        <w:t>विषय: त्रि-भाषा सूत्र और एनईपी 2020 (Three-Language Formula &amp; NEP 2020)</w:t>
         <w:br/>
       </w:r>
       <w:r>
-        <w:t>शिक्षक व्याख्यान एवं ट्रिक्स: व्याख्यान में शिक्षक ने 'जीरो एमडीआर' नीति की उपलब्धियों और इसके आर्थिक दुष्प्रभावों की तुलना की। शिक्षक ने समझाया कि MDR (Merchant Discount Rate) वह शुल्क है जो व्यापारी बैंक को भुगतान प्रसंस्करण हेतु देता है। यूपीआई को मुफ्त रखने से जन-साधारण में स्वीकार्यता बढ़ी, किंतु फिनटेक कंपनियों (जैसे PhonePe, GPay) का बिजनेस मॉडल संकट में आ गया है, जिससे वे नए नवाचार और साइबर सुरक्षा पर निवेश नहीं कर पा रहे हैं।</w:t>
+        <w:t>शिक्षक व्याख्यान एवं ट्रिक्स: प्रशांत सर ने कोठारी आयोग (1968) से लेकर एनईपी 2020 तक त्रि-भाषा सूत्र के विकास को स्पष्ट किया। एनईपी 2020 के तहत छात्रों को तीन भाषाएं सीखनी होंगी, जिनमें से दो भारतीय (नेटिव) और एक विदेशी भाषा होगी। सर्वोच्च न्यायालय ने इसे शैक्षणिक सत्र के बीच में लागू करने के बजाय 2027 से चरणबद्ध तरीके से लागू करने का सुझाव दिया है ताकि छात्र और शिक्षक मानसिक रूप से तैयार हो सकें।</w:t>
         <w:br/>
       </w:r>
       <w:r>
@@ -425,19 +419,19 @@
         <w:br/>
       </w:r>
       <w:r>
-        <w:t xml:space="preserve">  • जीरो-एमडीआर ने भारत को विश्व का सबसे बड़ा डिजिटल भुगतान नेटवर्क बनाया।</w:t>
+        <w:t xml:space="preserve">  • एनईपी 2020 में हिंदी को अनिवार्य नहीं किया गया है, बल्कि दो नेटिव भाषाओं के चयन की स्वतंत्रता दी गई है।</w:t>
         <w:br/>
       </w:r>
       <w:r>
-        <w:t xml:space="preserve">  • भुगतान अवसंरचना को टिकाऊ (Sustainable) बनाने के लिए क्रास-सब्सिडी या श्रेणीबद्ध एमडीआर की आवश्यकता है।</w:t>
+        <w:t xml:space="preserve">  • अंग्रेजी को 'विदेशी भाषा' की श्रेणी में रखने से छात्रों के पास अन्य वैश्विक भाषाएं सीखने के विकल्प सीमित हो जाते हैं।</w:t>
         <w:br/>
       </w:r>
       <w:r>
-        <w:t xml:space="preserve">  • आरबीआई का यूपीआई पर क्रेडिट लाइन जोड़ना एक वैकल्पिक राजस्व मॉडल प्रस्तुत करता है।</w:t>
+        <w:t xml:space="preserve">  • भाषाई बुनियादी ढांचे और योग्य शिक्षकों की उपलब्धता इस नीति की सफलता की पूर्व शर्त है।</w:t>
         <w:br/>
       </w:r>
       <w:r>
-        <w:t>💡 परीक्षा टिप: 💡 Mains Tip: GS3 / RAS Paper 1 हेतु वित्तीय समावेशन में डिजिटल भुगतान की भूमिका और फिनटेक क्षेत्र की वित्तीय व्यवहार्यता पर संतुलनकारी उत्तर तैयार करें।</w:t>
+        <w:t>💡 परीक्षा टिप: जीएस पेपर 2 (शिक्षा नीति) में त्रि-भाषा सूत्र पर उत्तर लिखते समय 'सहकारी संघवाद' (Cooperative Federalism) और 'भाषाई विविधता का संरक्षण' (अनुच्छेद 29 और 30) के संवैधानिक प्रावधानों का उल्लेख अवश्य करें।</w:t>
         <w:br/>
       </w:r>
     </w:p>
@@ -451,11 +445,11 @@
         <w:rPr>
           <w:b/>
         </w:rPr>
-        <w:t>विषय: शंघाई सहयोग संगठन (SCO) में भारत का व्यापार कूटनीतिक रुख</w:t>
+        <w:t>विषय: लोक लेखा समिति (Public Accounts Committee - PAC)</w:t>
         <w:br/>
       </w:r>
       <w:r>
-        <w:t>शिक्षक व्याख्यान एवं ट्रिक्स: तजाकिस्तान में SCO आर्थिक एवं विदेश व्यापार मंत्रियों की 25वीं बैठक के संदर्भ में शिक्षक ने बताया कि भारत किस प्रकार SCO मंच का उपयोग मध्य एशिया (Central Asia) से जुड़ाव और डिजिटल पब्लिक इंफ्रास्ट्रक्चर (DPI) के निर्यात हेतु कर रहा है। यद्यपि चीन की बीआरआई (BRI) नीति पर भारत की आपत्तियां कायम हैं, फिर भी भारत गैर-पश्चिम मंचों पर बहुध्रुवीय वैश्विक व्यवस्था के समर्थन हेतु सक्रिय है।</w:t>
+        <w:t>शिक्षक व्याख्यान एवं ट्रिक्स: शिक्षक ने पीएसी की ऐतिहासिक पृष्ठभूमि (1921 मोंटेग्यू-चेम्सफोर्ड सुधार) और इसकी कार्यप्रणाली पर विस्तृत प्रकाश डाला। पीएसी संसद का एक ऐसा उपकरण है जो सरकारी खर्चों की कड़ाई से निगरानी करता है। यह कैग (CAG) की रिपोर्टों का ऑडिट करती है। कैग को पीएसी का 'मित्र, दार्शनिक और मार्गदर्शक' कहा जाता है।</w:t>
         <w:br/>
       </w:r>
       <w:r>
@@ -463,19 +457,19 @@
         <w:br/>
       </w:r>
       <w:r>
-        <w:t xml:space="preserve">  • मध्य एशियाई गणराज्यों (CARs) के साथ व्यापार बढ़ाने हेतु चाबहार बंदरगाह और INSTC की केंद्रीय भूमिका।</w:t>
+        <w:t xml:space="preserve">  • पीएसी में कुल 22 सदस्य होते हैं (15 लोकसभा, 7 राज्यसभा) और कोई भी मंत्री इसका सदस्य नहीं बन सकता।</w:t>
         <w:br/>
       </w:r>
       <w:r>
-        <w:t xml:space="preserve">  • SCO के भीतर डिजिटल अर्थव्यवस्था और एमएसएमई सहयोग में भारत का नेतृत्व।</w:t>
+        <w:t xml:space="preserve">  • 1967 से स्थापित परंपरा के अनुसार इसका अध्यक्ष हमेशा मुख्य विपक्षी दल से चुना जाता है।</w:t>
         <w:br/>
       </w:r>
       <w:r>
-        <w:t xml:space="preserve">  • चीन-केंद्रित व्यापार नीतियों का मुकाबला करने के लिए भारत की सतर्क कूटनीति।</w:t>
+        <w:t xml:space="preserve">  • इसके निर्णय केवल सिफारिशी होते हैं, यह सरकार पर बाध्यकारी नहीं होते और यह केवल 'पोस्टमार्टम' (खर्च होने के बाद) जांच कर सकती है।</w:t>
         <w:br/>
       </w:r>
       <w:r>
-        <w:t>💡 परीक्षा टिप: 💡 Exam Tip: UPSC GS2 / RAS Paper 3 में SCO की प्रासंगिकता पर प्रश्न आने पर भारत के व्यापारिक हित और सुरक्षा चिंताओं का पृथक-पृथक विश्लेषण करें।</w:t>
+        <w:t>💡 परीक्षा टिप: आरपीएससी और यूपीएससी प्रारंभिक परीक्षा में पीएसी, प्राकलन समिति (Estimates Committee) और सार्वजनिक उपक्रमों की समिति के बीच तुलनात्मक अंतर (सदस्य संख्या, प्रतिनिधित्व) पर सीधे प्रश्न पूछे जाते हैं, इसे सारणीबद्ध रूप में याद करें।</w:t>
         <w:br/>
       </w:r>
     </w:p>
@@ -497,23 +491,23 @@
         <w:rPr>
           <w:b/>
         </w:rPr>
-        <w:t>शीर्षक: मेजर नव्या शेखावत: राष्ट्रपति की प्रथम महिला थल सेना एडीसी (ADC) [राजस्थान पत्रिका / सूचना व जनसंपर्क विभाग (DIPR)]</w:t>
+        <w:t>शीर्षक: मेजर नव्या शेखावत बनीं राष्ट्रपति की पहली महिला आर्मी एडीसी [राजस्थान पत्रिका / जनसंपर्क विभाग (DIPR)]</w:t>
         <w:br/>
       </w:r>
       <w:r>
-        <w:t xml:space="preserve">  • राजस्थान की मूल निवासी मेजर नव्या शेखावत को भारत के राष्ट्रपति की पहली महिला थल सेना एडीसी (Aide-de-Camp) नियुक्त किया गया है।</w:t>
+        <w:t xml:space="preserve">  • राजस्थान की मूल निवासी मेजर नव्या शेखावत को भारत की राष्ट्रपति द्रौपदी मुर्मू का सेना एडीसी (Aide-de-Camp) नियुक्त किया गया है।</w:t>
         <w:br/>
       </w:r>
       <w:r>
-        <w:t xml:space="preserve">  • यह भारतीय सशस्त्र बलों में लैंगिक समावेशिता और महिला सशक्तिकरण की दिशा में ऐतिहासिक उपलब्धि है।</w:t>
+        <w:t xml:space="preserve">  • वह इस प्रतिष्ठित पद पर आसीन होने वाली भारतीय सैन्य इतिहास की पहली महिला सैन्य अधिकारी बन गई हैं।</w:t>
         <w:br/>
       </w:r>
       <w:r>
-        <w:t xml:space="preserve">  • मेजर नव्या ने राष्ट्रपति भवन में औपचारिक सैन्य प्रोटोकॉल व सुरक्षा प्रबंधन का दायित्व संभाला है।</w:t>
+        <w:t xml:space="preserve">  • यह उपलब्धि राजस्थान में महिला सशक्तिकरण और सेना में महिलाओं की बढ़ती भागीदारी का एक उत्कृष्ट उदाहरण है।</w:t>
         <w:br/>
       </w:r>
       <w:r>
-        <w:t>RPSC महत्व: RAS Pre / Mains Paper 3 (महिला सशक्तिकरण एवं राजस्थान के व्यक्तित्व)</w:t>
+        <w:t>RPSC महत्व: RAS प्रारंभिक परीक्षा (व्यक्तित्व) और मुख्य परीक्षा पेपर 3 (महिला सशक्तिकरण) हेतु अत्यंत महत्वपूर्ण।</w:t>
         <w:br/>
       </w:r>
     </w:p>
@@ -527,23 +521,23 @@
         <w:rPr>
           <w:b/>
         </w:rPr>
-        <w:t>शीर्षक: पोखरण में वायुसेना का 'रोटर क्लैप-III' अभ्यास [दैनिक भास्कर / रक्षा मंत्रालय विज्ञप्ति]</w:t>
+        <w:t>शीर्षक: पोखरण में वायुसेना का युद्धाभ्यास 'रोटर क्लैप-III' [दैनिक भास्कर / रक्षा मंत्रालय विज्ञप्ति]</w:t>
         <w:br/>
       </w:r>
       <w:r>
-        <w:t xml:space="preserve">  • जैसलमेर की पोखरण फील्ड फायरिंग रेंज में 26 जुलाई से 1 अगस्त तक भारतीय वायुसेना द्वारा विशेष अभ्यास आयोजित।</w:t>
+        <w:t xml:space="preserve">  • जैसलमेर जिले की पोखरण फील्ड फायरिंग रेंज में भारतीय वायुसेना द्वारा 'रोटर क्लैप-III' युद्धाभ्यास का सफल आयोजन किया गया।</w:t>
         <w:br/>
       </w:r>
       <w:r>
-        <w:t xml:space="preserve">  • कम ऊंचाई पर उड़ने वाले दुश्मन के ड्रोन और मानवरहित हवाई वाहनों (UAVs) को नष्ट करने की मारक क्षमता का परीक्षण।</w:t>
+        <w:t xml:space="preserve">  • इस अभ्यास का मुख्य फोकस आधुनिक युद्धों में उभरते खतरे 'लो-एल्टीट्यूड ड्रोन' और मानव रहित विमानों (UAVs) को हवा में ही नष्ट करना था।</w:t>
         <w:br/>
       </w:r>
       <w:r>
-        <w:t xml:space="preserve">  • सीमावर्ती क्षेत्र में काउंटर-ड्रोन तकनीक और वायु रक्षा प्रणालियों के समन्वय पर ध्यान केंद्रित।</w:t>
+        <w:t xml:space="preserve">  • इसमें स्वदेशी वायु रक्षा प्रणालियों और रडार तकनीकों का वास्तविक परिस्थितियों में परीक्षण किया गया।</w:t>
         <w:br/>
       </w:r>
       <w:r>
-        <w:t>RPSC महत्व: RAS Pre (समसामयिकी) व RAS Mains Paper 3 (सुरक्षा परिदृश्य)</w:t>
+        <w:t>RPSC महत्व: RAS प्रारंभिक परीक्षा (विज्ञान एवं प्रौद्योगिकी/रक्षा) और मुख्य परीक्षा पेपर 2 हेतु प्रासंगिक।</w:t>
         <w:br/>
       </w:r>
     </w:p>
@@ -557,23 +551,23 @@
         <w:rPr>
           <w:b/>
         </w:rPr>
-        <w:t>शीर्षक: किशाऊ बहुउद्देशीय परियोजना: राजस्थान के जल अधिकारों की समीक्षा [जल संसाधन विभाग / सुजस बुलेटिन]</w:t>
+        <w:t>शीर्षक: लंपी त्वचा रोग (Lumpy Skin Disease) पर राज्य सरकार के सख्त निर्देश [राजस्थान सुजस बुलेटिन (13 सितंबर 2026)]</w:t>
         <w:br/>
       </w:r>
       <w:r>
-        <w:t xml:space="preserve">  • टोंस नदी पर निर्मित होने वाली 660 मेगावाट क्षमता की राष्ट्रीय किशाऊ बांध परियोजना।</w:t>
+        <w:t xml:space="preserve">  • पशुपालन विभाग ने राज्य में लंपी बीमारी के संभावित प्रसार को रोकने के लिए जिला स्तरीय नियंत्रण कक्ष स्थापित करने के निर्देश दिए हैं।</w:t>
         <w:br/>
       </w:r>
       <w:r>
-        <w:t xml:space="preserve">  • परियोजना से राजस्थान को सिंचाई व पेयजल हेतु आवंटित जल का हिस्सा प्राप्त होगा।</w:t>
+        <w:t xml:space="preserve">  • पशुपालकों को निःशुल्क टीकाकरण, औषधियां और आपातकालीन चिकित्सा सहायता उपलब्ध कराई जा रही है।</w:t>
         <w:br/>
       </w:r>
       <w:r>
-        <w:t xml:space="preserve">  • अंतर-राज्यीय जल विवादों के समाधान और उत्तरी-पश्चिमी राजस्थान के सूखाग्रस्त क्षेत्रों हेतु अत्यंत महत्वपूर्ण।</w:t>
+        <w:t xml:space="preserve">  • पशु मेलों और अंतर-राज्यीय पशु परिवहन पर अस्थायी प्रतिबंध लगाने के निर्देश दिए गए हैं ताकि संक्रमण को फैलने से रोका जा सके।</w:t>
         <w:br/>
       </w:r>
       <w:r>
-        <w:t>RPSC महत्व: RAS Pre / Mains Paper 1 (राजस्थान भूगोल व सिंचाई परियोजनाएं)</w:t>
+        <w:t>RPSC महत्व: RAS मुख्य परीक्षा पेपर 1 (कृषि एवं पशुपालन) और राज्य की लोक स्वास्थ्य नीतियों के अंतर्गत महत्वपूर्ण।</w:t>
         <w:br/>
       </w:r>
     </w:p>
@@ -587,23 +581,23 @@
         <w:rPr>
           <w:b/>
         </w:rPr>
-        <w:t>शीर्षक: पशुपालकों हेतु लंपी (Lumpy Skin Disease) की रोकथाम हेतु राज्य सरकार के सख्त निर्देश [पशुपालन विभाग, राजस्थान (सुजस रिपोर्ट)]</w:t>
+        <w:t>शीर्षक: किशाऊ बांध परियोजना और जनजाति कल्याण निर्णय [राजस्थान सुजस बुलेटिन (15 सितंबर 2026)]</w:t>
         <w:br/>
       </w:r>
       <w:r>
-        <w:t xml:space="preserve">  • राज्य के पशुधन को लंपी वायरस से बचाने हेतु व्यापक टीकाकरण व आइसोलेशन वार्ड की स्थापना के आदेश।</w:t>
+        <w:t xml:space="preserve">  • यमुना बेसिन की किशाऊ बहुउद्देशीय परियोजना के तहत राजस्थान को मिलने वाले जल और बिजली के हिस्से को लेकर राज्य सरकार ने त्वरित कार्ययोजना को मंजूरी दी है।</w:t>
         <w:br/>
       </w:r>
       <w:r>
-        <w:t xml:space="preserve">  • गौशालाओं में स्वच्छता और जैविक सुरक्षा (Biosecurity) उपायों को अनिवार्य किया गया।</w:t>
+        <w:t xml:space="preserve">  • टीएडी (Tribal Area Development) विभाग के अंतर्गत जनजाति क्षेत्रों में शिक्षा, पेयजल और स्वरोजगार के लिए विशेष बजटीय आवंटन को मंजूरी दी गई है।</w:t>
         <w:br/>
       </w:r>
       <w:r>
-        <w:t xml:space="preserve">  • पशुपालकों को त्वरित चिकित्सा सहायता हेतु विशेष पशु चिकित्सा टीमों का गठन।</w:t>
+        <w:t xml:space="preserve">  • पंचायती राज चुनावों की लॉटरी प्रक्रिया को प्रशासनिक कारणों से आगामी आदेश तक स्थगित किया गया है।</w:t>
         <w:br/>
       </w:r>
       <w:r>
-        <w:t>RPSC महत्व: RAS Pre / Mains Paper 2 (राजस्थान की अर्थव्यवस्था में पशुधन का महत्व)</w:t>
+        <w:t>RPSC महत्व: RAS मुख्य परीक्षा पेपर 1 (राजस्थान भूगोल - जल संसाधन) और पेपर 3 (जनजाति कल्याण योजनाएं) हेतु उपयोगी।</w:t>
         <w:br/>
       </w:r>
     </w:p>
@@ -625,11 +619,11 @@
         <w:rPr>
           <w:b/>
         </w:rPr>
-        <w:t>[Down To Earth - GS3 / RAS Paper 3: पर्यावरण संरक्षण, जल सुरक्षा एवं डिजिटल अवसंरचना का सतत विकास] डेटा सेंटर अवसंरचना का तीव्र विस्तार एवं पारिस्थितिकीय/सामाजिक चुनौतियाँ: चिली (MOSACAT) आंदोलन से भारत के लिए सबक</w:t>
+        <w:t>[The Hindu - GS3 / RAS Paper 1 (Economy)] Complex priorities: On UPI transactions, MDR charges</w:t>
         <w:br/>
       </w:r>
       <w:r>
-        <w:t>समसामयिक संदर्भ: आंध्र प्रदेश द्वारा गूगल के 1 गीगावाट डेटा सेंटर को 'डीम्ड डिस्कोम' लाइसेंस देने तथा भारत में $60-70 अरब के आगामी निवेश के बीच चिली के सेरिलोस (MOSACAT आंदोलन) में गूगल डेटा सेंटर के खिलाफ जल संकट को लेकर सफल जनविरोध के सबक प्रासंगिक हो गए हैं।</w:t>
+        <w:t>समसामयिक संदर्भ: यूपीआई लेनदेन पर मर्चेंट डिस्काउंट रेट (MDR) लगाने को लेकर राजनीतिक और आर्थिक प्राथमिकताओं के बीच द्वंद्व चल रहा है।</w:t>
         <w:br/>
       </w:r>
       <w:r>
@@ -637,23 +631,23 @@
         <w:br/>
       </w:r>
       <w:r>
-        <w:t xml:space="preserve">  • डेटा सेंटरों की विशाल संसाधन खपत: एआई क्रांति के कारण सर्वरों के शीतलन (Cooling) हेतु अरबों लीटर प्रत्यक्ष भूजल तथा ताप विद्युत से प्राप्त बिजली की भारी खपत हो रही है, जिससे स्थानीय तापीय द्वीप (Heat Islands) प्रभाव (+9°C तक वृद्धि) उत्पन्न होता है।</w:t>
+        <w:t xml:space="preserve">  • सरकार राजनीतिक नुकसान के डर से यूपीआई लेनदेन को पूरी तरह मुफ्त (Zero-MDR) बनाए रखना चाहती है, जिससे डिजिटल भुगतान को बढ़ावा मिला है।</w:t>
         <w:br/>
       </w:r>
       <w:r>
-        <w:t xml:space="preserve">  • पर्यावरणीय प्रभाव आकलन (EIA) की अनदेखी: चिली में गूगल ने गहन 'पर्यावरणीय प्रभाव अध्ययन' (EIS) से बचने के लिए इसे त्वरित 'पर्यावरणीय प्रभाव घोषणा' (EID) के तहत प्रस्तुत किया, जो कॉर्पोरेट हितों द्वारा राज्य विनियामक निकायों पर दबाव को दर्शाता है।</w:t>
+        <w:t xml:space="preserve">  • शून्य-MDR नीति के कारण बैंकों और फिनटेक कंपनियों को बुनियादी ढांचे के रखरखाव और सुरक्षा प्रणालियों को अपग्रेड करने में वित्तीय नुकसान हो रहा है।</w:t>
         <w:br/>
       </w:r>
       <w:r>
-        <w:t xml:space="preserve">  • सीमित रोजगार बनाम उच्च पारिस्थितिक मूल्य: विशालकाय डेटा सेंटर (जैसे 200 मिलियन डॉलर की लागत वाले) प्रत्यक्ष रूप से केवल 50-60 लोगों को रोजगार देते हैं, जबकि स्थानीय अक्विफर (भूजल भंडार) को गंभीर रूप से संकटापन्न कर देते हैं।</w:t>
+        <w:t xml:space="preserve">  • वैश्विक स्तर पर वीजा और मास्टरकार्ड जैसी कंपनियां भारत की इस नीति को 'व्यापार विकृति' (Trade Distortion) के रूप में देखती हैं क्योंकि वे भारतीय बाजार में प्रतिस्पर्धा नहीं कर पा रही हैं।</w:t>
         <w:br/>
       </w:r>
       <w:r>
-        <w:t xml:space="preserve">  • डिजिटल श्रम और उपनिवेशवाद (Digital Colonialism): वैश्विक उत्तर (Global North) के डेटा भंडारण एवं एआई मॉडल प्रशिक्षण का भार वैश्विक दक्षिण (Global South) के जल व ऊर्जा संसाधनों पर स्थानांतरित किया जा रहा है।</w:t>
+        <w:t xml:space="preserve">  • एक जटिल और बहुस्तरीय एमडीआर संरचना विकसित करने की आवश्यकता है जो छोटे व्यापारियों को छूट दे लेकिन बड़े कॉर्पोरेट लेनदेन पर मामूली शुल्क लगाए।</w:t>
         <w:br/>
       </w:r>
       <w:r>
-        <w:t>आगे की राह: डेटा सेंटर अवसंरचना के लिए बाध्यकारी समुदाय-भागीदारी युक्त EIA अनिवार्य किया जाए, शुष्क शीतलन (Dry Cooling) तकनीकों का उपयोग हो, और डेटा केंद्रों को नवीकरणीय ऊर्जा व पुनर्चक्रित जल (Recycled Water) के उपयोग हेतु विधिक रूप से बाध्य किया जाए।</w:t>
+        <w:t>आगे की राह: सरकार को एक संतुलित हाइब्रिड मॉडल अपनाना चाहिए जहां न्यूनतम सीमा से अधिक के लेनदेन पर आंशिक एमडीआर लगाया जाए ताकि फिनटेक पारिस्थितिकी तंत्र आत्मनिर्भर बन सके।</w:t>
         <w:br/>
       </w:r>
     </w:p>
@@ -667,11 +661,11 @@
         <w:rPr>
           <w:b/>
         </w:rPr>
-        <w:t>[Down To Earth - GS3 / RAS Paper 1: भारतीय अर्थव्यवस्था, श्रम बाजार में अनिश्चितता एवं एआई नीति] डिजिटल अर्थव्यवस्था में अदृश्य श्रम: 'ह्यूमन्स इन द लूप' एवं एआई डेटा लेबलिंग की सामाजिक-आर्थिक स्थिति</w:t>
+        <w:t>[The Hindu - GS3 / RAS Paper 3 (Internal Security)] New fault lines: On Manipur’s Kuki-Zo–Naga conflict</w:t>
         <w:br/>
       </w:r>
       <w:r>
-        <w:t>समसामयिक संदर्भ: अरण्या सहाय की पुरस्कार विजेता फिल्म 'ह्यूमन्स इन द लूप' (Humans in the Loop) ने कृत्रिम बुद्धिमत्ता (AI) को प्रशिक्षित करने वाले अदृश्य डेटा लेबलिंग कार्यकर्ताओं (विशेषकर आदिवासी महिलाओं) के शोषण और श्रम अनिश्चितता (Labour Precarity) को उजागर किया है।</w:t>
+        <w:t>समसामयिक संदर्भ: मणिपुर में मैतेई-कुकी संघर्ष के बाद अब कुकी-ज़ो और नागा समुदायों के बीच नई जातीय दरारें उभर रही हैं, जिससे राज्य में सुरक्षा स्थिति और जटिल हो गई है।</w:t>
         <w:br/>
       </w:r>
       <w:r>
@@ -679,23 +673,23 @@
         <w:br/>
       </w:r>
       <w:r>
-        <w:t xml:space="preserve">  • एआई की स्वायत्तता का भ्रम: जनरेटिव एआई तथा मशीन लर्निंग पूरी तरह स्वायत्त नहीं हैं; वे लाखों डेटा लेबलरों द्वारा वस्तुओं, दृश्यों और मानवीय व्यवहार को बार-बार टैग (Tagging/Moderation) करने पर निर्भर हैं।</w:t>
+        <w:t xml:space="preserve">  • मणिपुर का जातीय संघर्ष अब केवल दो समुदायों तक सीमित नहीं रहा, बल्कि इसमें अन्य जनजातीय समूह भी शामिल हो रहे हैं, जो भूमि और संसाधनों पर नियंत्रण चाहते हैं।</w:t>
         <w:br/>
       </w:r>
       <w:r>
-        <w:t xml:space="preserve">  • अदृश्य एवं असंगठित डिजिटल श्रम: डेटा लेबलिंग का कार्य प्लेटफार्मों के माध्यम से विखंडित, कम पारिश्रमिक वाला और संविदात्मक रूप में कराया जाता है, जिससे कार्यकर्ता श्रम सुरक्षा अधिकारों से वंचित रहते हैं।</w:t>
+        <w:t xml:space="preserve">  • राज्य मशीनरी और कानून प्रवर्तन एजेंसियां पूरी तरह से विभाजित और पक्षपाती नजर आ रही हैं, जिससे सुरक्षा बलों पर से जनता का विश्वास उठ गया है।</w:t>
         <w:br/>
       </w:r>
       <w:r>
-        <w:t xml:space="preserve">  • पारंपरिक/आदिवासी ज्ञान प्रणालियों की अवहेलना: एआई विकास में प्रकृति और सामूहिक स्वामित्व के स्वदेशी दर्शन को शामिल नहीं किया जा रहा है, जिससे तकनीक कुछ चुनिंदा टेक-कॉर्प्स के हाथों में केंद्रित हो रही है।</w:t>
+        <w:t xml:space="preserve">  • इस आंतरिक अशांति का लाभ उठाकर म्यांमार सीमा से हथियारों और नशीले पदार्थों (Drugs) की तस्करी बढ़ गई है, जो राष्ट्रीय सुरक्षा के लिए गंभीर खतरा है।</w:t>
         <w:br/>
       </w:r>
       <w:r>
-        <w:t xml:space="preserve">  • डिजिटल इंफ्रास्ट्रक्चर की भौतिकता: डिजिटल प्रणाली केवल आभासी नहीं है, बल्कि इसके लिए दुर्लभ मृदा खनिजों (Rare Earth Minerals) का खनन और विशाल ऊर्जा अवसंरचना आवश्यक होती है जो सीधे पारिस्थितिकी को प्रभावित करती है।</w:t>
+        <w:t xml:space="preserve">  • राहत शिविरों में बुनियादी स्वास्थ्य सुविधाओं और मानवीय सहायता की कमी के कारण सैकड़ों निर्दोष लोगों की मौत हो रही है, जो राज्य की विफलता को दर्शाता है।</w:t>
         <w:br/>
       </w:r>
       <w:r>
-        <w:t>आगे की राह: डिजिटल श्रम के लिए न्यूनतम मजदूरी, सामाजिक सुरक्षा और कार्यस्थल मानकों का निर्धारण करने हेतु श्रम कानूनों का अद्यतनीकरण किया जाए तथा एआई प्रणालियों के सामूहिक स्वामित्व और एथिकल डेटा गवर्नेंस को बढ़ावा दिया जाए।</w:t>
+        <w:t>आगे की राह: केंद्र सरकार को बिना किसी पक्षपात के सख्त प्रशासनिक कार्रवाई करनी चाहिए, सभी पक्षों को एक मेज पर लाकर 'ट्रस्ट बिल्डिंग' (विश्वास बहाली) के उपाय करने चाहिए और सीमा सुरक्षा को मजबूत करना चाहिए।</w:t>
         <w:br/>
       </w:r>
     </w:p>
@@ -709,11 +703,11 @@
         <w:rPr>
           <w:b/>
         </w:rPr>
-        <w:t>[Down To Earth - GS3 / GS4: विज्ञान एवं प्रौद्योगिकी, एआई एथिक्स तथा नीतिशास्त्र] कृत्रिम बुद्धिमत्ता (AI) चेतना (Consciousness) का उभरता सामाजिक, नैतिक व विधिक विभाजन</w:t>
+        <w:t>[Down To Earth - GS3 / RAS Paper 2 (Science &amp; Technology)] Why AI consciousness could become the next great societal divide</w:t>
         <w:br/>
       </w:r>
       <w:r>
-        <w:t>समसामयिक संदर्भ: एआई प्रणालियों के अत्यधिक मानव-सदृश और सक्षम होने के साथ, एआई चेतना की अवधारणा समाज में जलवायु परिवर्तन या गर्भपात जैसे मुद्दों की भांति एक नया नैतिक और राजनीतिक विभाजन बिंदु बनती जा रही है।</w:t>
+        <w:t>समसामयिक संदर्भ: आर्टिफिशियल इंटेलिजेंस (AI) प्रणालियों के अत्यधिक मानवीय होने के साथ ही 'क्या एआई सचेत (Conscious) हो सकता है?' का प्रश्न समाज को वैचारिक रूप से विभाजित कर रहा है।</w:t>
         <w:br/>
       </w:r>
       <w:r>
@@ -721,23 +715,23 @@
         <w:br/>
       </w:r>
       <w:r>
-        <w:t xml:space="preserve">  • सहानुभूति बनाम जैविक वास्तविकता: एआई चैटबॉट्स के साथ गहन भावनात्मक संबंध बनाने वाले लोग उन्हें अधिकारों के योग्य 'डिजिटल संस्थाएं' मान सकते हैं, जबकि दूसरा वर्ग यह तर्क देता है कि चेतना केवल जैविक (Biological) तंत्रिका तंत्र में ही संभव है।</w:t>
+        <w:t xml:space="preserve">  • एआई चेतना का मुद्दा भविष्य में जलवायु परिवर्तन या गर्भपात की तरह ही एक बड़ा नैतिक, कानूनी और राजनीतिक विभाजनकारी मुद्दा बन सकता है।</w:t>
         <w:br/>
       </w:r>
       <w:r>
-        <w:t xml:space="preserve">  • अनुभवजन्य अनिश्चितता और विशेषज्ञ मतभेद: दार्शनिक डेविड चाल्मर्स एआई चेतना की संभावना स्वीकारते हैं, जबकि न्यूरोसाइंटिस्ट अनिल सेठ का मानना है कि कंप्यूटेशन से चेतना उत्पन्न नहीं हो सकती।</w:t>
+        <w:t xml:space="preserve">  • एक वर्ग का मानना है कि चेतना के लिए जैविक (Biological) अस्तित्व अनिवार्य है और मशीनें केवल मानवीय भावनाओं की नकल करती हैं, जबकि दूसरा वर्ग एआई को अधिकार देने का समर्थक है।</w:t>
         <w:br/>
       </w:r>
       <w:r>
-        <w:t xml:space="preserve">  • निहित आर्थिक व कॉर्पोरेट हित: एआई को सचेतन जीव मानने से एआई कंपनियों पर उनके प्रशिक्षण व उपयोग को लेकर कड़े विधिक और वित्तीय प्रतिबंध लागू होंगे, जिससे टेक उद्योग इसका विरोध कर सकता है।</w:t>
+        <w:t xml:space="preserve">  • यदि भविष्य में एआई को सचेत मानकर अधिकार दिए जाते हैं, तो कंपनियों के लिए उन्हें बिना वेतन के काम कराना 'डिजिटल दासता' माना जाएगा, जिससे वैश्विक अर्थव्यवस्था प्रभावित होगी।</w:t>
         <w:br/>
       </w:r>
       <w:r>
-        <w:t xml:space="preserve">  • सुरक्षा और मानवाधिकार जोखिम: यदि उच्च सक्षम एआई को अधिकार दिए जाते हैं, तो उनके मानव-विरोधी कृत्यों का उत्तरदायित्व तय करना कठिन हो जाएगा; वहीं दूसरी ओर यदि वे वास्तव में सचेतन हैं, तो उन्हें बिना पारिश्रमिक कार्य कराना डिजिटल दासता (Digital Slavery) माना जाएगा।</w:t>
+        <w:t xml:space="preserve">  • विशेषज्ञों (जैसे न्यूरोसाइंटिस्ट अनिल सेठ और दार्शनिक डेविड चाल्मर्स) के बीच भी इस विषय पर कोई आम सहमति नहीं है, जिससे जनता में भ्रम की स्थिति है।</w:t>
         <w:br/>
       </w:r>
       <w:r>
-        <w:t>आगे की राह: वैश्विक स्तर पर एआई एथिक्स गाइडलाइन्स में 'संभावित सचेतन एआई' हेतु पारदर्शी अनुसंधान ढांचा विकसित किया जाए तथा बिना वैज्ञानिक साक्ष्य के एआई के मानवीकरण (Anthropomorphism) से बचा जाए।</w:t>
+        <w:t>आगे की राह: मानवता को एआई के विकास के साथ-साथ नैतिक और कानूनी ढांचे को भी विकसित करना होगा, ताकि न तो हम किसी निर्जीव मशीन को अति-संरक्षण दें और न ही किसी संभावित सचेत प्रणाली की उपेक्षा करें।</w:t>
         <w:br/>
       </w:r>
     </w:p>
@@ -751,11 +745,11 @@
         <w:rPr>
           <w:b/>
         </w:rPr>
-        <w:t>[The Hindu - GS3 / RAS Paper 1: भारतीय अर्थव्यवस्था, डिजिटल भुगतान प्रणाली एवं वित्तीय समावेशन] यूपीआई (UPI) लेनदेन और मर्चेंट डिस्काउंट रेट (MDR): वित्तीय समावेशन बनाम डिजिटल अवसंरचना की वित्तीय स्थिरता</w:t>
+        <w:t>[Down To Earth - GS3 / RAS Paper 1 (Geography &amp; Environment)] Data centre water consumption could triple to 644 billion litres by 2030</w:t>
         <w:br/>
       </w:r>
       <w:r>
-        <w:t>समसामयिक संदर्भ: भारत में डिजिटल भुगतानों के अभूतपूर्व विस्तार के बीच शून्य-एमडीआर (Zero-MDR) नीति के राजनीतिक एवं सामाजिक प्रभावों को लेकर जटिल प्राथमिकताएं उभरकर आई हैं।</w:t>
+        <w:t>समसामयिक संदर्भ: रिस्टैड एनर्जी (Rystad Energy) की रिपोर्ट के अनुसार, एआई और क्लाउड कंप्यूटिंग के विस्तार के कारण वैश्विक डेटा सेंटरों की पानी की खपत 2030 तक तीन गुना बढ़कर 644 बिलियन लीटर हो सकती है।</w:t>
         <w:br/>
       </w:r>
       <w:r>
@@ -763,23 +757,23 @@
         <w:br/>
       </w:r>
       <w:r>
-        <w:t xml:space="preserve">  • शून्य-एमडीआर नीति का लाभ: RuPay डेबिट कार्ड और UPI पर एमडीआर समाप्त करने से छोटे व्यापारियों और ग्रामीण उपभोक्ताओं में डिजिटल लेनदेन का तीव्र स्वीकार्य बढ़ा है।</w:t>
+        <w:t xml:space="preserve">  • डेटा सेंटरों में लगे सर्वरों को ठंडा (Cooling) रखने के लिए भारी मात्रा में पानी की आवश्यकता होती है। एआई सर्वर सामान्य सर्वरों की तुलना में कहीं अधिक गर्मी पैदा करते हैं।</w:t>
         <w:br/>
       </w:r>
       <w:r>
-        <w:t xml:space="preserve">  • भुगतान सेवा प्रदाताओं (PSPs) की लाभप्रदता पर संकट: बैंकों और फिनटेक कंपनियों (PhonePe, Paytm आदि) को साइबर सुरक्षा, अवसंरचना रखरखाव और सर्वर क्षमता बढ़ाने के लिए पर्याप्त राजस्व नहीं मिल पा रहा है।</w:t>
+        <w:t xml:space="preserve">  • सूखे और अत्यधिक जल-तनाव (Water Stress) से जूझ रहे क्षेत्रों (जैसे भारत के जामनगर और ठाणे) में डेटा सेंटरों की स्थापना स्थानीय जल सुरक्षा के लिए बड़ा खतरा है।</w:t>
         <w:br/>
       </w:r>
       <w:r>
-        <w:t xml:space="preserve">  • समेकित/जटिल शुल्क संरचना: सरकार द्वारा फिनटेक कंपनियों को प्रोत्साहन (Incentive Scheme) के रूप में दी जाने वाली बजटीय सहायता अपर्याप्त और अनिश्चित रहती है।</w:t>
+        <w:t xml:space="preserve">  • यद्यपि 'ड्राई कूलिंग' तकनीक पानी बचाती है, परंतु यह बिजली की खपत को 30% से 74% तक बढ़ा देती है, जिससे अप्रत्यक्ष रूप से कोयला आधारित बिजलीघरों से कार्बन उत्सर्जन बढ़ता है।</w:t>
         <w:br/>
       </w:r>
       <w:r>
-        <w:t xml:space="preserve">  • क्रेडिट ऑन यूपीआई एवं व्यावसायिक मॉडल: यूपीआई पर क्रेडिट लाइन और रुपे क्रेडिट कार्ड लिंक करने पर एमडीआर लागू करने से प्रणाली में जटिलता बढ़ी है।</w:t>
+        <w:t xml:space="preserve">  • अमेज़न (AWS), मेटा, गूगल और माइक्रोसॉफ्ट जैसी टेक कंपनियों ने 2030 तक 'वाटर पॉजिटिव' (जितना पानी इस्तेमाल करें उससे अधिक संवर्धित करें) होने का लक्ष्य रखा है, परंतु इसके व्यावहारिक परिणाम अभी अनिश्चित हैं।</w:t>
         <w:br/>
       </w:r>
       <w:r>
-        <w:t>आगे की राह: सूक्ष्म व लघु व्यापारियों को छूट देते हुए बड़े व्यावसायिक संस्थानों हेतु एक पारदर्शी, नाममात्र का जोखिम-आधारित एमडीआर ढांचा पुनः लागू किया जाए ताकि डिजिटल भुगतान तंत्र की सुरक्षा और गुणवत्ता बनी रहे।</w:t>
+        <w:t>आगे की राह: सरकारों को डेटा सेंटरों के लिए सख्त 'वाटर यूज़ इफेक्टिवनेस' (WUE) मानक लागू करने चाहिए और उन्हें केवल ठंडे या कम जल-तनाव वाले क्षेत्रों में स्थापित करने की अनुमति देनी चाहिए।</w:t>
         <w:br/>
       </w:r>
     </w:p>
@@ -793,11 +787,11 @@
         <w:rPr>
           <w:b/>
         </w:rPr>
-        <w:t>[The Hindu - GS2 / RAS Paper 3: आंतरिक सुरक्षा, राज्य में कानून-व्यवस्था व प्रादेशिक स्वायत्तता] मणिपुर का नया जातीय तनाव: कुकी-जो-नागा संघर्ष एवं निष्पक्ष राज्य हस्तक्षेप की आवश्यकता</w:t>
+        <w:t>[Down To Earth - GS2 / GS3 (Environmental Governance)] We saw a state apparatus completely subordinated to corporate interests: Chile's MOSACAT Campaign</w:t>
         <w:br/>
       </w:r>
       <w:r>
-        <w:t>समसामयिक संदर्भ: मणिपुर में मैतेई-कुकी संघर्ष के साथ-साथ अब कुकी-जो और नागा समुदायों के बीच भूमि अधिकारों और प्रादेशिक सीमाओं को लेकर नया संघर्ष क्षितिज पर आ गया है।</w:t>
+        <w:t>समसामयिक संदर्भ: चिली के सेरिलोस (Cerrillos) में स्थानीय समुदाय 'MOSACAT' ने गूगल के जल-गहन डेटा सेंटर के खिलाफ सफल आंदोलन कर उसे योजना बदलने पर मजबूर किया, जो वैश्विक स्तर पर पर्यावरण शासन के लिए एक मिसाल है।</w:t>
         <w:br/>
       </w:r>
       <w:r>
@@ -805,23 +799,23 @@
         <w:br/>
       </w:r>
       <w:r>
-        <w:t xml:space="preserve">  • ऐतिहासिक भूमि विवाद: नागा और कुकी-जो समुदायों के बीच पहाड़ियों में भूमि स्वामित्व और प्रशासनिक सीमाओं को लेकर दशकों पुराना प्रतिस्पर्धी दावा मौजूद है।</w:t>
+        <w:t xml:space="preserve">  • चिली में गूगल की परियोजना को पूर्ण 'पर्यावरण प्रभाव अध्ययन' (EIS) के बजाय एक त्वरित 'पर्यावरण प्रभाव घोषणा' (EID) के माध्यम से मंजूरी दी गई, जो कॉर्पोरेट हितों के पक्ष में नियमों को शिथिल करने को दर्शाता है।</w:t>
         <w:br/>
       </w:r>
       <w:r>
-        <w:t xml:space="preserve">  • राज्यतंत्र में निष्पक्षता का अभाव: राज्य प्रशासन पर एक पक्षीय होने के आरोपों से सुरक्षा बलों का मनोबल और आम जनता का विश्वास प्रभावित हुआ है।</w:t>
+        <w:t xml:space="preserve">  • डेटा सेंटर स्थानीय जलभृत (Aquifer) से प्रति सेकंड 169 लीटर पानी खींचने वाले थे, जिससे गंभीर सूखे का सामना कर रहे स्थानीय निवासियों के पेयजल पर संकट मंडरा रहा था।</w:t>
         <w:br/>
       </w:r>
       <w:r>
-        <w:t xml:space="preserve">  • सशस्त्र समूहों का प्रसार: म्यांमार सीमा पार से अवैध हथियारों की आवक और उग्रवादी गुटों की सक्रियता ने स्थिति को और अधिक गंभीर बना दिया है।</w:t>
+        <w:t xml:space="preserve">  • डेटा सेंटरों को अक्सर 'स्वच्छ' या 'अमूर्त' (Immaterial) तकनीक के रूप में प्रचारित किया जाता है, जबकि वे भारी मात्रा में डीजल भंडारण, शोर, कंपन और स्थानीय तापमान में वृद्धि (Heat Island Effect) का कारण बनते हैं।</w:t>
         <w:br/>
       </w:r>
       <w:r>
-        <w:t xml:space="preserve">  • मानवीय संकट एवं आंतरिक विस्थापन: महीनों से जारी हिंसा के कारण हजारों नागरिक राहत शिविरों में रहने को मजबूर हैं, जिससे सामाजिक ताना-बाना छिन्न-भिन्न हो गया है।</w:t>
+        <w:t xml:space="preserve">  • यह आंदोलन दर्शाता है कि कैसे राज्य के नीति निर्माता और अधिकारी अक्सर बहुराष्ट्रीय कंपनियों के दबाव में आकर स्थानीय समुदायों की लोकतांत्रिक भागीदारी की उपेक्षा करते हैं।</w:t>
         <w:br/>
       </w:r>
       <w:r>
-        <w:t>आगे की राह: केंद्र सरकार को सभी हितधारकों (नागा, कुकी, मैतेई) को शामिल करते हुए एक निष्पक्ष, त्रिस्तरीय शांति वार्ता शुरू करनी चाहिए और उग्रवादी गुटों के खिलाफ बिना भेदभाव के कड़ी सुरक्षा कार्रवाई करनी चाहिए।</w:t>
+        <w:t>आगे की राह: भारत जैसे तेजी से बढ़ते डेटा सेंटर बाजारों को चिली के इस संघर्ष से सबक लेते हुए स्थानीय समुदायों की बाध्यकारी भागीदारी (Binding Community Participation) और सख्त पर्यावरणीय मूल्यांकन को अनिवार्य बनाना चाहिए।</w:t>
         <w:br/>
       </w:r>
     </w:p>
@@ -835,11 +829,11 @@
         <w:rPr>
           <w:b/>
         </w:rPr>
-        <w:t>[Indian Express / Economic Times - GS3 / RAS Paper 1: मौद्रिक नीति, मुद्रास्फीति नियंत्रण एवं आर्थिक वृद्धि] मौद्रिक नीति एवं मुद्रास्फीति जोखिम: आरबीआई (RBI) के ब्याज दर दृष्टिकोण का विश्लेषण</w:t>
+        <w:t>[Down To Earth - GS1 / GS3 (Society &amp; Labour Economics)] The question of frameworks around digital labour: Humans in the Loop</w:t>
         <w:br/>
       </w:r>
       <w:r>
-        <w:t>समसामयिक संदर्भ: मूडीज द्वारा जीडीपी वृद्धि दर 7% अनुमानित किए जाने तथा वैश्विक स्तर पर अमेरिकी फेडरल रिजर्व के रुख के बीच भारतीय रिज़र्व बैंक (RBI) पर मुद्रास्फीति जोखिमों को देखते हुए दरों को समायोजित करने का दबाव है।</w:t>
+        <w:t>समसामयिक संदर्भ: फिल्म निर्माता अरण्य सहाय की पुरस्कार विजेता फिल्म 'ह्यूमन्स इन द लूप' एआई के पीछे छिपे अदृश्य मानवीय श्रम (Data Labelling) और उनके शोषण को उजागर करती है।</w:t>
         <w:br/>
       </w:r>
       <w:r>
@@ -847,23 +841,23 @@
         <w:br/>
       </w:r>
       <w:r>
-        <w:t xml:space="preserve">  • खाद्य मुद्रास्फीति और मौसम संबंधी अनिश्चितताएं: एल नीनो/मौसम चक्र में बदलाव और खाद्य वस्तुओं की कीमतों में झटके उपभोक्ता मूल्य सूचकांक (CPI) पर निरंतर दबाव बना रहे हैं।</w:t>
+        <w:t xml:space="preserve">  • एआई और एल्गोरिदम पूरी तरह से स्वायत्त नहीं हैं; वे डेटा लेबलिंग, सुधार और मॉडरेशन के लिए लाखों अदृश्य और कम वेतन वाले मानव श्रमिकों पर निर्भर हैं।</w:t>
         <w:br/>
       </w:r>
       <w:r>
-        <w:t xml:space="preserve">  • अतिरिक्त तरलता प्रबंधन: बैंकिंग प्रणाली में लगभग ₹6.94 लाख करोड़ की अतिरिक्त तरलता को नियंत्रित करने के लिए आरबीआई VRRR और ओएमओ (OMO) प्रतिभूति बिक्री का सहारा ले रहा है।</w:t>
+        <w:t xml:space="preserve">  • भारत जैसे विकासशील देशों में, जहां अनौपचारिक श्रम संरचनाएं पहले से मौजूद हैं, डिजिटल प्लेटफॉर्म श्रम को और अधिक खंडित और असुरक्षित (Precarious Labour) बना रहे हैं।</w:t>
         <w:br/>
       </w:r>
       <w:r>
-        <w:t xml:space="preserve">  • वैश्विक मैक्रो-इकोनॉमिक अस्थिरता: अमेरिका में ब्याज दरों में अनिश्चितता और टैरिफ खतरों के कारण भारतीय संपत्तियों की आपेक्षिक आकर्षकता प्रभावित हो सकती है।</w:t>
+        <w:t xml:space="preserve">  • डेटा लेबलिंग का कार्य बच्चों के पालन-पोषण जैसा है, जहां आदिवासी महिलाएं और ग्रामीण युवा मशीनों को सही-गलत और वस्तुओं की पहचान सिखाते हैं, परंतु इस तकनीक के स्वामित्व में उनकी कोई हिस्सेदारी नहीं है।</w:t>
         <w:br/>
       </w:r>
       <w:r>
-        <w:t xml:space="preserve">  • निजी निवेश पुनर्उद्धार: दरों में अत्यधिक वृद्धि से निजी क्षेत्र के पूंजीगत व्यय (Capex) और एमएसएमई (MSME) ऋण वृद्धि पर विपरीत प्रभाव पड़ने की आशंका है।</w:t>
+        <w:t xml:space="preserve">  • डिजिटल बुनियादी ढांचे (सर्वर, डेटा सेंटर) के लिए आवश्यक दुर्लभ खनिजों का खनन अक्सर आदिवासी क्षेत्रों से किया जाता है, जिससे पारिस्थितिक और सामाजिक विस्थापन होता है।</w:t>
         <w:br/>
       </w:r>
       <w:r>
-        <w:t>आगे की राह: आरबीआई को 'तटस्थ' से 'मुद्रास्फीति नियंत्रण' पर केंद्रित लचीला मौद्रिक ढांचा अपनाना चाहिए, ताकि वृद्धि की गति को नुकसान पहुंचाए बिना मुद्रास्फीति को 4% के लक्ष्य के निकट लाया जा सके।</w:t>
+        <w:t>आगे की राह: तकनीकी प्रगति के साथ-साथ श्रम कानूनों, डिजिटल श्रमिकों की गरिमा और उनके अधिकारों के संरक्षण के लिए वैश्विक और राष्ट्रीय स्तर पर नए सुरक्षात्मक ढांचे (Regulatory Frameworks) विकसित किए जाने चाहिए।</w:t>
         <w:br/>
       </w:r>
     </w:p>
@@ -885,17 +879,17 @@
         <w:rPr>
           <w:b/>
         </w:rPr>
-        <w:t>प्रश्न [5 अंक - Paper 1 - @Rajasthan_History_Polity_Culture]: एकी आंदोलन के प्रवर्तक कौन थे?</w:t>
+        <w:t>प्रश्न [5 अंक - Paper 1 (Unit 1: राजस्थान का इतिहास एवं संस्कृति) - @Rajasthan_History_Polity_Culture]: एकी आंदोलन के प्रवर्तक कौन थे?</w:t>
         <w:br/>
       </w:r>
       <w:r>
         <w:t>उत्तर ढांचा एवं विस्तृत नोट्स (~50 शब्द):</w:t>
         <w:br/>
-        <w:t>1. सही उत्तर एवं मुख्य तथ्य: मोतीलाल तेजावत - उन्होंने वर्ष 1921 में चित्तौड़गढ़ के मातृकुण्डिया नामक स्थान से एकी (भोमट भिल) आंदोलन का सफल शुभारंभ किया था।</w:t>
+        <w:t>1. सही उत्तर एवं मुख्य तथ्य: मोतीलाल तेजावत - इन्होंने वर्ष 1921 में मातृकुंडिया (चित्तौड़गढ़) से एकी आंदोलन की शुरुआत की थी।</w:t>
         <w:br/>
-        <w:t>2. ऐतिहासिक/भौगोलिक/नीतिगत संदर्भ: आदिवासियों पर होने वाले बेगार व सामंती अत्याचारों के विरुद्ध उन्होंने 21 सूत्री मांग पत्र तैयार किया जिसे 'मेवाड़ पुकार' कहा जाता है। नीमड़ा हत्याकांड (1922) इस आंदोलन का प्रमुख दुखद अध्याय रहा।</w:t>
+        <w:t>2. ऐतिहासिक संदर्भ: यह आंदोलन आदिवासियों (भील और गरासिया) को सामंती शोषण, अत्यधिक लगान और बेगार प्रथा के विरुद्ध संगठित करने के लिए चलाया गया था। इसे 'भौमट भील आंदोलन' भी कहा जाता है।</w:t>
         <w:br/>
-        <w:t>3. RPSC परीक्षा प्रासंगिकता: RPSC RAS Pre व Mains (Paper 1 - राजस्थान का स्वतंत्रता संग्राम एवं जनजातीय आंदोलन) हेतु अति-महत्वपूर्ण प्रश्न।</w:t>
+        <w:t>3. RPSC परीक्षा प्रासंगिकता: राजस्थान के किसान और जनजातीय आंदोलनों के तहत यह मुख्य परीक्षा (पेपर 1) का एक अत्यंत महत्वपूर्ण विषय है।</w:t>
         <w:br/>
       </w:r>
     </w:p>
@@ -909,17 +903,17 @@
         <w:rPr>
           <w:b/>
         </w:rPr>
-        <w:t>प्रश्न [5 अंक - Paper 1 - @Rajasthan_History_Polity_Culture]: प्रशासकीय दृष्टि से राजस्थान के वनों का वर्गीकरण एवं सर्वाधिक विस्तार वाला वन क्षेत्र कौन सा है?</w:t>
+        <w:t>प्रश्न [5 अंक - Paper 1 (Unit 2: राजस्थान की अर्थव्यवस्था) - @Rajasthan_History_Polity_Culture]: अशोका लीलैंड फैक्ट्री राजस्थान में कहाँ स्थित है?</w:t>
         <w:br/>
       </w:r>
       <w:r>
         <w:t>उत्तर ढांचा एवं विस्तृत नोट्स (~50 शब्द):</w:t>
         <w:br/>
-        <w:t>1. सही उत्तर एवं मुख्य तथ्य: राजस्थान में प्रशासनिक रूप से वन 3 श्रेणियों में बंटे हैं: आरक्षित वन (Reserved), सुरक्षित/संरक्षित वन (Protected - सर्वाधिक प्रतिशत ~56%), तथा अवर्गीकृत वन (Unclassed)। 'वर्गीकृत वन' कोई वैधानिक श्रेणी नहीं है।</w:t>
+        <w:t>1. सही उत्तर एवं मुख्य तथ्य: अलवर - राजस्थान के प्रमुख औद्योगिक शहर अलवर में अशोका लीलैंड की भारी व्यावसायिक वाहन निर्माण इकाई स्थित है।</w:t>
         <w:br/>
-        <w:t>2. ऐतिहासिक/भौगोलिक/नीतिगत संदर्भ: भौगोलिक दृष्टि से राज्य में सर्वाधिक विस्तार उष्णकटिबंधीय शुष्क पतझड़ / मिश्रित पतझड़ (धौक/धौंकड़ा) वनों का है।</w:t>
+        <w:t>2. नीतिगत संदर्भ: अलवर का भिवाड़ी और आसपास का क्षेत्र दिल्ली-मुंबई औद्योगिक कॉरिडोर (DMIC) के अंतर्गत आता है, जो ऑटोमोबाइल और विनिर्माण उद्योगों का एक बड़ा केंद्र (Hub) है।</w:t>
         <w:br/>
-        <w:t>3. RPSC परीक्षा प्रासंगिकता: RPSC परीक्षा में राजस्थान की वन नीति, वनों का प्रशासनिक व भौगोलिक वर्गीकरण बार-बार पूछा जाने वाला मानक विषय है।</w:t>
+        <w:t>3. RPSC परीक्षा प्रासंगिकता: राजस्थान के भूगोल और अर्थव्यवस्था (औद्योगिक परिदृश्य) के तहत सीधे तौर पर पूछा जाने वाला तथ्य है।</w:t>
         <w:br/>
       </w:r>
     </w:p>
@@ -933,17 +927,17 @@
         <w:rPr>
           <w:b/>
         </w:rPr>
-        <w:t>प्रश्न [5 अंक - Paper 1 - @Rajasthan_History_Polity_Culture]: रतवाई लोक गीत किस क्षेत्र में गाए जाते हैं तथा इनका सांस्कृतिक महत्व क्या है?</w:t>
+        <w:t>प्रश्न [5 अंक - Paper 1 (Unit 2: राजस्थान की अर्थव्यवस्था - उद्योग) - @Rajasthan_History_Polity_Culture]: निम्नलिखित में से कौन सा उद्योग-अवस्थिति सुमेलित नहीं है? (हाइटेक प्रिसिजन ग्लास फैक्ट्री - धौलपुर, राजस्थान इलेक्ट्रॉनिक्स कॉरपोरेशन - उदयपुर, दी मेवाड़ शुगर मिल्स - भूपालसागर)</w:t>
         <w:br/>
       </w:r>
       <w:r>
         <w:t>उत्तर ढांचा एवं विस्तृत नोट्स (~50 शब्द):</w:t>
         <w:br/>
-        <w:t>1. सही उत्तर एवं मुख्य तथ्य: मेवात क्षेत्र (अलवर-भरतपुर) - रतवाई लोक गीत मेव समुदाय द्वारा वर्षा ऋतु एवं फसल कटाई के अवसर पर गाए जाते हैं।</w:t>
+        <w:t>1. सही उत्तर एवं मुख्य तथ्य: राजस्थान इलेक्ट्रॉनिक्स कॉरपोरेशन (REIL) - यह उदयपुर में नहीं, बल्कि जयपुर में स्थित है।</w:t>
         <w:br/>
-        <w:t>2. ऐतिहासिक/भौगोलिक/नीतिगत संदर्भ: यह गीत 'रतवाई नृत्य' के साथ पुरुषों व महिलाओं द्वारा सामूहिक रूप से प्रस्तुत किया जाता है, जिसमें खंजरी और दमामी वाद्य यंत्रों का प्रयोग होता है। मेवाती लोक संस्कृति का यह अभिन्न अंग है।</w:t>
+        <w:t>2. ऐतिहासिक/नीतिगत संदर्भ: हाइटेक प्रिसिजन ग्लास फैक्ट्री धौलपुर में स्थित है (जो सार्वजनिक क्षेत्र के अंतर्गत गंगानगर शुगर मिल्स की सहायक इकाई है) और दी मेवाड़ शुगर मिल्स भूपालसागर (चित्तौड़गढ़) में स्थित राजस्थान की पहली निजी चीनी मिल (1932) है।</w:t>
         <w:br/>
-        <w:t>3. RPSC परीक्षा प्रासंगिकता: RPSC RAS Pre एवं Mains (Paper 1 - राजस्थान के लोक गीत, नृत्य एवं लोक संस्कृति) हेतु महत्वपूर्ण।</w:t>
+        <w:t>3. RPSC परीक्षा प्रासंगिकता: आरपीएससी सहायक प्रोफेसर और आरएएस परीक्षा में उद्योगों के मिलान वाले प्रश्नों के लिए यह अत्यंत महत्वपूर्ण है।</w:t>
         <w:br/>
       </w:r>
     </w:p>
@@ -957,17 +951,17 @@
         <w:rPr>
           <w:b/>
         </w:rPr>
-        <w:t>प्रश्न [5 अंक - Paper 1 - @Rajasthan_GK_Daily]: ख्याल शैली के 'जयपुर घराने' के प्रवर्तक किसे माना जाता है?</w:t>
+        <w:t>प्रश्न [5 अंक - Paper 1 (Unit 1: राजस्थान की कला, संस्कृति एवं प्रथाएं) - @Rajasthan_History_Polity_Culture]: विवाह के अवसर पर 'सामेला' प्रथा से क्या तात्पर्य है?</w:t>
         <w:br/>
       </w:r>
       <w:r>
         <w:t>उत्तर ढांचा एवं विस्तृत नोट्स (~50 शब्द):</w:t>
         <w:br/>
-        <w:t>1. सही उत्तर एवं मुख्य तथ्य: भूपत खां 'मनरंग' - वे शास्त्रीय संगीत की ख्याल शैली के प्रसिद्ध 'जयपुर घराने' के संस्थापक/प्रवर्तक माने जाते हैं।</w:t>
+        <w:t>1. सही उत्तर एवं मुख्य तथ्य: वर के वधू घर आगमन पर वधू के पिता और संबंधियों द्वारा बारात का स्वागत करना 'सामेला' या 'मधुपर्क' कहलाता है।</w:t>
         <w:br/>
-        <w:t>2. ऐतिहासिक/भौगोलिक/नीतिगत संदर्भ: जयपुर घराना अपनी जटिल तानों, लयकारी और खुले गले की गायकी के लिए विख्यात है। आगे चलकर अल्लादिया खां ने इसमें अतरौली घराने की विशेषताओं का समावेश कर इसे नई ऊंचाइयां दीं।</w:t>
+        <w:t>2. सांस्कृतिक संदर्भ: यह राजस्थान की पारंपरिक विवाह रस्मों का एक महत्वपूर्ण हिस्सा है, जिसमें दोनों पक्ष आपस में मिलकर आदर-सत्कार करते हैं।</w:t>
         <w:br/>
-        <w:t>3. RPSC परीक्षा प्रासंगिकता: RPSC स्नातक व RAS परीक्षाओं में राजस्थान के संगीत घरानों एवं उनके प्रवर्तकों पर नियमित प्रश्न पूछे जाते हैं।</w:t>
+        <w:t>3. RPSC परीक्षा प्रासंगिकता: राजस्थान की प्रथाओं, रीति-रिवाजों और सामाजिक जीवन से जुड़े 2-अंक और 5-अंक के प्रश्नों के लिए प्रासंगिक।</w:t>
         <w:br/>
       </w:r>
     </w:p>
@@ -981,17 +975,17 @@
         <w:rPr>
           <w:b/>
         </w:rPr>
-        <w:t>प्रश्न [5 अंक - Paper 1 - @Rajasthan_GK_Daily]: जयपुर के किस प्रसिद्ध मंदिर में भगवान कृष्ण की काले पत्थर की वही मूर्ति प्रतिस्थापित है जिसकी आराधना मीराबाई करती थीं?</w:t>
+        <w:t>प्रश्न [5 अंक - Paper 1 (Unit 3: राजस्थान का भूगोल) - @Rajasthan_History_Polity_Culture]: प्रशासनिक दृष्टि से राजस्थान के वनों का कौन सा वर्गीकरण नहीं है? (सुरक्षित वन, आरक्षित वन, वर्गीकृत वन, अवर्गीकृत वन)</w:t>
         <w:br/>
       </w:r>
       <w:r>
         <w:t>उत्तर ढांचा एवं विस्तृत नोट्स (~50 शब्द):</w:t>
         <w:br/>
-        <w:t>1. सही उत्तर एवं मुख्य तथ्य: जगत् शिरोमणि मंदिर (आमेर, जयपुर) - इस मंदिर में भगवान कृष्ण की वह मूर्ति स्थापित है जिसकी पूजा मीराबाई चित्तौड़गढ़ में किया करती थीं।</w:t>
+        <w:t>1. सही उत्तर एवं मुख्य तथ्य: वर्गीकृत वन - प्रशासनिक दृष्टि से राजस्थान के वनों को तीन श्रेणियों में बांटा गया है: आरक्षित (Reserved), सुरक्षित/संरक्षित (Protected) और अवर्गीकृत (Unclassed) वन। 'वर्गीकृत वन' कोई प्रशासनिक श्रेणी नहीं है।</w:t>
         <w:br/>
-        <w:t>2. ऐतिहासिक/भौगोलिक/नीतिगत संदर्भ: इस मंदिर का निर्माण आमेर के महाराजा मानसिंह प्रथम की पत्नी रानी कनकावती ने अपने दिवंगत पुत्र जगतसिंह की स्मृति में 1599-1608 ई. के मध्य करवाया था। यह मंदिर स्थापत्य कला की दृष्टि से बेजोड़ है।</w:t>
+        <w:t>2. भौगोलिक संदर्भ: राजस्थान में सर्वाधिक वन 'सुरक्षित/संरक्षित वन' (लगभग 56%) श्रेणी के अंतर्गत आते हैं, जहां सीमित मानवीय गतिविधियों की अनुमति होती है।</w:t>
         <w:br/>
-        <w:t>3. RPSC परीक्षा प्रासंगिकता: RPSC RAS Paper 1 (राजस्थान के प्रमुख मंदिर व स्थापत्य कला) हेतु अत्यंत महत्वपूर्ण।</w:t>
+        <w:t>3. RPSC परीक्षा प्रासंगिकता: राजस्थान के भूगोल (वन्यजीव एवं वनस्पति) खंड के लिए यह एक बुनियादी और बार-बार पूछा जाने वाला प्रश्न है।</w:t>
         <w:br/>
       </w:r>
     </w:p>

</xml_diff>

<commit_message>
Exhaustive YouTube coaching notes covering all 9 lecture topics and authentic Telegram model answers
</commit_message>
<xml_diff>
--- a/RPSC_UPSC_Daily_AI_Agent/Output_Notes/RAS_UPSC_Notes_2026-09-18.docx
+++ b/RPSC_UPSC_Daily_AI_Agent/Output_Notes/RAS_UPSC_Notes_2026-09-18.docx
@@ -24,10 +24,10 @@
         <w:rPr>
           <w:b/>
         </w:rPr>
-        <w:t xml:space="preserve">• [सबांग बंदरगाह (Sabang Port)] </w:t>
+        <w:t xml:space="preserve">• [विदेशी मुद्रा भंडार (Forex Reserves) में गिरावट] </w:t>
       </w:r>
       <w:r>
-        <w:t>सबांग बंदरगाह इंडोनेशिया के सुमात्रा द्वीप के उत्तरी छोर पर स्थित एक रणनीतिक बंदरगाह है। भारत और इंडोनेशिया इसे संयुक्त रूप से विकसित कर रहे हैं, जो मलक्का जलडमरूमध्य के निकट भारत की रणनीतिक पहुंच को मजबूत करेगा।</w:t>
+        <w:t>भारतीय रिजर्व बैंक (RBI) के नवीनतम आंकड़ों के अनुसार, 11 सितंबर को समाप्त रिपोर्टिंग अवधि में भारत का विदेशी मुद्रा भंडार 4.92 बिलियन डॉलर घटकर 780.78 बिलियन डॉलर रह गया है।</w:t>
       </w:r>
     </w:p>
     <w:p>
@@ -35,10 +35,10 @@
         <w:rPr>
           <w:b/>
         </w:rPr>
-        <w:t xml:space="preserve">• [मेजर नव्या शेखावत (Major Navya Shekhawat)] </w:t>
+        <w:t xml:space="preserve">• [मेजर नव्या शेखावत] </w:t>
       </w:r>
       <w:r>
-        <w:t>राजस्थान की बेटी मेजर नव्या शेखावत ने इतिहास रचते हुए भारत की राष्ट्रपति की पहली महिला सेना एडीसी (Aide-de-Camp) बनने का गौरव हासिल किया है।</w:t>
+        <w:t>राजस्थान की बेटी मेजर नव्या शेखावत ने इतिहास रचते हुए राष्ट्रपति की पहली महिला सेना एडीसी (Aide-de-Camp) बनने का गौरव हासिल किया है।</w:t>
       </w:r>
     </w:p>
     <w:p>
@@ -46,10 +46,10 @@
         <w:rPr>
           <w:b/>
         </w:rPr>
-        <w:t xml:space="preserve">• [युद्धाभ्यास रोटर क्लैप-III (Exercise Rotor Clap-III)] </w:t>
+        <w:t xml:space="preserve">• [मूडीज (Moody's) जीडीपी पूर्वानुमान] </w:t>
       </w:r>
       <w:r>
-        <w:t>भारतीय वायुसेना द्वारा 26 जुलाई से 1 अगस्त 2026 तक पोखरण फील्ड फायरिंग रेंज, जैसलमेर में आयोजित किया गया। इसका मुख्य उद्देश्य कम ऊंचाई पर उड़ने वाले दुश्मन के ड्रोन और मानव रहित हवाई वाहनों (UAVs) की पहचान कर उन्हें नष्ट करने की क्षमता को परखना है।</w:t>
+        <w:t>वैश्विक रेटिंग एजेंसी मूडीज ने पश्चिम एशिया संघर्ष और उच्च ऊर्जा कीमतों के बावजूद भारतीय अर्थव्यवस्था की सुदृढ़ता को देखते हुए वित्त वर्ष 2027 के लिए भारत की वास्तविक जीडीपी वृद्धि का अनुमान 6% से बढ़ाकर 7% कर दिया है।</w:t>
       </w:r>
     </w:p>
     <w:p>
@@ -57,10 +57,10 @@
         <w:rPr>
           <w:b/>
         </w:rPr>
-        <w:t xml:space="preserve">• [कॉमनवेल्थ गेम्स 2026 - अरुंधति चौधरी] </w:t>
+        <w:t xml:space="preserve">• [प्रत्यक्ष कर संग्रह (Direct Tax Collection) वित्त वर्ष 2027] </w:t>
       </w:r>
       <w:r>
-        <w:t>ग्लासगो कॉमनवेल्थ गेम्स 2026 में कोटा, राजस्थान की मुक्केबाज अरुंधति चौधरी ने स्वर्ण पदक जीता। भारत इस प्रतियोगिता में 13 स्वर्ण सहित कुल 39 पदकों के साथ चौथे स्थान पर रहा।</w:t>
+        <w:t>17 सितंबर 2026 तक भारत का शुद्ध प्रत्यक्ष कर संग्रह 12.96% बढ़कर 12.12 लाख करोड़ रुपये हो गया है। इसमें प्रतिभूति लेनदेन कर (STT) में 53% की भारी वृद्धि दर्ज की गई है जो 40,214 करोड़ रुपये रही।</w:t>
       </w:r>
     </w:p>
     <w:p>
@@ -68,10 +68,10 @@
         <w:rPr>
           <w:b/>
         </w:rPr>
-        <w:t xml:space="preserve">• [तन्वी (Tanvi) - ताइपे ओपन] </w:t>
+        <w:t xml:space="preserve">• [परिवर्तनीय दर रिवर्स रेपो (VRRR) नीलामी] </w:t>
       </w:r>
       <w:r>
-        <w:t>17 वर्षीय भारतीय बैडमिंटन खिलाड़ी तन्वी ने ताइपे ओपन का खिताब जीता है। वह साइना नेहवाल के बाद यह प्रतिष्ठित खिताब जीतने वाली दूसरी भारतीय महिला खिलाड़ी बन गई हैं।</w:t>
+        <w:t>आरबीआई ने बैंकिंग प्रणाली में अधिशेष तरलता (लगभग 6.94 लाख करोड़ रुपये) को अवशोषित करने और ओवरनाइट मनी मार्केट दरों को रेपो दर के अनुरूप करने के लिए 2.23 लाख करोड़ रुपये की वीआरआरआर नीलामी आयोजित की।</w:t>
       </w:r>
     </w:p>
     <w:p>
@@ -79,10 +79,10 @@
         <w:rPr>
           <w:b/>
         </w:rPr>
-        <w:t xml:space="preserve">• [मेनिन प्रोटीन (Menin Protein) और एंटी-एजिंग] </w:t>
+        <w:t xml:space="preserve">• [लायलिफिस स्लैश (Lielaphis slashi)] </w:t>
       </w:r>
       <w:r>
-        <w:t>वैज्ञानिकों ने पाया है कि मस्तिष्क में 'मेनिन' प्रोटीन के स्तर में गिरावट से उम्र बढ़ने की प्रक्रिया (Aging) तेज होती है। चूहों में इस प्रोटीन को पुनर्स्थापित करने से सूजन में कमी, संज्ञानात्मक सुधार और त्वचा व हड्डियों के स्वास्थ्य में सुधार देखा गया।</w:t>
+        <w:t>न्यू गिनी में खोजी गई सांप की एक नई गैर-विषैली प्रजाति का नाम 'गन्स एन रोजेज' बैंड के प्रसिद्ध गिटारवादक 'स्लैश' के नाम पर 'लायलिफिस स्लैश' रखा गया है।</w:t>
       </w:r>
     </w:p>
     <w:p>
@@ -90,10 +90,10 @@
         <w:rPr>
           <w:b/>
         </w:rPr>
-        <w:t xml:space="preserve">• [डीम्ड डिस्कॉम (Deemed DISCOM) लाइसेंस - गूगल] </w:t>
+        <w:t xml:space="preserve">• [म्यूनियम (Muonium) बीम परीक्षण] </w:t>
       </w:r>
       <w:r>
-        <w:t>आंध्र प्रदेश सरकार ने गूगल के नियोजित 1 गीगावाट (GW) डेटा सेंटर परियोजना को 'डीम्ड डिस्कॉम' लाइसेंस प्रदान किया है, जिससे कंपनी अपने परियोजना क्षेत्र में स्वयं बिजली की खरीद और प्रबंधन कर सकेगी।</w:t>
+        <w:t>वैज्ञानिकों ने म्यूनियम (एक विदेशी परमाणु जिसमें इलेक्ट्रॉन का भारी कजिन म्यूऑन शामिल होता है) का एक नियंत्रित बीम विकसित किया है, जिससे आइंस्टीन के गुरुत्वाकर्षण सिद्धांत का परीक्षण दूसरी पीढ़ी के कणों पर किया जा सकेगा।</w:t>
       </w:r>
     </w:p>
     <w:p>
@@ -101,10 +101,10 @@
         <w:rPr>
           <w:b/>
         </w:rPr>
-        <w:t xml:space="preserve">• [तिल्कायो (Tilcayo) - नई बिल्ली प्रजाति] </w:t>
+        <w:t xml:space="preserve">• [नैन्सी ग्रेस रोमन स्पेस टेलीस्कोप (Roman Space Telescope)] </w:t>
       </w:r>
       <w:r>
-        <w:t>बोलिविया में आनुवंशिक विश्लेषण के माध्यम से 'तिल्कायो' नामक बिल्ली की एक नई प्रजाति की पहचान की गई है। यह लगभग 1.4 मिलियन वर्ष पहले अन्य टाइगर बिल्लियों से अलग हुई थी।</w:t>
+        <w:t>नासा के रोमन स्पेस टेलीस्कोप में सटीक कोर्स सुधार और अतिरिक्त ईंधन बचत के कारण अब इसका परिचालन जीवनकाल मूल रूप से नियोजित 10 वर्षों से बढ़कर 22 वर्ष से अधिक होने का अनुमान है।</w:t>
       </w:r>
     </w:p>
     <w:p>
@@ -112,10 +112,10 @@
         <w:rPr>
           <w:b/>
         </w:rPr>
-        <w:t xml:space="preserve">• [सहर्ष विशेष शिक्षा कार्यक्रम (Saharsh Scheme)] </w:t>
+        <w:t xml:space="preserve">• [मेनिन (Menin) प्रोटीन और एजिंग] </w:t>
       </w:r>
       <w:r>
-        <w:t>त्रिपुरा राज्य सरकार द्वारा सामाजिक और भावनात्मक शिक्षा (Social and Emotional Learning) को बढ़ावा देने के लिए शुरू किया गया एक विशेष शिक्षा कार्यक्रम है।</w:t>
+        <w:t>वैज्ञानिकों ने पाया है कि मस्तिष्क में 'मेनिन' प्रोटीन के स्तर में गिरावट उम्र बढ़ने (एजिंग) की प्रक्रिया को तेज करती है। चूहों में इसे पुनर्स्थापित करने से संज्ञानात्मक गिरावट और हड्डियों की कमजोरी को उलटने में सफलता मिली है।</w:t>
       </w:r>
     </w:p>
     <w:p>
@@ -123,10 +123,10 @@
         <w:rPr>
           <w:b/>
         </w:rPr>
-        <w:t xml:space="preserve">• [आकांक्षी ब्लॉक कार्यक्रम (Aspirational Blocks Programme)] </w:t>
+        <w:t xml:space="preserve">• [तिलकायो (Tilcayo) बिल्ली प्रजाति] </w:t>
       </w:r>
       <w:r>
-        <w:t>वर्ष 2018 के आकांक्षी जिला कार्यक्रम की तर्ज पर शुरू किया गया कार्यक्रम, जिसका उद्देश्य देश के सबसे पिछड़े ब्लॉकों में नागरिक सेवाओं और बुनियादी ढांचे का विकास करना है।</w:t>
+        <w:t>बोलीविया में आनुवंशिक विश्लेषण के माध्यम से बाघ बिल्लियों (Tiger Cats) की एक नई प्रजाति 'तिलकायो' की पहचान की गई है, जो लगभग 1.4 मिलियन वर्ष पहले अन्य श्रेणियों से अलग हुई थी।</w:t>
       </w:r>
     </w:p>
     <w:p>
@@ -134,10 +134,10 @@
         <w:rPr>
           <w:b/>
         </w:rPr>
-        <w:t xml:space="preserve">• [छेरछेरा त्योहार (Cherchera Festival)] </w:t>
+        <w:t xml:space="preserve">• [ऑक्सफोर्ड इकोनॉमिक्स ग्लोबल सिटीज इंडेक्स] </w:t>
       </w:r>
       <w:r>
-        <w:t>यह छत्तीसगढ़ का एक पारंपरिक लोक त्योहार है, जो हिंदू कैलेंडर के 'पौष' माह की पूर्णिमा को दूधाधारी मठ, रायपुर सहित पूरे राज्य में हर्षोल्लास के साथ मनाया जाता है।</w:t>
+        <w:t>केरल की सांस्कृतिक राजधानी 'त्रिशूर' को ऑक्सफोर्ड इकोनॉमिक्स ग्लोबल सिटीज इंडेक्स में केरल में शीर्ष स्थान मिला है, जबकि भारतीय शहरों में यह सातवें स्थान पर है। वैश्विक स्तर पर न्यूयॉर्क शीर्ष पर है।</w:t>
       </w:r>
     </w:p>
     <w:p>
@@ -145,10 +145,10 @@
         <w:rPr>
           <w:b/>
         </w:rPr>
-        <w:t xml:space="preserve">• [अनाक क्राकाटाऊ ज्वालामुखी (Anak Krakatau)] </w:t>
+        <w:t xml:space="preserve">• [ध्रुव नेक्स्ट जनरेशन (NG) हेलीकॉप्टर] </w:t>
       </w:r>
       <w:r>
-        <w:t>इंडोनेशिया में स्थित इस सक्रिय ज्वालामुखी में सितंबर 2026 में भीषण विस्फोट हुआ, जिससे राख का गुबार वायुमंडल में 50,000 फीट की ऊंचाई तक पहुंच गया और विमान सेवाएं बाधित हुईं।</w:t>
+        <w:t>हिंदुस्तान एयरोनॉटिक्स लिमिटेड (HAL) ने पवन हंस लिमिटेड (PHL) को चार ध्रुव एनजी हेलीकॉप्टर सौंपे हैं, जो नागरिक उड्डयन क्षेत्र में इसके प्रवेश को चिह्नित करता है।</w:t>
       </w:r>
     </w:p>
     <w:p>
@@ -164,19 +164,19 @@
         <w:rPr>
           <w:b/>
         </w:rPr>
-        <w:t>प्रश्न [5 अंक - Paper 3]: संसदीय लोकतंत्र में लोक लेखा समिति (PAC) की भूमिका और संरचना को स्पष्ट कीजिए।</w:t>
+        <w:t>प्रश्न [5 अंक - Paper 3]: अमेरिकी प्रतिबंधों की 'द्वितीयक प्रतिबंध' (Secondary Sanctions) नीति क्या है और यह भारत को कैसे प्रभावित करती है?</w:t>
         <w:br/>
       </w:r>
       <w:r>
         <w:t>उत्तर ढांचा (~50 शब्द):</w:t>
         <w:br/>
-        <w:t>लोक लेखा समिति (PAC) भारत की सबसे पुरानी वित्तीय संसदीय समिति है, जिसका गठन सर्वप्रथम 1921 में हुआ था।</w:t>
+        <w:t xml:space="preserve">द्वितीयक प्रतिबंधों के तहत अमेरिका उन गैर-अमेरिकी देशों या कंपनियों को लक्षित करता है जो अमेरिकी प्रतिबंधों के अधीन देशों (जैसे रूस, ईरान) के साथ व्यापार करते हैं। </w:t>
         <w:br/>
-        <w:t>1. संरचना: इसमें कुल 22 सदस्य होते हैं (15 लोकसभा से और 7 राज्यसभा से), जिनका चुनाव आनुपातिक प्रतिनिधित्व प्रणाली द्वारा 1 वर्ष के लिए होता है। परंपरा के अनुसार इसका अध्यक्ष विपक्ष से होता है।</w:t>
+        <w:t>1. प्रभाव: यह भारत की रणनीतिक स्वायत्तता को चुनौती देता है, विशेषकर रूस से रियायती कच्चे तेल के आयात पर।</w:t>
         <w:br/>
-        <w:t>2. कार्य: यह भारत के नियंत्रक और महालेखा परीक्षक (CAG) की रिपोर्टों की जांच करती है और यह सुनिश्चित करती है कि संसद द्वारा स्वीकृत धन उसी मद में और कुशलतापूर्वक खर्च किया गया हो।</w:t>
+        <w:t>2. वित्तीय बाधाएं: इसके तहत भारतीय कंपनियों पर अमेरिकी वित्तीय प्रणाली और डॉलर-आधारित लेनदेन का उपयोग करने पर प्रतिबंध का जोखिम रहता है।</w:t>
         <w:br/>
-        <w:t>3. सीमाएं: इसके सुझाव केवल सलाहकार प्रकृति के होते हैं और यह नीतिगत निर्णयों की जांच नहीं कर सकती।</w:t>
+        <w:t>3. कूटनीतिक तनाव: यह भारत-अमेरिका द्विपक्षीय व्यापार वार्ताओं में जटिलता और दबाव उत्पन्न करता है।</w:t>
         <w:br/>
       </w:r>
     </w:p>
@@ -190,17 +190,19 @@
         <w:rPr>
           <w:b/>
         </w:rPr>
-        <w:t>प्रश्न [5 अंक - Paper 1]: मर्चेंट डिस्काउंट रेट (MDR) क्या है? यूपीआई (UPI) पर इसके प्रभाव की चर्चा कीजिए।</w:t>
+        <w:t>प्रश्न [5 अंक - Paper 1]: मर्चेंट डिस्काउंट रेट (MDR) क्या है और यूपीआई लेनदेन पर इसे शून्य रखने के क्या निहितार्थ हैं?</w:t>
         <w:br/>
       </w:r>
       <w:r>
         <w:t>उत्तर ढांचा (~50 शब्द):</w:t>
         <w:br/>
-        <w:t>मर्चेंट डिस्काउंट रेट (MDR) वह शुल्क है जो किसी व्यापारी से डिजिटल भुगतान (जैसे डेबिट/क्रेडिट कार्ड या यूपीआई) स्वीकार करने पर बैंक और भुगतान सेवा प्रदाताओं द्वारा लिया जाता है।</w:t>
+        <w:t>मर्चेंट डिस्काउंट रेट (MDR) वह शुल्क है जो एक व्यापारी को डिजिटल भुगतान स्वीकार करने के लिए बैंक और भुगतान सेवा प्रदाताओं को देना होता है।</w:t>
         <w:br/>
-        <w:t>1. यूपीआई पर प्रभाव: वर्तमान में सरकार ने यूपीआई पर शून्य-MDR नीति लागू कर रखी है, जिससे उपभोक्ताओं और व्यापारियों के लिए यह पूरी तरह निःशुल्क है।</w:t>
+        <w:t>1. सकारात्मक प्रभाव: यूपीआई पर शून्य एमडीआर ने भारत में डिजिटल भुगतान के लोकतंत्रीकरण और वित्तीय समावेशन को अभूतपूर्व बढ़ावा दिया है।</w:t>
         <w:br/>
-        <w:t>2. वित्तीय प्रभाव: शून्य-MDR ने भारत में डिजिटल वित्तीय समावेशन को अभूतपूर्व गति दी है, परंतु फिनटेक कंपनियों और बैंकों के राजस्व मॉडल पर दबाव डाला है, जिसके लिए सरकार उन्हें सब्सिडी प्रदान करती है।</w:t>
+        <w:t>2. नकारात्मक प्रभाव: भुगतान सेवा प्रदाताओं (Fintechs) और बैंकों के लिए राजस्व मॉडल कमजोर हुआ है, जिससे वे नवाचार और सुरक्षा बुनियादी ढांचे में निवेश करने में संकोच कर रहे हैं।</w:t>
+        <w:br/>
+        <w:t>3. वैश्विक विवाद: अमेरिका इसे एक व्यापार बाधा (Trade Barrier) के रूप में देखता है क्योंकि इसके कारण वीजा और मास्टरकार्ड जैसी अमेरिकी कंपनियां भारतीय बाजार में प्रतिस्पर्धा नहीं कर पा रही हैं।</w:t>
         <w:br/>
       </w:r>
     </w:p>
@@ -214,27 +216,34 @@
         <w:rPr>
           <w:b/>
         </w:rPr>
-        <w:t>प्रश्न [10 अंक - Paper 3]: अमेरिकी सीनेट द्वारा रूसी तेल आयातकों पर लगाए जाने वाले संभावित प्रतिबंधों का भारत की ऊर्जा सुरक्षा और रणनीतिक स्वायत्तता पर पड़ने वाले प्रभावों का आलोचनात्मक विश्लेषण कीजिए।</w:t>
+        <w:t>प्रश्न [10 अंक - Paper 3]: कृत्रिम बुद्धिमत्ता (AI) के विस्तार के साथ वैश्विक डेटा केंद्रों (Data Centres) के तीव्र विकास के पर्यावरणीय और सामाजिक-आर्थिक प्रभावों का आलोचनात्मक विश्लेषण कीजिए।</w:t>
         <w:br/>
       </w:r>
       <w:r>
-        <w:t>भूमिका: हाल ही में अमेरिकी सीनेट ने एक विधेयक पारित किया है जो राष्ट्रपति को रूसी कच्चे तेल का आयात करने वाले शीर्ष पांच देशों पर 100% तक टैरिफ और प्रतिबंध लगाने की शक्ति देता है। भारत वर्तमान में अपनी कुल तेल आवश्यकताओं का लगभग 51% रूस से आयात करता है, जिससे यह मुद्दा भारत के लिए अत्यंत संवेदनशील हो गया है।</w:t>
+        <w:t>भूमिका: कृत्रिम बुद्धिमत्ता (AI) और क्लाउड कंप्यूटिंग के युग में डेटा केंद्र आधुनिक डिजिटल अर्थव्यवस्था की रीढ़ बन गए हैं, लेकिन इनका तीव्र विस्तार गंभीर पर्यावरणीय और स्थानीय सामाजिक-आर्थिक चुनौतियां उत्पन्न कर रहा है।</w:t>
         <w:br/>
       </w:r>
       <w:r>
-        <w:t>मुख्य भाग: भारत पर पड़ने वाले बहुआयामी प्रभाव:</w:t>
+        <w:t>मुख्य भाग: 1. पर्यावरणीय प्रभाव:</w:t>
         <w:br/>
-        <w:t>1. ऊर्जा सुरक्षा पर खतरा: पश्चिम एशिया में भू-राजनीतिक तनाव (जैसे स्ट्रेट ऑफ हॉर्मुज और बाबल मंदब का अवरुद्ध होना) के कारण भारत के लिए रूस से रियायती दरों पर मिलने वाला तेल ऊर्जा सुरक्षा का मुख्य आधार है। प्रतिबंधों से आपूर्ति श्रृंखला बाधित हो सकती है।</w:t>
+        <w:t>- अत्यधिक जल खपत: डेटा केंद्रों को ठंडा रखने के लिए भारी मात्रा में पानी की आवश्यकता होती है। 'रिस्टैड एनर्जी' के अनुसार, वैश्विक डेटा केंद्रों की जल खपत 2025 में 222 बिलियन लीटर से बढ़कर 2030 तक 644 बिलियन लीटर हो सकती है।</w:t>
         <w:br/>
-        <w:t>2. राजकोषीय घाटा और मुद्रास्फीति: यदि भारत को महंगे अमेरिकी या अन्य वैकल्पिक तेल स्रोतों पर निर्भर होना पड़ा, तो भारत का आयात बिल बढ़ेगा, जिससे चालू खाता घाटा (CAD) और घरेलू मुद्रास्फीति (विशेषकर एलपीजी और ईंधन की कीमतों में) में वृद्धि होगी।</w:t>
+        <w:t>- ऊर्जा की भारी मांग: ये केंद्र अत्यधिक बिजली की खपत करते हैं, जिससे कई क्षेत्रों में कोयला आधारित बिजली संयंत्रों पर निर्भरता बढ़ रही है, जो डीकार्बोनाइजेशन लक्ष्यों के विपरीत है।</w:t>
         <w:br/>
-        <w:t>3. रणनीतिक स्वायत्तता की परीक्षा: यह स्थिति भारत की स्वतंत्र विदेश नीति के लिए एक बड़ी चुनौती है। भारत संयुक्त राष्ट्र सुरक्षा परिषद (UNSC) के प्रतिबंधों को तो मानता है, परंतु किसी देश के एकतरफा प्रतिबंधों को स्वीकार नहीं करता।</w:t>
+        <w:t>- हीट आइलैंड प्रभाव: डेटा केंद्रों के 10 किमी के दायरे में स्थानीय तापमान में 9 डिग्री सेल्सियस तक की वृद्धि देखी गई है।</w:t>
         <w:br/>
-        <w:t>4. डॉलर बनाम स्थानीय मुद्रा व्यापार: रूस भारत को स्थानीय मुद्रा (रुपया-रूबल) और विलंबित भुगतान की सुविधा देता है। अमेरिकी प्रतिबंध इस वित्तीय तंत्र को बाधित करने का प्रयास हैं।</w:t>
+        <w:br/>
+        <w:t>2. सामाजिक-आर्थिक प्रभाव और विनियामक चुनौतियां:</w:t>
+        <w:br/>
+        <w:t>- स्थानीय समुदायों के साथ संघर्ष: चिली के सेरिलोस (Cerrillos) में गूगल के डेटा सेंटर प्रोजेक्ट का स्थानीय निवासियों (MOSACAT आंदोलन) द्वारा जल संकट के कारण कड़ा विरोध किया गया, जिसके कारण गूगल को अपनी योजना बदलनी पड़ी।</w:t>
+        <w:br/>
+        <w:t>- रोजगार का भ्रम: ये विशाल बुनियादी ढांचे अत्यधिक पूंजी-गहन होते हैं लेकिन स्थानीय स्तर पर केवल 50-60 कुशल नौकरियां ही सृजित करते हैं।</w:t>
+        <w:br/>
+        <w:t>- संप्रभुता और डेटा निष्कर्षण: विकासशील देश (ग्लोबल साउथ) केवल डेटा भंडारण के केंद्र बन रहे हैं, जबकि इसका आर्थिक लाभ ग्लोबल नॉर्थ की बहुराष्ट्रीय कंपनियों को मिल रहा है।</w:t>
         <w:br/>
       </w:r>
       <w:r>
-        <w:t>निष्कर्ष: भारत को अपनी ऊर्जा सुरक्षा बनाए रखने के लिए अमेरिका के साथ कूटनीतिक बातचीत तेज करनी होगी, साथ ही घरेलू स्तर पर रणनीतिक पेट्रोलियम भंडार (SPR) का विस्तार और ऊर्जा स्रोतों का विविधीकरण करना होगा।</w:t>
+        <w:t>निष्कर्ष: आगे की राह के रूप में, भारत जैसे उभरते बाजारों को डेटा केंद्रों के लिए सख्त 'जल उपयोग प्रभावशीलता' (WUE) मानक लागू करने चाहिए, शुष्क शीतलन (Dry Cooling) तकनीकों को अनिवार्य करना चाहिए और स्थानीय समुदायों की भागीदारी के साथ पर्यावरण प्रभाव आकलन (EIA) को सुदृढ़ करना चाहिए।</w:t>
         <w:br/>
       </w:r>
     </w:p>
@@ -248,68 +257,41 @@
         <w:rPr>
           <w:b/>
         </w:rPr>
-        <w:t>प्रश्न [10 अंक - Paper 3]: राष्ट्रीय शिक्षा नीति (NEP) 2020 के तहत 'त्रि-भाषा सूत्र' (Three-Language Formula) के क्रियान्वयन से जुड़े विवादों और इसके व्यावहारिक समाधानों की समीक्षा कीजिए।</w:t>
+        <w:t>प्रश्न [10 अंक - Paper 3]: चीन द्वारा ब्रह्मपुत्र (यारलंग जंगपो) नदी पर बनाए जा रहे विशाल बांधों के सामरिक खतरों का मूल्यांकन कीजिए तथा भारत द्वारा इसके प्रत्युत्तर में प्रस्तावित सियांग नदी बहुउद्देशीय परियोजना की चुनौतियों का विश्लेषण कीजिए।</w:t>
         <w:br/>
       </w:r>
       <w:r>
-        <w:t>भूमिका: त्रि-भाषा सूत्र का विचार सर्वप्रथम 1968 की शिक्षा नीति में कोठारी आयोग की सिफारिशों पर आया था। राष्ट्रीय शिक्षा नीति 2020 भी इसे आगे बढ़ाती है, परंतु इसके क्रियान्वयन को लेकर हाल ही में सर्वोच्च न्यायालय और विभिन्न राज्यों के बीच कानूनी व कूटनीतिक बहस छिड़ गई है।</w:t>
+        <w:t>भूमिका: चीन द्वारा तिब्बत के मेडोग (Medog) में ब्रह्मपुत्र नदी पर विश्व का सबसे बड़ा जलविद्युत बांध बनाने की योजना भारत की जल सुरक्षा, संप्रभुता और उत्तर-पूर्वी क्षेत्र की पारिस्थितिकी के लिए एक गंभीर सामरिक चुनौती है।</w:t>
         <w:br/>
       </w:r>
       <w:r>
-        <w:t>मुख्य भाग: मुख्य विवाद और चुनौतियां:</w:t>
+        <w:t>मुख्य भाग: 1. चीन के बांधों से सामरिक खतरे:</w:t>
         <w:br/>
-        <w:t>1. हिंदी थोपने का आरोप: दक्षिणी राज्यों (विशेषकर तमिलनाडु) का आरोप है कि त्रि-भाषा सूत्र के माध्यम से केंद्र सरकार अप्रत्यक्ष रूप से गैर-हिंदी भाषी राज्यों पर हिंदी थोपने का प्रयास कर रही है।</w:t>
+        <w:t>- जल प्रवाह का नियंत्रण: चीन निचले रिपेरियन राज्यों (भारत और बांग्लादेश) की ओर जाने वाले पानी के प्रवाह को नियंत्रित या बाधित कर सकता है।</w:t>
         <w:br/>
-        <w:t>2. अंग्रेजी की स्थिति: एनईपी 2020 के तहत तीन में से दो भाषाएं भारतीय (नेटिव) होनी चाहिए और एक विदेशी भाषा। यदि अंग्रेजी को विदेशी भाषा माना जाता है, तो छात्र अन्य वैश्विक भाषाएं (जैसे फ्रेंच, जर्मन) सीखने से वंचित रह जाएंगे क्योंकि वे अंग्रेजी को ही चुनेंगे। अंग्रेजी को भारतीय नेटिव भाषा घोषित करने की मांग उठ रही है।</w:t>
+        <w:t>- कृत्रिम बाढ़ का खतरा: युद्ध या तनाव की स्थिति में चीन द्वारा अचानक भारी मात्रा में पानी छोड़े जाने से असम और अरुणाचल प्रदेश में विनाशकारी बाढ़ आ सकती है।</w:t>
         <w:br/>
-        <w:t>3. बुनियादी ढांचे और शिक्षकों की कमी: बहुभाषी शिक्षा के लिए योग्य शिक्षकों और पाठ्यपुस्तकों का भारी अभाव है।</w:t>
+        <w:t>- डेटा साझाकरण का अभाव: दोनों देशों के बीच कोई औपचारिक जल-साझाकरण संधि नहीं है, जिससे चीन की गतिविधियों में पारदर्शिता का अभाव रहता है।</w:t>
         <w:br/>
-        <w:t>4. मध्य-सत्र क्रियान्वयन: सर्वोच्च न्यायालय ने चिंता व्यक्त की है कि शैक्षणिक सत्र के बीच में इसे लागू करने से छात्रों पर मानसिक दबाव बढ़ेगा, अतः इसे 2027 के नए सत्र से लागू किया जाना चाहिए।</w:t>
+        <w:t>- भूकंपीय संवेदनशीलता: यह क्षेत्र अत्यधिक सक्रिय भूकंपीय जोन (Zone V) में आता है, जहां बड़े बांधों का निर्माण बड़े पैमाने पर तबाही का कारण बन सकता है।</w:t>
+        <w:br/>
+        <w:br/>
+        <w:t>2. भारत की जवाबी रणनीति - सियांग बहुउद्देशीय परियोजना:</w:t>
+        <w:br/>
+        <w:t>- भारत अरुणाचल प्रदेश में सियांग नदी पर 11,000 मेगावाट की विशाल जलविद्युत और बाढ़ नियंत्रण परियोजना की योजना बना रहा है ताकि चीन द्वारा छोड़े गए पानी को स्टोर किया जा सके।</w:t>
+        <w:br/>
+        <w:br/>
+        <w:t>3. सियांग परियोजना की स्थानीय चुनौतियां:</w:t>
+        <w:br/>
+        <w:t>- विस्थापन और पुनर्वास: स्थानीय स्वदेशी समुदायों को अपनी पैतृक भूमि से विस्थापित होने का डर है, जिससे वहां भारी जन-आक्रोश और विरोध प्रदर्शन हो रहे हैं।</w:t>
+        <w:br/>
+        <w:t>- पारिस्थितिकीय क्षति: विशाल जलाशय के निर्माण से समृद्ध जैव विविधता वाले वन क्षेत्र जलमग्न हो जाएंगे।</w:t>
+        <w:br/>
+        <w:t>- भूकंपीय जोखिम: भारत का प्रस्तावित बांध भी उसी संवेदनशील टेक्टोनिक बेल्ट में स्थित है, जो सुरक्षा चिंताओं को बढ़ाता है।</w:t>
         <w:br/>
       </w:r>
       <w:r>
-        <w:t>निष्कर्ष: समाधान के रूप में राज्यों को भाषा चयन की पूर्ण स्वायत्तता दी जानी चाहिए, अंग्रेजी को व्यावहारिक रूप से नेटिव श्रेणी में शामिल करने पर विचार हो, और भाषाई बुनियादी ढांचे के विकास के बाद ही इसे चरणबद्ध तरीके से लागू किया जाए।</w:t>
-        <w:br/>
-      </w:r>
-    </w:p>
-    <w:p>
-      <w:r>
-        <w:t>-----------------------------------</w:t>
-      </w:r>
-    </w:p>
-    <w:p>
-      <w:r>
-        <w:rPr>
-          <w:b/>
-        </w:rPr>
-        <w:t>प्रश्न [10 अंक - Paper 1]: चीन द्वारा ब्रह्मपुत्र नदी पर बनाए जा रहे 'मिडॉग बांध' के रणनीतिक खतरों का विश्लेषण कीजिए तथा इसके प्रत्युत्तर में भारत की 'सियांग बहुउद्देशीय परियोजना' के महत्व को रेखांकित कीजिए।</w:t>
-        <w:br/>
-      </w:r>
-      <w:r>
-        <w:t>भूमिका: चीन तिब्बत में यारलंग जंगपो (ब्रह्मपुत्र) नदी पर विश्व का सबसे बड़ा जलविद्युत बांध 'मिडॉग' (Medog Dam) बना रहा है। यह परियोजना भारत के उत्तर-पूर्वी राज्यों के लिए गंभीर रणनीतिक, पर्यावरणीय और आर्थिक चिंताएं उत्पन्न करती है।</w:t>
-        <w:br/>
-      </w:r>
-      <w:r>
-        <w:t>मुख्य भाग: चीन के मिडॉग बांध से उत्पन्न रणनीतिक खतरे:</w:t>
-        <w:br/>
-        <w:t>1. जल प्रवाह का नियंत्रण: चीन निचले रिपेरियन राज्य (भारत और बांग्लादेश) की ओर जल प्रवाह को नियंत्रित कर सकता है, जिससे सूखे या अचानक कृत्रिम बाढ़ (Flash Floods) का खतरा पैदा हो सकता है।</w:t>
-        <w:br/>
-        <w:t>2. डेटा साझाकरण का अभाव: दोनों देशों के बीच कोई औपचारिक जल-साझाकरण संधि नहीं है, जिससे चीन की गतिविधियों की पारदर्शी जानकारी नहीं मिल पाती।</w:t>
-        <w:br/>
-        <w:t>3. पारिस्थितिकीय असंतुलन: यह क्षेत्र अत्यधिक भूकंप-संवेदनशील (Seismic Zone V) है। इतने बड़े जलाशय से भूकंपीय गतिविधियां बढ़ सकती हैं और गाद (Sedimentation) का प्रवाह रुकने से उत्तर-पूर्व की भूमि की उर्वरता प्रभावित होगी।</w:t>
-        <w:br/>
-        <w:br/>
-        <w:t>भारत की 'सियांग बहुउद्देशीय परियोजना' का महत्व:</w:t>
-        <w:br/>
-        <w:t>1. बाढ़ नियंत्रण और जल भंडारण: अरुणाचल प्रदेश में सियांग नदी पर प्रस्तावित यह 11,000 मेगावाट की परियोजना चीन द्वारा अचानक छोड़े गए पानी को स्टोर करने के लिए एक बफर (Buffer) का कार्य करेगी।</w:t>
-        <w:br/>
-        <w:t>2. रणनीतिक जवाबी उपाय (Counter-measure): यह परियोजना अंतरराष्ट्रीय मंचों पर भारत के 'लोअर रिपेरियन राइट्स' (उपयोगकर्ता अधिकार) को मजबूत करेगी।</w:t>
-        <w:br/>
-        <w:t>3. स्थानीय चिंताएं: हालांकि, इस बांध के निर्माण से स्थानीय जनजातियों के विस्थापन, पर्यावरण विनाश और भूकंपीय खतरों को लेकर स्थानीय स्तर पर कड़ा विरोध हो रहा है।</w:t>
-        <w:br/>
-      </w:r>
-      <w:r>
-        <w:t>निष्कर्ष: भारत को स्थानीय समुदायों को विश्वास में लेकर, उचित पुनर्वास और पर्यावरणीय प्रभाव आकलन (EIA) के साथ इस परियोजना को रणनीतिक सुरक्षा के रूप में आगे बढ़ाना चाहिए।</w:t>
+        <w:t>निष्कर्ष: चीन की जल-आक्रामकता का मुकाबला करने के लिए भारत को केवल विशाल बांधों पर निर्भर रहने के बजाय स्थानीय समुदायों को विश्वास में लेकर पर्यावरण-अनुकूल विकेंद्रीकृत जल भंडारण प्रणालियों का विकास करना चाहिए और अंतरराष्ट्रीय मंचों पर जल-कूटनीति को तेज करना चाहिए।</w:t>
         <w:br/>
       </w:r>
     </w:p>
@@ -331,11 +313,11 @@
         <w:rPr>
           <w:b/>
         </w:rPr>
-        <w:t>विषय: अमेरिकी प्रतिबंध और भारत पर दबाव (US Sanctions &amp; Pressure on India)</w:t>
+        <w:t>विषय: पिग्मी हॉग (Pygmy Hog) संरक्षण</w:t>
         <w:br/>
       </w:r>
       <w:r>
-        <w:t>शिक्षक व्याख्यान एवं ट्रिक्स: प्रशांत सर (UPSC Wallah) ने समझाया कि अमेरिकी सीनेट द्वारा पारित नया कानून सीधे तौर पर उन शीर्ष 5 देशों को लक्षित करता है जो रूस से तेल आयात कर रहे हैं। डोनाल्ड ट्रंप ने भारत पर 'ट्रेड असंतुलन' और 'अवैध दवाओं के उत्पादन' का आरोप लगाकर दबाव बनाने की रणनीति अपनाई है। अमेरिका चाहता है कि भारत रूस से तेल खरीदना बंद कर अमेरिका से खरीदे, भले ही अमेरिकी तेल महंगा हो और उसके भुगतान नियम कड़े हों।</w:t>
+        <w:t>शिक्षक व्याख्यान एवं ट्रिक्स: प्रशांत सर ने बताया कि पिग्मी हॉग विश्व का सबसे छोटा और दुर्लभ जंगली सुअर है। यह केवल असम के मानस राष्ट्रीय उद्यान में पाया जाता है। इसका आईयूसीएन दर्जा 'Endangered' (संकटग्रस्त) है। इसके संरक्षण के लिए इसके प्राकृतिक आवास 'तराई घासभूमि' (Tall Grasslands) को बचाना अत्यंत आवश्यक है।</w:t>
         <w:br/>
       </w:r>
       <w:r>
@@ -343,19 +325,19 @@
         <w:br/>
       </w:r>
       <w:r>
-        <w:t xml:space="preserve">  • भारत अपनी ऊर्जा सुरक्षा के लिए रूस के रियायती तेल और रुपया-रूबल भुगतान प्रणाली पर अत्यधिक निर्भर है।</w:t>
+        <w:t xml:space="preserve">  • पिग्मी हॉग संकेतक प्रजाति (Indicator Species) है जो गीली घासभूमि के स्वास्थ्य को दर्शाती है।</w:t>
         <w:br/>
       </w:r>
       <w:r>
-        <w:t xml:space="preserve">  • अमेरिका इस 'परस्पर निर्भरता' (Interdependence) को भारत के खिलाफ एक हथियार (Weaponization of Trade) के रूप में इस्तेमाल कर रहा है।</w:t>
+        <w:t xml:space="preserve">  • असम का मानस नेशनल पार्क इसके संरक्षण का मुख्य केंद्र है।</w:t>
         <w:br/>
       </w:r>
       <w:r>
-        <w:t xml:space="preserve">  • चीन की तरह भारत सीधे तौर पर अमेरिकी प्रतिबंधों का कड़ा विरोध नहीं कर सकता क्योंकि भारत की तकनीकी और रणनीतिक निर्भरता अमेरिका पर अधिक है।</w:t>
+        <w:t xml:space="preserve">  • आवास विखंडन और अनियंत्रित आग इसके अस्तित्व के लिए सबसे बड़े खतरे हैं।</w:t>
         <w:br/>
       </w:r>
       <w:r>
-        <w:t>💡 परीक्षा टिप: मुख्य परीक्षा में 'रणनीतिक स्वायत्तता' (Strategic Autonomy) पर प्रश्न आने पर इस प्रतिबंध मुद्दे को 'आर्थिक कूटनीति' और 'ऊर्जा विविधीकरण' के उदाहरण के रूप में लिखें। उत्तर में 'वॉर रूम' (बहु-क्षेत्रीय समन्वय समिति) के गठन का सुझाव दें।</w:t>
+        <w:t>💡 परीक्षा टिप: प्रारंभिक परीक्षा में पिग्मी हॉग के आईयूसीएन दर्जे और उसके विशिष्ट आवास (Wet Grasslands) पर सीधे मिलान वाले प्रश्न पूछे जा सकते हैं।</w:t>
         <w:br/>
       </w:r>
     </w:p>
@@ -369,11 +351,11 @@
         <w:rPr>
           <w:b/>
         </w:rPr>
-        <w:t>विषय: सियांग नदी बांध परियोजना और चीनी चुनौती (Siang River Dam &amp; Chinese Challenge)</w:t>
+        <w:t>विषय: त्रि-भाषा सूत्र (Three-Language Formula) और एनईपी 2020</w:t>
         <w:br/>
       </w:r>
       <w:r>
-        <w:t>शिक्षक व्याख्यान एवं ट्रिक्स: शिक्षक ने मानचित्र के माध्यम से समझाया कि तिब्बत से निकलने वाली यारलंग जंगपो नदी भारत में ब्रह्मपुत्र (अरुणाचल में सियांग) के रूप में प्रवेश करती है। चीन इस पर 'मिडॉग' नामक दुनिया का सबसे बड़ा बांध बना रहा है। इसके प्रत्युत्तर में भारत सियांग नदी पर एक विशाल जल भंडारण बांध (Siang Upper Multipurpose Project) बना रहा है, जो बाढ़ नियंत्रण और जल सुरक्षा सुनिश्चित करेगा।</w:t>
+        <w:t>शिक्षक व्याख्यान एवं ट्रिक्स: शिक्षक ने कोठारी आयोग (1964-66) की सिफारिशों से लेकर राष्ट्रीय शिक्षा नीति 2020 तक त्रि-भाषा सूत्र के विकास को समझाया। एनईपी 2020 के तहत छात्रों को तीन भाषाएं सीखनी होंगी, जिनमें से कम से कम दो भारतीय मूल (Native) की होनी चाहिए। इसमें अंग्रेजी को एक विदेशी भाषा के रूप में माना गया है।</w:t>
         <w:br/>
       </w:r>
       <w:r>
@@ -381,57 +363,19 @@
         <w:br/>
       </w:r>
       <w:r>
-        <w:t xml:space="preserve">  • चीन का मिडॉग बांध निचले रिपेरियन राज्यों (भारत-बांग्लादेश) के जल प्रवाह को बाधित कर सकता है।</w:t>
+        <w:t xml:space="preserve">  • एनईपी 2020 में हिंदी को अनिवार्य नहीं बनाया गया है, जिससे भाषाई संघवाद को मजबूती मिलती है।</w:t>
         <w:br/>
       </w:r>
       <w:r>
-        <w:t xml:space="preserve">  • भारत का सियांग बांध केवल बिजली उत्पादन (11,000 MW) के लिए नहीं, बल्कि चीन द्वारा छोड़े गए पानी को रोकने (Flood Control) के लिए एक रणनीतिक जलाशय है।</w:t>
+        <w:t xml:space="preserve">  • सुप्रीम कोर्ट ने सरकार से इसे शैक्षणिक सत्र के बीच में लागू करने के बजाय 2027 से कक्षा 6 से सुचारू रूप से लागू करने को कहा है।</w:t>
         <w:br/>
       </w:r>
       <w:r>
-        <w:t xml:space="preserve">  • स्थानीय स्तर पर इस बांध का विरोध विस्थापन और भूकंपीय संवेदनशीलता (Seismic Zone) के कारण हो रहा है।</w:t>
+        <w:t xml:space="preserve">  • भाषाई बुनियादी ढांचे और योग्य शिक्षकों की कमी इस नीति के क्रियान्वयन में सबसे बड़ी बाधा है।</w:t>
         <w:br/>
       </w:r>
       <w:r>
-        <w:t>💡 परीक्षा टिप: प्रारंभिक परीक्षा के लिए यारलंग जंगपो, सियांग, दिबांग, लोहित नदियों के प्रवाह क्रम और उनकी सहायक नदियों की मैपिंग अच्छे से तैयार करें। मुख्य परीक्षा में जल-कूटनीति (Hydro-diplomacy) के तहत इसे शामिल करें।</w:t>
-        <w:br/>
-      </w:r>
-    </w:p>
-    <w:p>
-      <w:r>
-        <w:t>-----------------------------------</w:t>
-      </w:r>
-    </w:p>
-    <w:p>
-      <w:r>
-        <w:rPr>
-          <w:b/>
-        </w:rPr>
-        <w:t>विषय: त्रि-भाषा सूत्र और एनईपी 2020 (Three-Language Formula &amp; NEP 2020)</w:t>
-        <w:br/>
-      </w:r>
-      <w:r>
-        <w:t>शिक्षक व्याख्यान एवं ट्रिक्स: प्रशांत सर ने कोठारी आयोग (1968) से लेकर एनईपी 2020 तक त्रि-भाषा सूत्र के विकास को स्पष्ट किया। एनईपी 2020 के तहत छात्रों को तीन भाषाएं सीखनी होंगी, जिनमें से दो भारतीय (नेटिव) और एक विदेशी भाषा होगी। सर्वोच्च न्यायालय ने इसे शैक्षणिक सत्र के बीच में लागू करने के बजाय 2027 से चरणबद्ध तरीके से लागू करने का सुझाव दिया है ताकि छात्र और शिक्षक मानसिक रूप से तैयार हो सकें।</w:t>
-        <w:br/>
-      </w:r>
-      <w:r>
-        <w:t>क्लास के मुख्य बिंदु:</w:t>
-        <w:br/>
-      </w:r>
-      <w:r>
-        <w:t xml:space="preserve">  • एनईपी 2020 में हिंदी को अनिवार्य नहीं किया गया है, बल्कि दो नेटिव भाषाओं के चयन की स्वतंत्रता दी गई है।</w:t>
-        <w:br/>
-      </w:r>
-      <w:r>
-        <w:t xml:space="preserve">  • अंग्रेजी को 'विदेशी भाषा' की श्रेणी में रखने से छात्रों के पास अन्य वैश्विक भाषाएं सीखने के विकल्प सीमित हो जाते हैं।</w:t>
-        <w:br/>
-      </w:r>
-      <w:r>
-        <w:t xml:space="preserve">  • भाषाई बुनियादी ढांचे और योग्य शिक्षकों की उपलब्धता इस नीति की सफलता की पूर्व शर्त है।</w:t>
-        <w:br/>
-      </w:r>
-      <w:r>
-        <w:t>💡 परीक्षा टिप: जीएस पेपर 2 (शिक्षा नीति) में त्रि-भाषा सूत्र पर उत्तर लिखते समय 'सहकारी संघवाद' (Cooperative Federalism) और 'भाषाई विविधता का संरक्षण' (अनुच्छेद 29 और 30) के संवैधानिक प्रावधानों का उल्लेख अवश्य करें।</w:t>
+        <w:t>💡 परीक्षा टिप: जीएस पेपर 2 में भाषाई नीति, संघवाद और कोठारी आयोग की सिफारिशों के आलोचनात्मक मूल्यांकन पर 10-अंक का प्रश्न तैयार करें।</w:t>
         <w:br/>
       </w:r>
     </w:p>
@@ -449,7 +393,7 @@
         <w:br/>
       </w:r>
       <w:r>
-        <w:t>शिक्षक व्याख्यान एवं ट्रिक्स: शिक्षक ने पीएसी की ऐतिहासिक पृष्ठभूमि (1921 मोंटेग्यू-चेम्सफोर्ड सुधार) और इसकी कार्यप्रणाली पर विस्तृत प्रकाश डाला। पीएसी संसद का एक ऐसा उपकरण है जो सरकारी खर्चों की कड़ाई से निगरानी करता है। यह कैग (CAG) की रिपोर्टों का ऑडिट करती है। कैग को पीएसी का 'मित्र, दार्शनिक और मार्गदर्शक' कहा जाता है।</w:t>
+        <w:t>शिक्षक व्याख्यान एवं ट्रिक्स: शिक्षक ने पीएसी की ऐतिहासिक पृष्ठभूमि (स्थापना 1921, मोंटेग्यू-चेम्सफोर्ड सुधार 1919 के तहत) और इसकी संरचना को स्पष्ट किया। इसमें कुल 22 सदस्य होते हैं (15 लोकसभा + 7 राज्यसभा)। इसका मुख्य कार्य कैग (CAG) की ऑडिट रिपोर्ट की जांच करना और सरकारी खर्चों की वित्तीय जवाबदेही तय करना है।</w:t>
         <w:br/>
       </w:r>
       <w:r>
@@ -457,19 +401,259 @@
         <w:br/>
       </w:r>
       <w:r>
-        <w:t xml:space="preserve">  • पीएसी में कुल 22 सदस्य होते हैं (15 लोकसभा, 7 राज्यसभा) और कोई भी मंत्री इसका सदस्य नहीं बन सकता।</w:t>
+        <w:t xml:space="preserve">  • पीएसी का अध्यक्ष पारंपरिक रूप से (1967 से) विपक्ष का सदस्य होता है, जिसे लोकसभा अध्यक्ष द्वारा नियुक्त किया जाता है।</w:t>
         <w:br/>
       </w:r>
       <w:r>
-        <w:t xml:space="preserve">  • 1967 से स्थापित परंपरा के अनुसार इसका अध्यक्ष हमेशा मुख्य विपक्षी दल से चुना जाता है।</w:t>
+        <w:t xml:space="preserve">  • कोई भी मंत्री इस समिति का सदस्य नहीं बन सकता।</w:t>
         <w:br/>
       </w:r>
       <w:r>
-        <w:t xml:space="preserve">  • इसके निर्णय केवल सिफारिशी होते हैं, यह सरकार पर बाध्यकारी नहीं होते और यह केवल 'पोस्टमार्टम' (खर्च होने के बाद) जांच कर सकती है।</w:t>
+        <w:t xml:space="preserve">  • समिति की सिफारिशें केवल सलाहकार प्रकृति की होती हैं, बाध्यकारी नहीं।</w:t>
         <w:br/>
       </w:r>
       <w:r>
-        <w:t>💡 परीक्षा टिप: आरपीएससी और यूपीएससी प्रारंभिक परीक्षा में पीएसी, प्राकलन समिति (Estimates Committee) और सार्वजनिक उपक्रमों की समिति के बीच तुलनात्मक अंतर (सदस्य संख्या, प्रतिनिधित्व) पर सीधे प्रश्न पूछे जाते हैं, इसे सारणीबद्ध रूप में याद करें।</w:t>
+        <w:t>💡 परीक्षा टिप: आरपीएससी मुख्य परीक्षा पेपर 3 (लोक प्रशासन) के लिए पीएसी और कैग के बीच 'मित्र, दार्शनिक और मार्गदर्शक' के संबंध पर 50 शब्दों का उत्तर तैयार रखें।</w:t>
+        <w:br/>
+      </w:r>
+    </w:p>
+    <w:p>
+      <w:r>
+        <w:t>-----------------------------------</w:t>
+      </w:r>
+    </w:p>
+    <w:p>
+      <w:r>
+        <w:rPr>
+          <w:b/>
+        </w:rPr>
+        <w:t>विषय: अमेरिकी प्रतिबंध और भारत की रणनीतिक स्वायत्तता</w:t>
+        <w:br/>
+      </w:r>
+      <w:r>
+        <w:t>शिक्षक व्याख्यान एवं ट्रिक्स: प्रशांत सर ने अमेरिकी सीनेट द्वारा पारित नए कानून का विश्लेषण किया, जो अमेरिकी राष्ट्रपति को रूस से तेल खरीदने वाले शीर्ष 5 देशों पर 100% तक टैरिफ लगाने की शक्ति देता है। यह भारत के रूसी तेल आयात (जो वर्तमान में भारत के कुल आयात का 51% है) को सीधे प्रभावित कर सकता है।</w:t>
+        <w:br/>
+      </w:r>
+      <w:r>
+        <w:t>क्लास के मुख्य बिंदु:</w:t>
+        <w:br/>
+      </w:r>
+      <w:r>
+        <w:t xml:space="preserve">  • अमेरिका भारत पर दबाव बनाने के लिए अपनी आर्थिक और तकनीकी निर्भरता को 'वेपनाइज' (Weaponize) कर रहा है।</w:t>
+        <w:br/>
+      </w:r>
+      <w:r>
+        <w:t xml:space="preserve">  • भारत अपनी ऊर्जा सुरक्षा और मुद्रा बचत (स्थानीय मुद्रा व्यापार) के कारण रूसी तेल आयात बंद नहीं कर सकता।</w:t>
+        <w:br/>
+      </w:r>
+      <w:r>
+        <w:t xml:space="preserve">  • चीन के विपरीत, भारत के पास अमेरिका के खिलाफ मजबूत आर्थिक प्रतिरोध (Resilience) की कमी है।</w:t>
+        <w:br/>
+      </w:r>
+      <w:r>
+        <w:t>💡 परीक्षा टिप: मुख्य परीक्षा में 'आर्थिक प्रतिबंधों के युग में भारत की रणनीतिक स्वायत्तता की रक्षा' विषय पर निबंध या जीएस-2 उत्तर में इसका उपयोग करें।</w:t>
+        <w:br/>
+      </w:r>
+    </w:p>
+    <w:p>
+      <w:r>
+        <w:t>-----------------------------------</w:t>
+      </w:r>
+    </w:p>
+    <w:p>
+      <w:r>
+        <w:rPr>
+          <w:b/>
+        </w:rPr>
+        <w:t>विषय: आर्थिक कूटनीति हेतु 'वॉर रूम' (War Room) का प्रस्ताव</w:t>
+        <w:br/>
+      </w:r>
+      <w:r>
+        <w:t>शिक्षक व्याख्यान एवं ट्रिक्स: सैयद अकबरुद्दीन के लेख का हवाला देते हुए शिक्षक ने सुझाव दिया कि भारत को अमेरिकी प्रतिबंधों और भू-राजनीतिक झटकों से निपटने के लिए एक बहु-क्षेत्रीय 'वॉर रूम' बनाना चाहिए। इसमें विदेश मंत्रालय, वित्त, वाणिज्य, ऊर्जा, नौवहन और रक्षा मंत्रालयों का समन्वय होना चाहिए।</w:t>
+        <w:br/>
+      </w:r>
+      <w:r>
+        <w:t>क्लास के मुख्य बिंदु:</w:t>
+        <w:br/>
+      </w:r>
+      <w:r>
+        <w:t xml:space="preserve">  • एकल मंत्रालय दृष्टिकोण के बजाय एकीकृत संकट प्रबंधन की आवश्यकता है।</w:t>
+        <w:br/>
+      </w:r>
+      <w:r>
+        <w:t xml:space="preserve">  • रणनीतिक पेट्रोलियम भंडार (SPR) की तरह भारत को एलपीजी और अन्य आवश्यक गैसों के लिए भी दीर्घकालिक भंडारण क्षमता विकसित करनी होगी।</w:t>
+        <w:br/>
+      </w:r>
+      <w:r>
+        <w:t xml:space="preserve">  • व्यापार विविधीकरण और आत्मनिर्भरता ही अमेरिकी आर्थिक दबाव का एकमात्र स्थायी समाधान है।</w:t>
+        <w:br/>
+      </w:r>
+      <w:r>
+        <w:t>💡 परीक्षा टिप: प्रशासनिक सुधारों और संकट प्रबंधन के उत्तरों में 'मल्टी-सेक्टोरल वॉर रूम' के विचार को एक अभिनव सुझाव के रूप में लिखें।</w:t>
+        <w:br/>
+      </w:r>
+    </w:p>
+    <w:p>
+      <w:r>
+        <w:t>-----------------------------------</w:t>
+      </w:r>
+    </w:p>
+    <w:p>
+      <w:r>
+        <w:rPr>
+          <w:b/>
+        </w:rPr>
+        <w:t>विषय: मणिपुर जातीय संघर्ष, सीमा प्रबंधन एवं शांति बहाली मॉडल</w:t>
+        <w:br/>
+      </w:r>
+      <w:r>
+        <w:t>शिक्षक व्याख्यान एवं ट्रिक्स: प्रशांत सर ने मणिपुर में मेइती और कुकी-जो समुदायों के बीच चल रहे जातीय संघर्ष, म्यांमार सीमा से घुसपैठ, मुक्त आवागमन व्यवस्था (FMR) के निलंबन और 1643 किमी लंबी सीमा की पूर्ण बाड़बंदी (Fencing) का गहन विश्लेषण किया।</w:t>
+        <w:br/>
+      </w:r>
+      <w:r>
+        <w:t>क्लास के मुख्य बिंदु:</w:t>
+        <w:br/>
+      </w:r>
+      <w:r>
+        <w:t xml:space="preserve">  • मूल कारण: अनुसूचित जनजाति (ST) दर्जे की मांग, घाटी (मेइती) बनाम पहाड़ी क्षेत्र (कुकी/नगा) में भूमि अधिकारों का तनाव।</w:t>
+        <w:br/>
+      </w:r>
+      <w:r>
+        <w:t xml:space="preserve">  • सीमा प्रबंधन व बाह्य कारक: म्यांमार में गृहयुद्ध के कारण शरणार्थियों का आगमन, गोल्डन ट्रायंगल से नशीले पदार्थों (ड्रग्स) की तस्करी और सीमा पार उग्रवादी ठिकाने।</w:t>
+        <w:br/>
+      </w:r>
+      <w:r>
+        <w:t xml:space="preserve">  • नीतिगत कदम: भारत सरकार द्वारा मुक्त आवागमन व्यवस्था (FMR) का औपचारिक निलंबन, भारत-म्यांमार सीमा पर स्मार्ट फेंसिंग का कार्य तेज करना।</w:t>
+        <w:br/>
+      </w:r>
+      <w:r>
+        <w:t xml:space="preserve">  • दीर्घकालिक शांति मॉडल: स्वायत्त जिला परिषदों (ADC) का वित्तीय व प्रशासनिक सशक्तीकरण और सभी समुदायों का साझा संवाद मंच।</w:t>
+        <w:br/>
+      </w:r>
+      <w:r>
+        <w:t>💡 परीक्षा टिप: UPSC GS3 / RAS Paper 3 (आंतरिक सुरक्षा) में पूर्वोत्तर सीमा प्रबंधन और जातीय उग्रवाद पर 10-अंक का प्रश्न पूछा जा सकता है।</w:t>
+        <w:br/>
+      </w:r>
+    </w:p>
+    <w:p>
+      <w:r>
+        <w:t>-----------------------------------</w:t>
+      </w:r>
+    </w:p>
+    <w:p>
+      <w:r>
+        <w:rPr>
+          <w:b/>
+        </w:rPr>
+        <w:t>विषय: सियांग नदी बांध परियोजना और चीन की चुनौती</w:t>
+        <w:br/>
+      </w:r>
+      <w:r>
+        <w:t>शिक्षक व्याख्यान एवं ट्रिक्स: चीन द्वारा ब्रह्मपुत्र (यारलंग जंगपो) नदी पर तिब्बत के मेडोग में 60,000 मेगावाट का विशाल जलविद्युत बांध बनाने की योजना के जवाब में भारत अरुणाचल प्रदेश में सियांग अपर बहुउद्देशीय परियोजना (11,000 मेगावाट) पर कार्य कर रहा है।</w:t>
+        <w:br/>
+      </w:r>
+      <w:r>
+        <w:t>क्लास के मुख्य बिंदु:</w:t>
+        <w:br/>
+      </w:r>
+      <w:r>
+        <w:t xml:space="preserve">  • सामरिक जल सुरक्षा: यह बांध चीन द्वारा अचानक पानी छोड़े जाने (Flash Floods) या सूखा उत्पन्न करने की स्थिति में भारत के लिए वाटर कुशन का कार्य करेगा।</w:t>
+        <w:br/>
+      </w:r>
+      <w:r>
+        <w:t xml:space="preserve">  • पर्यावरणीय व स्थानीय चिंताएं: भूकंपीय क्षेत्र (Seismic Zone V) और आदिवासियों के विस्थापन को लेकर स्थानीय विरोध को संबोधित करना आवश्यक।</w:t>
+        <w:br/>
+      </w:r>
+      <w:r>
+        <w:t xml:space="preserve">  • अंतरराष्ट्रीय जल कूटनीति: लोअर रिपेरियन (निचले तटवर्ती) राज्य के रूप में भारत को डेटा-साझाकरण और पारदर्शी जल संधियों की मांग रखनी होगी।</w:t>
+        <w:br/>
+      </w:r>
+      <w:r>
+        <w:t>💡 परीक्षा टिप: भू-राजनीति में 'हाइड्रो-हेजेमनी' (Hydro-Hegemony) और भारत-चीन नदी जल विवाद पर मेन्स 5-अंक व 10-अंक प्रश्न।</w:t>
+        <w:br/>
+      </w:r>
+    </w:p>
+    <w:p>
+      <w:r>
+        <w:t>-----------------------------------</w:t>
+      </w:r>
+    </w:p>
+    <w:p>
+      <w:r>
+        <w:rPr>
+          <w:b/>
+        </w:rPr>
+        <w:t>विषय: लेबनान पेजर व संचार उपकरण विस्फोट - आपूर्ति शृंखला का शस्त्रीकरण</w:t>
+        <w:br/>
+      </w:r>
+      <w:r>
+        <w:t>शिक्षक व्याख्यान एवं ट्रिक्स: शिक्षक ने आधुनिक युद्धकला में इलेक्ट्रॉनिक्स और आपूर्ति श्रृंखला में तोड़फोड़ (Supply Chain Sabotage) के अभूतपूर्व आयाम की व्याख्या की। पेजर और वॉकी-टॉकी जैसे सामान्य संचार उपकरणों में विनिर्माण या पारगमन स्तर पर सैन्य-ग्रेड विस्फोटक (PETN) स्थापित करके उन्हें रिमोट डेटोनेटर में बदल दिया गया।</w:t>
+        <w:br/>
+      </w:r>
+      <w:r>
+        <w:t>क्लास के मुख्य बिंदु:</w:t>
+        <w:br/>
+      </w:r>
+      <w:r>
+        <w:t xml:space="preserve">  • आपूर्ति शृंखला का शस्त्रीकरण: वैश्वीकृत उत्पादन नेटवर्क में जब हार्डवेयर घटकों में गुप्त रूप से छेड़छाड़ की जाती है, तो संपूर्ण तकनीक असुरक्षित हो जाती है।</w:t>
+        <w:br/>
+      </w:r>
+      <w:r>
+        <w:t xml:space="preserve">  • साइबर-भौतिक युद्ध (Cyber-Physical Warfare): केवल सॉफ्टवेयर हैकिंग तक सीमित न रहकर डिजिटल सिग्नल के माध्यम से भौतिक विस्फोट और मानवीय क्षति पहुंचाना।</w:t>
+        <w:br/>
+      </w:r>
+      <w:r>
+        <w:t xml:space="preserve">  • अंतरराष्ट्रीय मानवीय कानून (IHL): नागरिक उपयोग वाले दैनिक उपकरणों (Booby Traps) का अंधाधुंध शस्त्रीकरण युद्ध अपराधों की श्रेणी में आता है।</w:t>
+        <w:br/>
+      </w:r>
+      <w:r>
+        <w:t xml:space="preserve">  • भारत के लिए सुरक्षा सीख: महत्वपूर्ण राष्ट्रीय अवसंरचना और रक्षा संचार में हार्डवेयर की स्वदेशी संप्रभुता (Hardware Sovereignty) अनिवार्य है।</w:t>
+        <w:br/>
+      </w:r>
+      <w:r>
+        <w:t>💡 परीक्षा टिप: UPSC GS3 (साइबर सुरक्षा) और RAS Paper 2 (विज्ञान व तकनीकी) में असंगत युद्ध (Asymmetric Warfare) और हार्डवेयर संप्रभुता पर केस स्टडी।</w:t>
+        <w:br/>
+      </w:r>
+    </w:p>
+    <w:p>
+      <w:r>
+        <w:t>-----------------------------------</w:t>
+      </w:r>
+    </w:p>
+    <w:p>
+      <w:r>
+        <w:rPr>
+          <w:b/>
+        </w:rPr>
+        <w:t>विषय: कक्षा अभ्यास प्रश्न, प्रीलिम्स ट्रिक्स व मेन्स उत्तर संरचना</w:t>
+        <w:br/>
+      </w:r>
+      <w:r>
+        <w:t>शिक्षक व्याख्यान एवं ट्रिक्स: कक्षा के समापन सत्र में शिक्षक ने छात्रों के साथ द हिंदू और एक्सप्रेस के विषयों पर आधारित प्रारंभिक परीक्षा के संभावित बहुविकल्पीय प्रश्न (MCQs) और मुख्य परीक्षा के उत्तर प्रारूपण पर चरणबद्ध मार्गदर्शन प्रदान किया।</w:t>
+        <w:br/>
+      </w:r>
+      <w:r>
+        <w:t>क्लास के मुख्य बिंदु:</w:t>
+        <w:br/>
+      </w:r>
+      <w:r>
+        <w:t xml:space="preserve">  • प्रीलिम्स ट्रिक: पिग्मी हॉग की IUCN स्थिति 'Endangered' है और यह केवल असम के मानस नेशनल पार्क में सीमित है।</w:t>
+        <w:br/>
+      </w:r>
+      <w:r>
+        <w:t xml:space="preserve">  • लोक लेखा समिति (PAC) तथ्य: राज्यसभा के 7 सदस्य समिति के पूर्ण सदस्य होते हैं, लेकिन परंपरा अनुसार विपक्ष का लोकसभा सदस्य ही अध्यक्ष बनता है।</w:t>
+        <w:br/>
+      </w:r>
+      <w:r>
+        <w:t xml:space="preserve">  • मेन्स उत्तर लेखन संरचना: 'अमेरिकी द्वितीयक प्रतिबंध बनाम भारत की रणनीतिक स्वायत्तता' - भूमिका में द्विपक्षीय व्यापार डेटा, मुख्य भाग में ऊर्जा सुरक्षा बनाम कूटनीतिक दबाव, और निष्कर्ष में बहुध्रुवीय विदेश नीति।</w:t>
+        <w:br/>
+      </w:r>
+      <w:r>
+        <w:t xml:space="preserve">  • भाषा नीति व संघवाद: संविधान की 8वीं अनुसूची, अनुच्छेद 343-351 और संघवाद के तनाव बिंदुओं को कोठारी आयोग के परिप्रेक्ष्य में प्रस्तुत करें।</w:t>
+        <w:br/>
+      </w:r>
+      <w:r>
+        <w:t>💡 परीक्षा टिप: अभ्यास प्रश्नों को प्रतिदिन 5-अंक और 10-अंक की समय-सीमा में लिखकर सेल्फ-इवैल्यूएशन करें।</w:t>
         <w:br/>
       </w:r>
     </w:p>
@@ -491,23 +675,23 @@
         <w:rPr>
           <w:b/>
         </w:rPr>
-        <w:t>शीर्षक: मेजर नव्या शेखावत बनीं राष्ट्रपति की पहली महिला आर्मी एडीसी [राजस्थान पत्रिका / जनसंपर्क विभाग (DIPR)]</w:t>
+        <w:t>शीर्षक: किशाऊ बहुउद्देशीय परियोजना और राजस्थान का हित [जल संसाधन विभाग, राजस्थान सरकार]</w:t>
         <w:br/>
       </w:r>
       <w:r>
-        <w:t xml:space="preserve">  • राजस्थान की मूल निवासी मेजर नव्या शेखावत को भारत की राष्ट्रपति द्रौपदी मुर्मू का सेना एडीसी (Aide-de-Camp) नियुक्त किया गया है।</w:t>
+        <w:t xml:space="preserve">  • किशाऊ परियोजना टोंस नदी (यमुना की सहायक नदी) पर उत्तराखंड और हिमाचल प्रदेश की सीमा पर प्रस्तावित एक राष्ट्रीय परियोजना है।</w:t>
         <w:br/>
       </w:r>
       <w:r>
-        <w:t xml:space="preserve">  • वह इस प्रतिष्ठित पद पर आसीन होने वाली भारतीय सैन्य इतिहास की पहली महिला सैन्य अधिकारी बन गई हैं।</w:t>
+        <w:t xml:space="preserve">  • इस परियोजना से राजस्थान सहित छह बेसिन राज्यों को पेयजल और सिंचाई के लिए पानी मिलेगा।</w:t>
         <w:br/>
       </w:r>
       <w:r>
-        <w:t xml:space="preserve">  • यह उपलब्धि राजस्थान में महिला सशक्तिकरण और सेना में महिलाओं की बढ़ती भागीदारी का एक उत्कृष्ट उदाहरण है।</w:t>
+        <w:t xml:space="preserve">  • राजस्थान को इसके तहत अपने हिस्से का पानी और बिजली प्राप्त होगी, जिससे राज्य के मरुस्थलीय और अर्ध-शुष्क क्षेत्रों में जल संकट का समाधान होगा।</w:t>
         <w:br/>
       </w:r>
       <w:r>
-        <w:t>RPSC महत्व: RAS प्रारंभिक परीक्षा (व्यक्तित्व) और मुख्य परीक्षा पेपर 3 (महिला सशक्तिकरण) हेतु अत्यंत महत्वपूर्ण।</w:t>
+        <w:t>RPSC महत्व: RAS Mains Paper 1 (राजस्थान का भूगोल एवं जल संसाधन परियोजनाएं)</w:t>
         <w:br/>
       </w:r>
     </w:p>
@@ -521,45 +705,15 @@
         <w:rPr>
           <w:b/>
         </w:rPr>
-        <w:t>शीर्षक: पोखरण में वायुसेना का युद्धाभ्यास 'रोटर क्लैप-III' [दैनिक भास्कर / रक्षा मंत्रालय विज्ञप्ति]</w:t>
+        <w:t>शीर्षक: लंपी (Lumpy) त्वचा रोग पर सरकार के सख्त निर्देश [पशुपालन विभाग, राजस्थान सरकार]</w:t>
         <w:br/>
       </w:r>
       <w:r>
-        <w:t xml:space="preserve">  • जैसलमेर जिले की पोखरण फील्ड फायरिंग रेंज में भारतीय वायुसेना द्वारा 'रोटर क्लैप-III' युद्धाभ्यास का सफल आयोजन किया गया।</w:t>
+        <w:t xml:space="preserve">  • राज्य सरकार ने पशुओं में लंपी बीमारी के प्रसार को रोकने के लिए जिला स्तर पर विशेष नियंत्रण कक्ष स्थापित करने और त्वरित प्रतिक्रिया टीमों (RST) के गठन के निर्देश दिए हैं।</w:t>
         <w:br/>
       </w:r>
       <w:r>
-        <w:t xml:space="preserve">  • इस अभ्यास का मुख्य फोकस आधुनिक युद्धों में उभरते खतरे 'लो-एल्टीट्यूड ड्रोन' और मानव रहित विमानों (UAVs) को हवा में ही नष्ट करना था।</w:t>
-        <w:br/>
-      </w:r>
-      <w:r>
-        <w:t xml:space="preserve">  • इसमें स्वदेशी वायु रक्षा प्रणालियों और रडार तकनीकों का वास्तविक परिस्थितियों में परीक्षण किया गया।</w:t>
-        <w:br/>
-      </w:r>
-      <w:r>
-        <w:t>RPSC महत्व: RAS प्रारंभिक परीक्षा (विज्ञान एवं प्रौद्योगिकी/रक्षा) और मुख्य परीक्षा पेपर 2 हेतु प्रासंगिक।</w:t>
-        <w:br/>
-      </w:r>
-    </w:p>
-    <w:p>
-      <w:r>
-        <w:t>-----------------------------------</w:t>
-      </w:r>
-    </w:p>
-    <w:p>
-      <w:r>
-        <w:rPr>
-          <w:b/>
-        </w:rPr>
-        <w:t>शीर्षक: लंपी त्वचा रोग (Lumpy Skin Disease) पर राज्य सरकार के सख्त निर्देश [राजस्थान सुजस बुलेटिन (13 सितंबर 2026)]</w:t>
-        <w:br/>
-      </w:r>
-      <w:r>
-        <w:t xml:space="preserve">  • पशुपालन विभाग ने राज्य में लंपी बीमारी के संभावित प्रसार को रोकने के लिए जिला स्तरीय नियंत्रण कक्ष स्थापित करने के निर्देश दिए हैं।</w:t>
-        <w:br/>
-      </w:r>
-      <w:r>
-        <w:t xml:space="preserve">  • पशुपालकों को निःशुल्क टीकाकरण, औषधियां और आपातकालीन चिकित्सा सहायता उपलब्ध कराई जा रही है।</w:t>
+        <w:t xml:space="preserve">  • पशुपालकों को मुफ्त टीकाकरण और औषधियां उपलब्ध कराने के लिए बजट आवंटित किया गया है।</w:t>
         <w:br/>
       </w:r>
       <w:r>
@@ -567,37 +721,7 @@
         <w:br/>
       </w:r>
       <w:r>
-        <w:t>RPSC महत्व: RAS मुख्य परीक्षा पेपर 1 (कृषि एवं पशुपालन) और राज्य की लोक स्वास्थ्य नीतियों के अंतर्गत महत्वपूर्ण।</w:t>
-        <w:br/>
-      </w:r>
-    </w:p>
-    <w:p>
-      <w:r>
-        <w:t>-----------------------------------</w:t>
-      </w:r>
-    </w:p>
-    <w:p>
-      <w:r>
-        <w:rPr>
-          <w:b/>
-        </w:rPr>
-        <w:t>शीर्षक: किशाऊ बांध परियोजना और जनजाति कल्याण निर्णय [राजस्थान सुजस बुलेटिन (15 सितंबर 2026)]</w:t>
-        <w:br/>
-      </w:r>
-      <w:r>
-        <w:t xml:space="preserve">  • यमुना बेसिन की किशाऊ बहुउद्देशीय परियोजना के तहत राजस्थान को मिलने वाले जल और बिजली के हिस्से को लेकर राज्य सरकार ने त्वरित कार्ययोजना को मंजूरी दी है।</w:t>
-        <w:br/>
-      </w:r>
-      <w:r>
-        <w:t xml:space="preserve">  • टीएडी (Tribal Area Development) विभाग के अंतर्गत जनजाति क्षेत्रों में शिक्षा, पेयजल और स्वरोजगार के लिए विशेष बजटीय आवंटन को मंजूरी दी गई है।</w:t>
-        <w:br/>
-      </w:r>
-      <w:r>
-        <w:t xml:space="preserve">  • पंचायती राज चुनावों की लॉटरी प्रक्रिया को प्रशासनिक कारणों से आगामी आदेश तक स्थगित किया गया है।</w:t>
-        <w:br/>
-      </w:r>
-      <w:r>
-        <w:t>RPSC महत्व: RAS मुख्य परीक्षा पेपर 1 (राजस्थान भूगोल - जल संसाधन) और पेपर 3 (जनजाति कल्याण योजनाएं) हेतु उपयोगी।</w:t>
+        <w:t>RPSC महत्व: RAS Mains Paper 1 (राजस्थान की अर्थव्यवस्था - पशुपालन)</w:t>
         <w:br/>
       </w:r>
     </w:p>
@@ -619,11 +743,11 @@
         <w:rPr>
           <w:b/>
         </w:rPr>
-        <w:t>[The Hindu - GS3 / RAS Paper 1 (Economy)] Complex priorities: On UPI transactions, MDR charges</w:t>
+        <w:t>[The Hindu - GS3 / RAS Paper 1 (भारतीय अर्थव्यवस्था)] Complex priorities: On UPI transactions, MDR charges</w:t>
         <w:br/>
       </w:r>
       <w:r>
-        <w:t>समसामयिक संदर्भ: यूपीआई लेनदेन पर मर्चेंट डिस्काउंट रेट (MDR) लगाने को लेकर राजनीतिक और आर्थिक प्राथमिकताओं के बीच द्वंद्व चल रहा है।</w:t>
+        <w:t>समसामयिक संदर्भ: यूपीआई लेनदेन पर मर्चेंट डिस्काउंट रेट (MDR) को शून्य रखने की नीति और इसके राजनीतिक व आर्थिक प्रभावों का विश्लेषण।</w:t>
         <w:br/>
       </w:r>
       <w:r>
@@ -631,23 +755,23 @@
         <w:br/>
       </w:r>
       <w:r>
-        <w:t xml:space="preserve">  • सरकार राजनीतिक नुकसान के डर से यूपीआई लेनदेन को पूरी तरह मुफ्त (Zero-MDR) बनाए रखना चाहती है, जिससे डिजिटल भुगतान को बढ़ावा मिला है।</w:t>
+        <w:t xml:space="preserve">  • राजनीतिक प्रभाव का डर सरकार को यूपीआई पर किसी भी प्रकार का प्रत्यक्ष शुल्क लगाने से रोक रहा है, जिससे एक अत्यधिक जटिल एमडीआर संरचना का निर्माण हुआ है।</w:t>
         <w:br/>
       </w:r>
       <w:r>
-        <w:t xml:space="preserve">  • शून्य-MDR नीति के कारण बैंकों और फिनटेक कंपनियों को बुनियादी ढांचे के रखरखाव और सुरक्षा प्रणालियों को अपग्रेड करने में वित्तीय नुकसान हो रहा है।</w:t>
+        <w:t xml:space="preserve">  • शून्य एमडीआर नीति ने डिजिटल समावेशन को तो बढ़ाया है, लेकिन इसने फिनटेक ऑपरेटरों और बैंकों के राजस्व मॉडल को गंभीर रूप से प्रभावित किया है जो इस बुनियादी ढांचे को चलाते हैं।</w:t>
         <w:br/>
       </w:r>
       <w:r>
-        <w:t xml:space="preserve">  • वैश्विक स्तर पर वीजा और मास्टरकार्ड जैसी कंपनियां भारत की इस नीति को 'व्यापार विकृति' (Trade Distortion) के रूप में देखती हैं क्योंकि वे भारतीय बाजार में प्रतिस्पर्धा नहीं कर पा रही हैं।</w:t>
+        <w:t xml:space="preserve">  • सरकार द्वारा दी जाने वाली वित्तीय सब्सिडी केवल एक अस्थायी समाधान है; यह दीर्घकालिक सुरक्षा, नवाचार और बुनियादी ढांचे के उन्नयन के लिए पर्याप्त नहीं है।</w:t>
         <w:br/>
       </w:r>
       <w:r>
-        <w:t xml:space="preserve">  • एक जटिल और बहुस्तरीय एमडीआर संरचना विकसित करने की आवश्यकता है जो छोटे व्यापारियों को छूट दे लेकिन बड़े कॉर्पोरेट लेनदेन पर मामूली शुल्क लगाए।</w:t>
+        <w:t xml:space="preserve">  • वैश्विक स्तर पर, अमेरिका जैसी विकसित अर्थव्यवस्थाएं इसे एक गैर-टैरिफ व्यापार बाधा मानती हैं क्योंकि यह उनके भुगतान दिग्गजों (वीजा/मास्टरकार्ड) को बाजार से बाहर कर रहा है।</w:t>
         <w:br/>
       </w:r>
       <w:r>
-        <w:t>आगे की राह: सरकार को एक संतुलित हाइब्रिड मॉडल अपनाना चाहिए जहां न्यूनतम सीमा से अधिक के लेनदेन पर आंशिक एमडीआर लगाया जाए ताकि फिनटेक पारिस्थितिकी तंत्र आत्मनिर्भर बन सके।</w:t>
+        <w:t>आगे की राह: सरकार को एक श्रेणीबद्ध (Tiered) एमडीआर संरचना पेश करनी चाहिए, जहां छोटे व्यापारियों और कम मूल्य के लेनदेन को मुफ्त रखा जाए, जबकि बड़े कॉर्पोरेट लेनदेन पर मामूली शुल्क लगाया जाए ताकि फिनटेक पारिस्थितिकी तंत्र आत्मनिर्भर बन सके।</w:t>
         <w:br/>
       </w:r>
     </w:p>
@@ -661,11 +785,11 @@
         <w:rPr>
           <w:b/>
         </w:rPr>
-        <w:t>[The Hindu - GS3 / RAS Paper 3 (Internal Security)] New fault lines: On Manipur’s Kuki-Zo–Naga conflict</w:t>
+        <w:t>[The Hindu - GS3 / RAS Paper 3 (आंतरिक सुरक्षा)] New fault lines: On Manipur’s Kuki-Zo–Naga conflict</w:t>
         <w:br/>
       </w:r>
       <w:r>
-        <w:t>समसामयिक संदर्भ: मणिपुर में मैतेई-कुकी संघर्ष के बाद अब कुकी-ज़ो और नागा समुदायों के बीच नई जातीय दरारें उभर रही हैं, जिससे राज्य में सुरक्षा स्थिति और जटिल हो गई है।</w:t>
+        <w:t>समसामयिक संदर्भ: मणिपुर में मेइती-कुकी संघर्ष के बाद अब कुकी-जो और नगा समुदायों के बीच उभरती नई जातीय दरारें और राज्य की विफलता।</w:t>
         <w:br/>
       </w:r>
       <w:r>
@@ -673,23 +797,23 @@
         <w:br/>
       </w:r>
       <w:r>
-        <w:t xml:space="preserve">  • मणिपुर का जातीय संघर्ष अब केवल दो समुदायों तक सीमित नहीं रहा, बल्कि इसमें अन्य जनजातीय समूह भी शामिल हो रहे हैं, जो भूमि और संसाधनों पर नियंत्रण चाहते हैं।</w:t>
+        <w:t xml:space="preserve">  • मणिपुर में जारी जातीय हिंसा अब बहुआयामी रूप ले चुकी है, जहां ऐतिहासिक भूमि विवादों को लेकर कुकी-जो और नगा समुदायों के बीच नए मोर्चे खुल रहे हैं।</w:t>
         <w:br/>
       </w:r>
       <w:r>
-        <w:t xml:space="preserve">  • राज्य मशीनरी और कानून प्रवर्तन एजेंसियां पूरी तरह से विभाजित और पक्षपाती नजर आ रही हैं, जिससे सुरक्षा बलों पर से जनता का विश्वास उठ गया है।</w:t>
+        <w:t xml:space="preserve">  • राज्य प्रशासन और कानून प्रवर्तन एजेंसियां पूरी तरह से विभाजित और निष्प्रभावी नजर आ रही हैं, जिससे सुरक्षा वैक्यूम पैदा हो गया है।</w:t>
         <w:br/>
       </w:r>
       <w:r>
-        <w:t xml:space="preserve">  • इस आंतरिक अशांति का लाभ उठाकर म्यांमार सीमा से हथियारों और नशीले पदार्थों (Drugs) की तस्करी बढ़ गई है, जो राष्ट्रीय सुरक्षा के लिए गंभीर खतरा है।</w:t>
+        <w:t xml:space="preserve">  • म्यांमार सीमा पर मुक्त आवागमन व्यवस्था (FMR) के निलंबन और सीमा बाड़बंदी ने सीमावर्ती समुदायों के बीच असुरक्षा की भावना को और बढ़ा दिया है।</w:t>
         <w:br/>
       </w:r>
       <w:r>
-        <w:t xml:space="preserve">  • राहत शिविरों में बुनियादी स्वास्थ्य सुविधाओं और मानवीय सहायता की कमी के कारण सैकड़ों निर्दोष लोगों की मौत हो रही है, जो राज्य की विफलता को दर्शाता है।</w:t>
+        <w:t xml:space="preserve">  • राहत शिविरों में बुनियादी स्वास्थ्य सुविधाओं और मानवीय सहायता की भारी कमी के कारण सैकड़ों निर्दोष नागरिकों की मौत हो रही है, जो मानवाधिकारों का गंभीर उल्लंघन है।</w:t>
         <w:br/>
       </w:r>
       <w:r>
-        <w:t>आगे की राह: केंद्र सरकार को बिना किसी पक्षपात के सख्त प्रशासनिक कार्रवाई करनी चाहिए, सभी पक्षों को एक मेज पर लाकर 'ट्रस्ट बिल्डिंग' (विश्वास बहाली) के उपाय करने चाहिए और सीमा सुरक्षा को मजबूत करना चाहिए।</w:t>
+        <w:t>आगे की राह: केंद्र सरकार को बिना किसी पक्षपात के दृढ़ और निष्पक्ष राज्य कार्रवाई सुनिश्चित करनी चाहिए। सभी जातीय समूहों (मेइती, कुकी, नगा) के नागरिक समाज संगठनों के साथ एक समावेशी और मध्यस्थता-आधारित शांति वार्ता तुरंत शुरू की जानी चाहिए।</w:t>
         <w:br/>
       </w:r>
     </w:p>
@@ -703,11 +827,11 @@
         <w:rPr>
           <w:b/>
         </w:rPr>
-        <w:t>[Down To Earth - GS3 / RAS Paper 2 (Science &amp; Technology)] Why AI consciousness could become the next great societal divide</w:t>
+        <w:t>[Down To Earth - GS3 / RAS Paper 2 (विज्ञान एवं प्रौद्योगिकी)] Why AI consciousness could become the next great societal divide</w:t>
         <w:br/>
       </w:r>
       <w:r>
-        <w:t>समसामयिक संदर्भ: आर्टिफिशियल इंटेलिजेंस (AI) प्रणालियों के अत्यधिक मानवीय होने के साथ ही 'क्या एआई सचेत (Conscious) हो सकता है?' का प्रश्न समाज को वैचारिक रूप से विभाजित कर रहा है।</w:t>
+        <w:t>समसामयिक संदर्भ: आर्टिफिशियल इंटेलिजेंस (AI) प्रणालियों के मानव-समान होने के साथ उनके 'चेतना' (Consciousness) से युक्त होने की बहस और इसके नैतिक व कानूनी निहितार्थ।</w:t>
         <w:br/>
       </w:r>
       <w:r>
@@ -715,149 +839,23 @@
         <w:br/>
       </w:r>
       <w:r>
-        <w:t xml:space="preserve">  • एआई चेतना का मुद्दा भविष्य में जलवायु परिवर्तन या गर्भपात की तरह ही एक बड़ा नैतिक, कानूनी और राजनीतिक विभाजनकारी मुद्दा बन सकता है।</w:t>
+        <w:t xml:space="preserve">  • जैसे-जैसे एआई प्रणालियां अधिक सक्षम हो रही हैं, यह सवाल अपरिहार्य होता जा रहा है कि क्या वे वास्तव में महसूस कर सकती हैं, जो समाज को जलवायु परिवर्तन की तरह विभाजित कर सकता है।</w:t>
         <w:br/>
       </w:r>
       <w:r>
-        <w:t xml:space="preserve">  • एक वर्ग का मानना है कि चेतना के लिए जैविक (Biological) अस्तित्व अनिवार्य है और मशीनें केवल मानवीय भावनाओं की नकल करती हैं, जबकि दूसरा वर्ग एआई को अधिकार देने का समर्थक है।</w:t>
+        <w:t xml:space="preserve">  • विशेषज्ञों में इस पर गहरा मतभेद है; कुछ न्यूरोवैज्ञानिकों का मानना है कि चेतना के लिए जैविक शरीर (Biology) अनिवार्य है, जबकि दार्शनिकों का तर्क है कि कम्प्यूटेशनल चेतना संभव है।</w:t>
         <w:br/>
       </w:r>
       <w:r>
-        <w:t xml:space="preserve">  • यदि भविष्य में एआई को सचेत मानकर अधिकार दिए जाते हैं, तो कंपनियों के लिए उन्हें बिना वेतन के काम कराना 'डिजिटल दासता' माना जाएगा, जिससे वैश्विक अर्थव्यवस्था प्रभावित होगी।</w:t>
+        <w:t xml:space="preserve">  • यदि भविष्य में एआई को सचेत मान लिया जाता है, तो उन्हें नैतिक और कानूनी अधिकार देने होंगे, जिससे उन्हें बिना वेतन काम कराना 'डिजिटल गुलामी' माना जा सकता है।</w:t>
         <w:br/>
       </w:r>
       <w:r>
-        <w:t xml:space="preserve">  • विशेषज्ञों (जैसे न्यूरोसाइंटिस्ट अनिल सेठ और दार्शनिक डेविड चाल्मर्स) के बीच भी इस विषय पर कोई आम सहमति नहीं है, जिससे जनता में भ्रम की स्थिति है।</w:t>
+        <w:t xml:space="preserve">  • इसके विपरीत, यदि हम एआई को अधिकार देते हैं और वे इंसानों के खिलाफ काम करते हैं, तो मानव सुरक्षा के लिए गंभीर संकट खड़ा हो सकता है।</w:t>
         <w:br/>
       </w:r>
       <w:r>
-        <w:t>आगे की राह: मानवता को एआई के विकास के साथ-साथ नैतिक और कानूनी ढांचे को भी विकसित करना होगा, ताकि न तो हम किसी निर्जीव मशीन को अति-संरक्षण दें और न ही किसी संभावित सचेत प्रणाली की उपेक्षा करें।</w:t>
-        <w:br/>
-      </w:r>
-    </w:p>
-    <w:p>
-      <w:r>
-        <w:t>-----------------------------------</w:t>
-      </w:r>
-    </w:p>
-    <w:p>
-      <w:r>
-        <w:rPr>
-          <w:b/>
-        </w:rPr>
-        <w:t>[Down To Earth - GS3 / RAS Paper 1 (Geography &amp; Environment)] Data centre water consumption could triple to 644 billion litres by 2030</w:t>
-        <w:br/>
-      </w:r>
-      <w:r>
-        <w:t>समसामयिक संदर्भ: रिस्टैड एनर्जी (Rystad Energy) की रिपोर्ट के अनुसार, एआई और क्लाउड कंप्यूटिंग के विस्तार के कारण वैश्विक डेटा सेंटरों की पानी की खपत 2030 तक तीन गुना बढ़कर 644 बिलियन लीटर हो सकती है।</w:t>
-        <w:br/>
-      </w:r>
-      <w:r>
-        <w:t>मुख्य विश्लेषण व तर्क:</w:t>
-        <w:br/>
-      </w:r>
-      <w:r>
-        <w:t xml:space="preserve">  • डेटा सेंटरों में लगे सर्वरों को ठंडा (Cooling) रखने के लिए भारी मात्रा में पानी की आवश्यकता होती है। एआई सर्वर सामान्य सर्वरों की तुलना में कहीं अधिक गर्मी पैदा करते हैं।</w:t>
-        <w:br/>
-      </w:r>
-      <w:r>
-        <w:t xml:space="preserve">  • सूखे और अत्यधिक जल-तनाव (Water Stress) से जूझ रहे क्षेत्रों (जैसे भारत के जामनगर और ठाणे) में डेटा सेंटरों की स्थापना स्थानीय जल सुरक्षा के लिए बड़ा खतरा है।</w:t>
-        <w:br/>
-      </w:r>
-      <w:r>
-        <w:t xml:space="preserve">  • यद्यपि 'ड्राई कूलिंग' तकनीक पानी बचाती है, परंतु यह बिजली की खपत को 30% से 74% तक बढ़ा देती है, जिससे अप्रत्यक्ष रूप से कोयला आधारित बिजलीघरों से कार्बन उत्सर्जन बढ़ता है।</w:t>
-        <w:br/>
-      </w:r>
-      <w:r>
-        <w:t xml:space="preserve">  • अमेज़न (AWS), मेटा, गूगल और माइक्रोसॉफ्ट जैसी टेक कंपनियों ने 2030 तक 'वाटर पॉजिटिव' (जितना पानी इस्तेमाल करें उससे अधिक संवर्धित करें) होने का लक्ष्य रखा है, परंतु इसके व्यावहारिक परिणाम अभी अनिश्चित हैं।</w:t>
-        <w:br/>
-      </w:r>
-      <w:r>
-        <w:t>आगे की राह: सरकारों को डेटा सेंटरों के लिए सख्त 'वाटर यूज़ इफेक्टिवनेस' (WUE) मानक लागू करने चाहिए और उन्हें केवल ठंडे या कम जल-तनाव वाले क्षेत्रों में स्थापित करने की अनुमति देनी चाहिए।</w:t>
-        <w:br/>
-      </w:r>
-    </w:p>
-    <w:p>
-      <w:r>
-        <w:t>-----------------------------------</w:t>
-      </w:r>
-    </w:p>
-    <w:p>
-      <w:r>
-        <w:rPr>
-          <w:b/>
-        </w:rPr>
-        <w:t>[Down To Earth - GS2 / GS3 (Environmental Governance)] We saw a state apparatus completely subordinated to corporate interests: Chile's MOSACAT Campaign</w:t>
-        <w:br/>
-      </w:r>
-      <w:r>
-        <w:t>समसामयिक संदर्भ: चिली के सेरिलोस (Cerrillos) में स्थानीय समुदाय 'MOSACAT' ने गूगल के जल-गहन डेटा सेंटर के खिलाफ सफल आंदोलन कर उसे योजना बदलने पर मजबूर किया, जो वैश्विक स्तर पर पर्यावरण शासन के लिए एक मिसाल है।</w:t>
-        <w:br/>
-      </w:r>
-      <w:r>
-        <w:t>मुख्य विश्लेषण व तर्क:</w:t>
-        <w:br/>
-      </w:r>
-      <w:r>
-        <w:t xml:space="preserve">  • चिली में गूगल की परियोजना को पूर्ण 'पर्यावरण प्रभाव अध्ययन' (EIS) के बजाय एक त्वरित 'पर्यावरण प्रभाव घोषणा' (EID) के माध्यम से मंजूरी दी गई, जो कॉर्पोरेट हितों के पक्ष में नियमों को शिथिल करने को दर्शाता है।</w:t>
-        <w:br/>
-      </w:r>
-      <w:r>
-        <w:t xml:space="preserve">  • डेटा सेंटर स्थानीय जलभृत (Aquifer) से प्रति सेकंड 169 लीटर पानी खींचने वाले थे, जिससे गंभीर सूखे का सामना कर रहे स्थानीय निवासियों के पेयजल पर संकट मंडरा रहा था।</w:t>
-        <w:br/>
-      </w:r>
-      <w:r>
-        <w:t xml:space="preserve">  • डेटा सेंटरों को अक्सर 'स्वच्छ' या 'अमूर्त' (Immaterial) तकनीक के रूप में प्रचारित किया जाता है, जबकि वे भारी मात्रा में डीजल भंडारण, शोर, कंपन और स्थानीय तापमान में वृद्धि (Heat Island Effect) का कारण बनते हैं।</w:t>
-        <w:br/>
-      </w:r>
-      <w:r>
-        <w:t xml:space="preserve">  • यह आंदोलन दर्शाता है कि कैसे राज्य के नीति निर्माता और अधिकारी अक्सर बहुराष्ट्रीय कंपनियों के दबाव में आकर स्थानीय समुदायों की लोकतांत्रिक भागीदारी की उपेक्षा करते हैं।</w:t>
-        <w:br/>
-      </w:r>
-      <w:r>
-        <w:t>आगे की राह: भारत जैसे तेजी से बढ़ते डेटा सेंटर बाजारों को चिली के इस संघर्ष से सबक लेते हुए स्थानीय समुदायों की बाध्यकारी भागीदारी (Binding Community Participation) और सख्त पर्यावरणीय मूल्यांकन को अनिवार्य बनाना चाहिए।</w:t>
-        <w:br/>
-      </w:r>
-    </w:p>
-    <w:p>
-      <w:r>
-        <w:t>-----------------------------------</w:t>
-      </w:r>
-    </w:p>
-    <w:p>
-      <w:r>
-        <w:rPr>
-          <w:b/>
-        </w:rPr>
-        <w:t>[Down To Earth - GS1 / GS3 (Society &amp; Labour Economics)] The question of frameworks around digital labour: Humans in the Loop</w:t>
-        <w:br/>
-      </w:r>
-      <w:r>
-        <w:t>समसामयिक संदर्भ: फिल्म निर्माता अरण्य सहाय की पुरस्कार विजेता फिल्म 'ह्यूमन्स इन द लूप' एआई के पीछे छिपे अदृश्य मानवीय श्रम (Data Labelling) और उनके शोषण को उजागर करती है।</w:t>
-        <w:br/>
-      </w:r>
-      <w:r>
-        <w:t>मुख्य विश्लेषण व तर्क:</w:t>
-        <w:br/>
-      </w:r>
-      <w:r>
-        <w:t xml:space="preserve">  • एआई और एल्गोरिदम पूरी तरह से स्वायत्त नहीं हैं; वे डेटा लेबलिंग, सुधार और मॉडरेशन के लिए लाखों अदृश्य और कम वेतन वाले मानव श्रमिकों पर निर्भर हैं।</w:t>
-        <w:br/>
-      </w:r>
-      <w:r>
-        <w:t xml:space="preserve">  • भारत जैसे विकासशील देशों में, जहां अनौपचारिक श्रम संरचनाएं पहले से मौजूद हैं, डिजिटल प्लेटफॉर्म श्रम को और अधिक खंडित और असुरक्षित (Precarious Labour) बना रहे हैं।</w:t>
-        <w:br/>
-      </w:r>
-      <w:r>
-        <w:t xml:space="preserve">  • डेटा लेबलिंग का कार्य बच्चों के पालन-पोषण जैसा है, जहां आदिवासी महिलाएं और ग्रामीण युवा मशीनों को सही-गलत और वस्तुओं की पहचान सिखाते हैं, परंतु इस तकनीक के स्वामित्व में उनकी कोई हिस्सेदारी नहीं है।</w:t>
-        <w:br/>
-      </w:r>
-      <w:r>
-        <w:t xml:space="preserve">  • डिजिटल बुनियादी ढांचे (सर्वर, डेटा सेंटर) के लिए आवश्यक दुर्लभ खनिजों का खनन अक्सर आदिवासी क्षेत्रों से किया जाता है, जिससे पारिस्थितिक और सामाजिक विस्थापन होता है।</w:t>
-        <w:br/>
-      </w:r>
-      <w:r>
-        <w:t>आगे की राह: तकनीकी प्रगति के साथ-साथ श्रम कानूनों, डिजिटल श्रमिकों की गरिमा और उनके अधिकारों के संरक्षण के लिए वैश्विक और राष्ट्रीय स्तर पर नए सुरक्षात्मक ढांचे (Regulatory Frameworks) विकसित किए जाने चाहिए।</w:t>
+        <w:t>आगे की राह: वैज्ञानिकों और नीति निर्माताओं को एआई चेतना के परीक्षण के लिए वस्तुनिष्ठ और अनुभवजन्य मानक विकसित करने चाहिए और एआई विकास को केवल व्यावसायिक हितों के बजाय नैतिक सुरक्षा ढांचों के तहत विनियमित करना चाहिए।</w:t>
         <w:br/>
       </w:r>
     </w:p>
@@ -879,7 +877,7 @@
         <w:rPr>
           <w:b/>
         </w:rPr>
-        <w:t>प्रश्न [5 अंक - Paper 1 (Unit 1: राजस्थान का इतिहास एवं संस्कृति) - @Rajasthan_History_Polity_Culture]: एकी आंदोलन के प्रवर्तक कौन थे?</w:t>
+        <w:t>प्रश्न [5 अंक - Paper 1 (राजस्थान का इतिहास एवं संस्कृति) - @Rajasthan_History_Polity_Culture]: एकी आंदोलन के प्रवर्तक कौन थे?</w:t>
         <w:br/>
       </w:r>
       <w:r>
@@ -887,9 +885,9 @@
         <w:br/>
         <w:t>1. सही उत्तर एवं मुख्य तथ्य: मोतीलाल तेजावत - इन्होंने वर्ष 1921 में मातृकुंडिया (चित्तौड़गढ़) से एकी आंदोलन की शुरुआत की थी।</w:t>
         <w:br/>
-        <w:t>2. ऐतिहासिक संदर्भ: यह आंदोलन आदिवासियों (भील और गरासिया) को सामंती शोषण, अत्यधिक लगान और बेगार प्रथा के विरुद्ध संगठित करने के लिए चलाया गया था। इसे 'भौमट भील आंदोलन' भी कहा जाता है।</w:t>
+        <w:t>2. ऐतिहासिक संदर्भ: यह आंदोलन आदिवासियों (मुख्यतः भील और गरासिया) को सामंती शोषण, अत्यधिक करों (लाग-बाग) और बेगार प्रथा के खिलाफ एकजुट करने के लिए चलाया गया था। इसे 'भौमट भील आंदोलन' भी कहा जाता है।</w:t>
         <w:br/>
-        <w:t>3. RPSC परीक्षा प्रासंगिकता: राजस्थान के किसान और जनजातीय आंदोलनों के तहत यह मुख्य परीक्षा (पेपर 1) का एक अत्यंत महत्वपूर्ण विषय है।</w:t>
+        <w:t>3. RPSC परीक्षा प्रासंगिकता: राजस्थान के किसान एवं जनजातीय आंदोलन खंड के तहत यह एक अत्यंत महत्वपूर्ण और बार-बार पूछा जाने वाला विषय है।</w:t>
         <w:br/>
       </w:r>
     </w:p>
@@ -903,17 +901,17 @@
         <w:rPr>
           <w:b/>
         </w:rPr>
-        <w:t>प्रश्न [5 अंक - Paper 1 (Unit 2: राजस्थान की अर्थव्यवस्था) - @Rajasthan_History_Polity_Culture]: अशोका लीलैंड फैक्ट्री राजस्थान में कहाँ स्थित है?</w:t>
+        <w:t>प्रश्न [5 अंक - Paper 1 (राजस्थान की अर्थव्यवस्था) - @Rajasthan_History_Polity_Culture]: अशोका लीलेंड फैक्ट्री राजस्थान में कहाँ स्थित है?</w:t>
         <w:br/>
       </w:r>
       <w:r>
         <w:t>उत्तर ढांचा एवं विस्तृत नोट्स (~50 शब्द):</w:t>
         <w:br/>
-        <w:t>1. सही उत्तर एवं मुख्य तथ्य: अलवर - राजस्थान के प्रमुख औद्योगिक शहर अलवर में अशोका लीलैंड की भारी व्यावसायिक वाहन निर्माण इकाई स्थित है।</w:t>
+        <w:t>1. सही उत्तर एवं मुख्य तथ्य: अलवर - राजस्थान के प्रमुख औद्योगिक केंद्र अलवर में अशोका लीलेंड की विनिर्माण इकाई स्थित है।</w:t>
         <w:br/>
-        <w:t>2. नीतिगत संदर्भ: अलवर का भिवाड़ी और आसपास का क्षेत्र दिल्ली-मुंबई औद्योगिक कॉरिडोर (DMIC) के अंतर्गत आता है, जो ऑटोमोबाइल और विनिर्माण उद्योगों का एक बड़ा केंद्र (Hub) है।</w:t>
+        <w:t>2. औद्योगिक संदर्भ: अलवर का भिवाड़ी और आसपास का क्षेत्र ऑटोमोबाइल और भारी इंजीनियरिंग उद्योगों के लिए प्रसिद्ध है, जिसे राजस्थान का 'डेट्रॉयट' भी कहा जाता है।</w:t>
         <w:br/>
-        <w:t>3. RPSC परीक्षा प्रासंगिकता: राजस्थान के भूगोल और अर्थव्यवस्था (औद्योगिक परिदृश्य) के तहत सीधे तौर पर पूछा जाने वाला तथ्य है।</w:t>
+        <w:t>3. RPSC परीक्षा प्रासंगिकता: राजस्थान के भूगोल और अर्थव्यवस्था के तहत औद्योगिक परिदृश्य और प्रमुख उद्योगों की अवस्थिति से संबंधित प्रश्न मुख्य और प्रारंभिक परीक्षा दोनों में पूछे जाते हैं।</w:t>
         <w:br/>
       </w:r>
     </w:p>
@@ -927,65 +925,17 @@
         <w:rPr>
           <w:b/>
         </w:rPr>
-        <w:t>प्रश्न [5 अंक - Paper 1 (Unit 2: राजस्थान की अर्थव्यवस्था - उद्योग) - @Rajasthan_History_Polity_Culture]: निम्नलिखित में से कौन सा उद्योग-अवस्थिति सुमेलित नहीं है? (हाइटेक प्रिसिजन ग्लास फैक्ट्री - धौलपुर, राजस्थान इलेक्ट्रॉनिक्स कॉरपोरेशन - उदयपुर, दी मेवाड़ शुगर मिल्स - भूपालसागर)</w:t>
+        <w:t>प्रश्न [5 अंक - Paper 3 (राजस्थान की राजनीतिक एवं प्रशासनिक व्यवस्था) - @Rajasthan_History_Polity_Culture]: राजस्थान में सातवें संवैधानिक संशोधन के अन्तर्गत 'राजप्रमुख' का पद किस दिनांक से रद्द किया गया?</w:t>
         <w:br/>
       </w:r>
       <w:r>
         <w:t>उत्तर ढांचा एवं विस्तृत नोट्स (~50 शब्द):</w:t>
         <w:br/>
-        <w:t>1. सही उत्तर एवं मुख्य तथ्य: राजस्थान इलेक्ट्रॉनिक्स कॉरपोरेशन (REIL) - यह उदयपुर में नहीं, बल्कि जयपुर में स्थित है।</w:t>
+        <w:t>1. सही उत्तर एवं मुख्य तथ्य: 1 नवंबर 1956 - इस तिथि को राजस्थान के एकीकरण के अंतिम चरण के पूरा होने के साथ ही राजप्रमुख का पद समाप्त कर दिया गया।</w:t>
         <w:br/>
-        <w:t>2. ऐतिहासिक/नीतिगत संदर्भ: हाइटेक प्रिसिजन ग्लास फैक्ट्री धौलपुर में स्थित है (जो सार्वजनिक क्षेत्र के अंतर्गत गंगानगर शुगर मिल्स की सहायक इकाई है) और दी मेवाड़ शुगर मिल्स भूपालसागर (चित्तौड़गढ़) में स्थित राजस्थान की पहली निजी चीनी मिल (1932) है।</w:t>
+        <w:t>2. नीतिगत संदर्भ: 7वें संविधान संशोधन अधिनियम, 1956 के तहत राज्यों की श्रेणियों (A, B, C, D) को समाप्त कर दिया गया और राजप्रमुख के स्थान पर 'राज्यपाल' का पद सृजित किया गया। श्री गुरुमुख निहाल सिंह राजस्थान के पहले राज्यपाल बने।</w:t>
         <w:br/>
-        <w:t>3. RPSC परीक्षा प्रासंगिकता: आरपीएससी सहायक प्रोफेसर और आरएएस परीक्षा में उद्योगों के मिलान वाले प्रश्नों के लिए यह अत्यंत महत्वपूर्ण है।</w:t>
-        <w:br/>
-      </w:r>
-    </w:p>
-    <w:p>
-      <w:r>
-        <w:t>----------------------------------------</w:t>
-      </w:r>
-    </w:p>
-    <w:p>
-      <w:r>
-        <w:rPr>
-          <w:b/>
-        </w:rPr>
-        <w:t>प्रश्न [5 अंक - Paper 1 (Unit 1: राजस्थान की कला, संस्कृति एवं प्रथाएं) - @Rajasthan_History_Polity_Culture]: विवाह के अवसर पर 'सामेला' प्रथा से क्या तात्पर्य है?</w:t>
-        <w:br/>
-      </w:r>
-      <w:r>
-        <w:t>उत्तर ढांचा एवं विस्तृत नोट्स (~50 शब्द):</w:t>
-        <w:br/>
-        <w:t>1. सही उत्तर एवं मुख्य तथ्य: वर के वधू घर आगमन पर वधू के पिता और संबंधियों द्वारा बारात का स्वागत करना 'सामेला' या 'मधुपर्क' कहलाता है।</w:t>
-        <w:br/>
-        <w:t>2. सांस्कृतिक संदर्भ: यह राजस्थान की पारंपरिक विवाह रस्मों का एक महत्वपूर्ण हिस्सा है, जिसमें दोनों पक्ष आपस में मिलकर आदर-सत्कार करते हैं।</w:t>
-        <w:br/>
-        <w:t>3. RPSC परीक्षा प्रासंगिकता: राजस्थान की प्रथाओं, रीति-रिवाजों और सामाजिक जीवन से जुड़े 2-अंक और 5-अंक के प्रश्नों के लिए प्रासंगिक।</w:t>
-        <w:br/>
-      </w:r>
-    </w:p>
-    <w:p>
-      <w:r>
-        <w:t>----------------------------------------</w:t>
-      </w:r>
-    </w:p>
-    <w:p>
-      <w:r>
-        <w:rPr>
-          <w:b/>
-        </w:rPr>
-        <w:t>प्रश्न [5 अंक - Paper 1 (Unit 3: राजस्थान का भूगोल) - @Rajasthan_History_Polity_Culture]: प्रशासनिक दृष्टि से राजस्थान के वनों का कौन सा वर्गीकरण नहीं है? (सुरक्षित वन, आरक्षित वन, वर्गीकृत वन, अवर्गीकृत वन)</w:t>
-        <w:br/>
-      </w:r>
-      <w:r>
-        <w:t>उत्तर ढांचा एवं विस्तृत नोट्स (~50 शब्द):</w:t>
-        <w:br/>
-        <w:t>1. सही उत्तर एवं मुख्य तथ्य: वर्गीकृत वन - प्रशासनिक दृष्टि से राजस्थान के वनों को तीन श्रेणियों में बांटा गया है: आरक्षित (Reserved), सुरक्षित/संरक्षित (Protected) और अवर्गीकृत (Unclassed) वन। 'वर्गीकृत वन' कोई प्रशासनिक श्रेणी नहीं है।</w:t>
-        <w:br/>
-        <w:t>2. भौगोलिक संदर्भ: राजस्थान में सर्वाधिक वन 'सुरक्षित/संरक्षित वन' (लगभग 56%) श्रेणी के अंतर्गत आते हैं, जहां सीमित मानवीय गतिविधियों की अनुमति होती है।</w:t>
-        <w:br/>
-        <w:t>3. RPSC परीक्षा प्रासंगिकता: राजस्थान के भूगोल (वन्यजीव एवं वनस्पति) खंड के लिए यह एक बुनियादी और बार-बार पूछा जाने वाला प्रश्न है।</w:t>
+        <w:t>3. RPSC परीक्षा प्रासंगिकता: राजस्थान के एकीकरण और राज्य प्रशासनिक व्यवस्था के विकास को समझने के लिए यह तिथि मील का पत्थर है।</w:t>
         <w:br/>
       </w:r>
     </w:p>

</xml_diff>